<commit_message>
Add the JPA Repository Layer and its tests
</commit_message>
<xml_diff>
--- a/Prompts.docx
+++ b/Prompts.docx
@@ -1822,6 +1822,525 @@
         </w:rPr>
         <w:t xml:space="preserve"> test to confirm no regressions before proceeding.</w:t>
       </w:r>
+    </w:p>
+    <w:p>
+      <w:pPr>
+        <w:rPr>
+          <w:b/>
+          <w:bCs/>
+        </w:rPr>
+      </w:pPr>
+      <w:r>
+        <w:rPr>
+          <w:b/>
+          <w:bCs/>
+        </w:rPr>
+        <w:pict w14:anchorId="437BD19B">
+          <v:rect id="_x0000_i1035" style="width:0;height:1.5pt" o:hralign="center" o:hrstd="t" o:hr="t" fillcolor="#a0a0a0" stroked="f"/>
+        </w:pict>
+      </w:r>
+    </w:p>
+    <w:p>
+      <w:pPr>
+        <w:rPr>
+          <w:b/>
+          <w:bCs/>
+        </w:rPr>
+      </w:pPr>
+      <w:r>
+        <w:rPr>
+          <w:b/>
+          <w:bCs/>
+        </w:rPr>
+        <w:t>Step 4: Create the Repository Layer</w:t>
+      </w:r>
+    </w:p>
+    <w:p>
+      <w:pPr>
+        <w:rPr>
+          <w:b/>
+          <w:bCs/>
+        </w:rPr>
+      </w:pPr>
+      <w:r>
+        <w:rPr>
+          <w:b/>
+          <w:bCs/>
+        </w:rPr>
+        <w:t xml:space="preserve">Prompt: In the repository/ package, create a Spring Data JPA repository interface named </w:t>
+      </w:r>
+      <w:proofErr w:type="spellStart"/>
+      <w:r>
+        <w:rPr>
+          <w:b/>
+          <w:bCs/>
+        </w:rPr>
+        <w:t>DailyReturnAuditRepository</w:t>
+      </w:r>
+      <w:proofErr w:type="spellEnd"/>
+      <w:r>
+        <w:rPr>
+          <w:b/>
+          <w:bCs/>
+        </w:rPr>
+        <w:t xml:space="preserve"> that extends </w:t>
+      </w:r>
+      <w:proofErr w:type="spellStart"/>
+      <w:r>
+        <w:rPr>
+          <w:b/>
+          <w:bCs/>
+        </w:rPr>
+        <w:t>JpaRepository</w:t>
+      </w:r>
+      <w:proofErr w:type="spellEnd"/>
+      <w:r>
+        <w:rPr>
+          <w:b/>
+          <w:bCs/>
+        </w:rPr>
+        <w:t>&lt;</w:t>
+      </w:r>
+      <w:proofErr w:type="spellStart"/>
+      <w:r>
+        <w:rPr>
+          <w:b/>
+          <w:bCs/>
+        </w:rPr>
+        <w:t>DailyReturnAudit</w:t>
+      </w:r>
+      <w:proofErr w:type="spellEnd"/>
+      <w:r>
+        <w:rPr>
+          <w:b/>
+          <w:bCs/>
+        </w:rPr>
+        <w:t>, Long&gt;.</w:t>
+      </w:r>
+    </w:p>
+    <w:p>
+      <w:pPr>
+        <w:rPr>
+          <w:b/>
+          <w:bCs/>
+        </w:rPr>
+      </w:pPr>
+      <w:r>
+        <w:rPr>
+          <w:b/>
+          <w:bCs/>
+        </w:rPr>
+        <w:t>Add the following custom query methods (using Spring Data method naming — no JPQL needed):</w:t>
+      </w:r>
+    </w:p>
+    <w:p>
+      <w:pPr>
+        <w:numPr>
+          <w:ilvl w:val="0"/>
+          <w:numId w:val="6"/>
+        </w:numPr>
+        <w:rPr>
+          <w:b/>
+          <w:bCs/>
+        </w:rPr>
+      </w:pPr>
+      <w:r>
+        <w:rPr>
+          <w:b/>
+          <w:bCs/>
+        </w:rPr>
+        <w:t xml:space="preserve">A method to find all audit records by </w:t>
+      </w:r>
+      <w:proofErr w:type="spellStart"/>
+      <w:r>
+        <w:rPr>
+          <w:b/>
+          <w:bCs/>
+        </w:rPr>
+        <w:t>portfolioId</w:t>
+      </w:r>
+      <w:proofErr w:type="spellEnd"/>
+    </w:p>
+    <w:p>
+      <w:pPr>
+        <w:numPr>
+          <w:ilvl w:val="0"/>
+          <w:numId w:val="6"/>
+        </w:numPr>
+        <w:rPr>
+          <w:b/>
+          <w:bCs/>
+        </w:rPr>
+      </w:pPr>
+      <w:r>
+        <w:rPr>
+          <w:b/>
+          <w:bCs/>
+        </w:rPr>
+        <w:t>A method to find all audit records by status</w:t>
+      </w:r>
+    </w:p>
+    <w:p>
+      <w:pPr>
+        <w:numPr>
+          <w:ilvl w:val="0"/>
+          <w:numId w:val="6"/>
+        </w:numPr>
+        <w:rPr>
+          <w:b/>
+          <w:bCs/>
+        </w:rPr>
+      </w:pPr>
+      <w:r>
+        <w:rPr>
+          <w:b/>
+          <w:bCs/>
+        </w:rPr>
+        <w:t xml:space="preserve">A method to find a list of records by </w:t>
+      </w:r>
+      <w:proofErr w:type="spellStart"/>
+      <w:r>
+        <w:rPr>
+          <w:b/>
+          <w:bCs/>
+        </w:rPr>
+        <w:t>portfolioId</w:t>
+      </w:r>
+      <w:proofErr w:type="spellEnd"/>
+      <w:r>
+        <w:rPr>
+          <w:b/>
+          <w:bCs/>
+        </w:rPr>
+        <w:t xml:space="preserve"> and </w:t>
+      </w:r>
+      <w:proofErr w:type="spellStart"/>
+      <w:r>
+        <w:rPr>
+          <w:b/>
+          <w:bCs/>
+        </w:rPr>
+        <w:t>valuationDate</w:t>
+      </w:r>
+      <w:proofErr w:type="spellEnd"/>
+    </w:p>
+    <w:p>
+      <w:pPr>
+        <w:rPr>
+          <w:b/>
+          <w:bCs/>
+        </w:rPr>
+      </w:pPr>
+      <w:r>
+        <w:rPr>
+          <w:b/>
+          <w:bCs/>
+        </w:rPr>
+        <w:t>No implementation needed — Spring Data generates these automatically.</w:t>
+      </w:r>
+    </w:p>
+    <w:p>
+      <w:pPr>
+        <w:rPr>
+          <w:b/>
+          <w:bCs/>
+        </w:rPr>
+      </w:pPr>
+      <w:r>
+        <w:rPr>
+          <w:b/>
+          <w:bCs/>
+        </w:rPr>
+        <w:t xml:space="preserve">Validation Gate: Create a Spring Data slice test class </w:t>
+      </w:r>
+      <w:proofErr w:type="spellStart"/>
+      <w:r>
+        <w:rPr>
+          <w:b/>
+          <w:bCs/>
+        </w:rPr>
+        <w:t>DailyReturnAuditRepositoryTest</w:t>
+      </w:r>
+      <w:proofErr w:type="spellEnd"/>
+      <w:r>
+        <w:rPr>
+          <w:b/>
+          <w:bCs/>
+        </w:rPr>
+        <w:t xml:space="preserve"> using @DataJpaTest. In this test:</w:t>
+      </w:r>
+    </w:p>
+    <w:p>
+      <w:pPr>
+        <w:numPr>
+          <w:ilvl w:val="0"/>
+          <w:numId w:val="7"/>
+        </w:numPr>
+        <w:rPr>
+          <w:b/>
+          <w:bCs/>
+        </w:rPr>
+      </w:pPr>
+      <w:r>
+        <w:rPr>
+          <w:b/>
+          <w:bCs/>
+        </w:rPr>
+        <w:t xml:space="preserve">Save a manually constructed </w:t>
+      </w:r>
+      <w:proofErr w:type="spellStart"/>
+      <w:r>
+        <w:rPr>
+          <w:b/>
+          <w:bCs/>
+        </w:rPr>
+        <w:t>DailyReturnAudit</w:t>
+      </w:r>
+      <w:proofErr w:type="spellEnd"/>
+      <w:r>
+        <w:rPr>
+          <w:b/>
+          <w:bCs/>
+        </w:rPr>
+        <w:t xml:space="preserve"> entity with status "VALID" and </w:t>
+      </w:r>
+      <w:proofErr w:type="spellStart"/>
+      <w:r>
+        <w:rPr>
+          <w:b/>
+          <w:bCs/>
+        </w:rPr>
+        <w:t>portfolioId</w:t>
+      </w:r>
+      <w:proofErr w:type="spellEnd"/>
+      <w:r>
+        <w:rPr>
+          <w:b/>
+          <w:bCs/>
+        </w:rPr>
+        <w:t xml:space="preserve"> "PF-TEST" and </w:t>
+      </w:r>
+      <w:proofErr w:type="spellStart"/>
+      <w:r>
+        <w:rPr>
+          <w:b/>
+          <w:bCs/>
+        </w:rPr>
+        <w:t>valuationDate</w:t>
+      </w:r>
+      <w:proofErr w:type="spellEnd"/>
+      <w:r>
+        <w:rPr>
+          <w:b/>
+          <w:bCs/>
+        </w:rPr>
+        <w:t xml:space="preserve"> of today</w:t>
+      </w:r>
+    </w:p>
+    <w:p>
+      <w:pPr>
+        <w:numPr>
+          <w:ilvl w:val="0"/>
+          <w:numId w:val="7"/>
+        </w:numPr>
+        <w:rPr>
+          <w:b/>
+          <w:bCs/>
+        </w:rPr>
+      </w:pPr>
+      <w:r>
+        <w:rPr>
+          <w:b/>
+          <w:bCs/>
+        </w:rPr>
+        <w:t xml:space="preserve">Assert that </w:t>
+      </w:r>
+      <w:proofErr w:type="spellStart"/>
+      <w:r>
+        <w:rPr>
+          <w:b/>
+          <w:bCs/>
+        </w:rPr>
+        <w:t>findByPortfolioId</w:t>
+      </w:r>
+      <w:proofErr w:type="spellEnd"/>
+      <w:r>
+        <w:rPr>
+          <w:b/>
+          <w:bCs/>
+        </w:rPr>
+        <w:t>("PF-TEST") returns exactly 1 result</w:t>
+      </w:r>
+    </w:p>
+    <w:p>
+      <w:pPr>
+        <w:numPr>
+          <w:ilvl w:val="0"/>
+          <w:numId w:val="7"/>
+        </w:numPr>
+        <w:rPr>
+          <w:b/>
+          <w:bCs/>
+        </w:rPr>
+      </w:pPr>
+      <w:r>
+        <w:rPr>
+          <w:b/>
+          <w:bCs/>
+        </w:rPr>
+        <w:t xml:space="preserve">Assert that </w:t>
+      </w:r>
+      <w:proofErr w:type="spellStart"/>
+      <w:r>
+        <w:rPr>
+          <w:b/>
+          <w:bCs/>
+        </w:rPr>
+        <w:t>findByStatus</w:t>
+      </w:r>
+      <w:proofErr w:type="spellEnd"/>
+      <w:r>
+        <w:rPr>
+          <w:b/>
+          <w:bCs/>
+        </w:rPr>
+        <w:t>("VALID") returns at least 1 result</w:t>
+      </w:r>
+    </w:p>
+    <w:p>
+      <w:pPr>
+        <w:numPr>
+          <w:ilvl w:val="0"/>
+          <w:numId w:val="7"/>
+        </w:numPr>
+        <w:rPr>
+          <w:b/>
+          <w:bCs/>
+        </w:rPr>
+      </w:pPr>
+      <w:r>
+        <w:rPr>
+          <w:b/>
+          <w:bCs/>
+        </w:rPr>
+        <w:t xml:space="preserve">Assert that </w:t>
+      </w:r>
+      <w:proofErr w:type="spellStart"/>
+      <w:proofErr w:type="gramStart"/>
+      <w:r>
+        <w:rPr>
+          <w:b/>
+          <w:bCs/>
+        </w:rPr>
+        <w:t>findByPortfolioIdAndValuationDate</w:t>
+      </w:r>
+      <w:proofErr w:type="spellEnd"/>
+      <w:r>
+        <w:rPr>
+          <w:b/>
+          <w:bCs/>
+        </w:rPr>
+        <w:t>(</w:t>
+      </w:r>
+      <w:proofErr w:type="gramEnd"/>
+      <w:r>
+        <w:rPr>
+          <w:b/>
+          <w:bCs/>
+        </w:rPr>
+        <w:t>"PF-TEST", today) returns 1 result</w:t>
+      </w:r>
+    </w:p>
+    <w:p>
+      <w:pPr>
+        <w:numPr>
+          <w:ilvl w:val="0"/>
+          <w:numId w:val="7"/>
+        </w:numPr>
+        <w:rPr>
+          <w:b/>
+          <w:bCs/>
+        </w:rPr>
+      </w:pPr>
+      <w:r>
+        <w:rPr>
+          <w:b/>
+          <w:bCs/>
+        </w:rPr>
+        <w:t xml:space="preserve">Assert that </w:t>
+      </w:r>
+      <w:proofErr w:type="spellStart"/>
+      <w:r>
+        <w:rPr>
+          <w:b/>
+          <w:bCs/>
+        </w:rPr>
+        <w:t>findByPortfolioId</w:t>
+      </w:r>
+      <w:proofErr w:type="spellEnd"/>
+      <w:r>
+        <w:rPr>
+          <w:b/>
+          <w:bCs/>
+        </w:rPr>
+        <w:t>("PF-UNKNOWN") returns an empty list</w:t>
+      </w:r>
+    </w:p>
+    <w:p>
+      <w:pPr>
+        <w:rPr>
+          <w:b/>
+          <w:bCs/>
+        </w:rPr>
+      </w:pPr>
+      <w:r>
+        <w:rPr>
+          <w:b/>
+          <w:bCs/>
+        </w:rPr>
+        <w:t xml:space="preserve">Run </w:t>
+      </w:r>
+      <w:proofErr w:type="spellStart"/>
+      <w:r>
+        <w:rPr>
+          <w:b/>
+          <w:bCs/>
+        </w:rPr>
+        <w:t>mvn</w:t>
+      </w:r>
+      <w:proofErr w:type="spellEnd"/>
+      <w:r>
+        <w:rPr>
+          <w:b/>
+          <w:bCs/>
+        </w:rPr>
+        <w:t xml:space="preserve"> test. All 4 assertions must pass before proceeding.</w:t>
+      </w:r>
+    </w:p>
+    <w:p>
+      <w:pPr>
+        <w:rPr>
+          <w:b/>
+          <w:bCs/>
+        </w:rPr>
+      </w:pPr>
+      <w:r>
+        <w:rPr>
+          <w:b/>
+          <w:bCs/>
+        </w:rPr>
+        <w:pict w14:anchorId="00250D11">
+          <v:rect id="_x0000_i1036" style="width:0;height:1.5pt" o:hralign="center" o:hrstd="t" o:hr="t" fillcolor="#a0a0a0" stroked="f"/>
+        </w:pict>
+      </w:r>
+    </w:p>
+    <w:p>
+      <w:pPr>
+        <w:rPr>
+          <w:b/>
+          <w:bCs/>
+        </w:rPr>
+      </w:pPr>
     </w:p>
     <w:p/>
     <w:sectPr>
@@ -1837,6 +2356,119 @@
 <file path=word/numbering.xml><?xml version="1.0" encoding="utf-8"?>
 <w:numbering xmlns:wpc="http://schemas.microsoft.com/office/word/2010/wordprocessingCanvas" xmlns:cx="http://schemas.microsoft.com/office/drawing/2014/chartex" xmlns:cx1="http://schemas.microsoft.com/office/drawing/2015/9/8/chartex" xmlns:cx2="http://schemas.microsoft.com/office/drawing/2015/10/21/chartex" xmlns:cx3="http://schemas.microsoft.com/office/drawing/2016/5/9/chartex" xmlns:cx4="http://schemas.microsoft.com/office/drawing/2016/5/10/chartex" xmlns:cx5="http://schemas.microsoft.com/office/drawing/2016/5/11/chartex" xmlns:cx6="http://schemas.microsoft.com/office/drawing/2016/5/12/chartex" xmlns:cx7="http://schemas.microsoft.com/office/drawing/2016/5/13/chartex" xmlns:cx8="http://schemas.microsoft.com/office/drawing/2016/5/14/chartex" xmlns:mc="http://schemas.openxmlformats.org/markup-compatibility/2006" xmlns:aink="http://schemas.microsoft.com/office/drawing/2016/ink" xmlns:am3d="http://schemas.microsoft.com/office/drawing/2017/model3d" xmlns:o="urn:schemas-microsoft-com:office:office" xmlns:oel="http://schemas.microsoft.com/office/2019/extlst" xmlns:r="http://schemas.openxmlformats.org/officeDocument/2006/relationships" xmlns:m="http://schemas.openxmlformats.org/officeDocument/2006/math" xmlns:v="urn:schemas-microsoft-com:vml" xmlns:wp14="http://schemas.microsoft.com/office/word/2010/wordprocessingDrawing" xmlns:wp="http://schemas.openxmlformats.org/drawingml/2006/wordprocessingDrawing" xmlns:w10="urn:schemas-microsoft-com:office:word" xmlns:w="http://schemas.openxmlformats.org/wordprocessingml/2006/main" xmlns:w14="http://schemas.microsoft.com/office/word/2010/wordml" xmlns:w15="http://schemas.microsoft.com/office/word/2012/wordml" xmlns:w16cex="http://schemas.microsoft.com/office/word/2018/wordml/cex" xmlns:w16cid="http://schemas.microsoft.com/office/word/2016/wordml/cid" xmlns:w16="http://schemas.microsoft.com/office/word/2018/wordml" xmlns:w16du="http://schemas.microsoft.com/office/word/2023/wordml/word16du" xmlns:w16sdtdh="http://schemas.microsoft.com/office/word/2020/wordml/sdtdatahash" xmlns:w16sdtfl="http://schemas.microsoft.com/office/word/2024/wordml/sdtformatlock" xmlns:w16se="http://schemas.microsoft.com/office/word/2015/wordml/symex" xmlns:wpg="http://schemas.microsoft.com/office/word/2010/wordprocessingGroup" xmlns:wpi="http://schemas.microsoft.com/office/word/2010/wordprocessingInk" xmlns:wne="http://schemas.microsoft.com/office/word/2006/wordml" xmlns:wps="http://schemas.microsoft.com/office/word/2010/wordprocessingShape" mc:Ignorable="w14 w15 w16se w16cid w16 w16cex w16sdtdh w16sdtfl w16du wp14">
   <w:abstractNum w:abstractNumId="0" w15:restartNumberingAfterBreak="0">
+    <w:nsid w:val="45E06B6B"/>
+    <w:multiLevelType w:val="multilevel"/>
+    <w:tmpl w:val="5DCE223C"/>
+    <w:lvl w:ilvl="0">
+      <w:start w:val="1"/>
+      <w:numFmt w:val="decimal"/>
+      <w:lvlText w:val="%1."/>
+      <w:lvlJc w:val="left"/>
+      <w:pPr>
+        <w:tabs>
+          <w:tab w:val="num" w:pos="720"/>
+        </w:tabs>
+        <w:ind w:left="720" w:hanging="360"/>
+      </w:pPr>
+    </w:lvl>
+    <w:lvl w:ilvl="1" w:tentative="1">
+      <w:start w:val="1"/>
+      <w:numFmt w:val="decimal"/>
+      <w:lvlText w:val="%2."/>
+      <w:lvlJc w:val="left"/>
+      <w:pPr>
+        <w:tabs>
+          <w:tab w:val="num" w:pos="1440"/>
+        </w:tabs>
+        <w:ind w:left="1440" w:hanging="360"/>
+      </w:pPr>
+    </w:lvl>
+    <w:lvl w:ilvl="2" w:tentative="1">
+      <w:start w:val="1"/>
+      <w:numFmt w:val="decimal"/>
+      <w:lvlText w:val="%3."/>
+      <w:lvlJc w:val="left"/>
+      <w:pPr>
+        <w:tabs>
+          <w:tab w:val="num" w:pos="2160"/>
+        </w:tabs>
+        <w:ind w:left="2160" w:hanging="360"/>
+      </w:pPr>
+    </w:lvl>
+    <w:lvl w:ilvl="3" w:tentative="1">
+      <w:start w:val="1"/>
+      <w:numFmt w:val="decimal"/>
+      <w:lvlText w:val="%4."/>
+      <w:lvlJc w:val="left"/>
+      <w:pPr>
+        <w:tabs>
+          <w:tab w:val="num" w:pos="2880"/>
+        </w:tabs>
+        <w:ind w:left="2880" w:hanging="360"/>
+      </w:pPr>
+    </w:lvl>
+    <w:lvl w:ilvl="4" w:tentative="1">
+      <w:start w:val="1"/>
+      <w:numFmt w:val="decimal"/>
+      <w:lvlText w:val="%5."/>
+      <w:lvlJc w:val="left"/>
+      <w:pPr>
+        <w:tabs>
+          <w:tab w:val="num" w:pos="3600"/>
+        </w:tabs>
+        <w:ind w:left="3600" w:hanging="360"/>
+      </w:pPr>
+    </w:lvl>
+    <w:lvl w:ilvl="5" w:tentative="1">
+      <w:start w:val="1"/>
+      <w:numFmt w:val="decimal"/>
+      <w:lvlText w:val="%6."/>
+      <w:lvlJc w:val="left"/>
+      <w:pPr>
+        <w:tabs>
+          <w:tab w:val="num" w:pos="4320"/>
+        </w:tabs>
+        <w:ind w:left="4320" w:hanging="360"/>
+      </w:pPr>
+    </w:lvl>
+    <w:lvl w:ilvl="6" w:tentative="1">
+      <w:start w:val="1"/>
+      <w:numFmt w:val="decimal"/>
+      <w:lvlText w:val="%7."/>
+      <w:lvlJc w:val="left"/>
+      <w:pPr>
+        <w:tabs>
+          <w:tab w:val="num" w:pos="5040"/>
+        </w:tabs>
+        <w:ind w:left="5040" w:hanging="360"/>
+      </w:pPr>
+    </w:lvl>
+    <w:lvl w:ilvl="7" w:tentative="1">
+      <w:start w:val="1"/>
+      <w:numFmt w:val="decimal"/>
+      <w:lvlText w:val="%8."/>
+      <w:lvlJc w:val="left"/>
+      <w:pPr>
+        <w:tabs>
+          <w:tab w:val="num" w:pos="5760"/>
+        </w:tabs>
+        <w:ind w:left="5760" w:hanging="360"/>
+      </w:pPr>
+    </w:lvl>
+    <w:lvl w:ilvl="8" w:tentative="1">
+      <w:start w:val="1"/>
+      <w:numFmt w:val="decimal"/>
+      <w:lvlText w:val="%9."/>
+      <w:lvlJc w:val="left"/>
+      <w:pPr>
+        <w:tabs>
+          <w:tab w:val="num" w:pos="6480"/>
+        </w:tabs>
+        <w:ind w:left="6480" w:hanging="360"/>
+      </w:pPr>
+    </w:lvl>
+  </w:abstractNum>
+  <w:abstractNum w:abstractNumId="1" w15:restartNumberingAfterBreak="0">
     <w:nsid w:val="48D54F2D"/>
     <w:multiLevelType w:val="multilevel"/>
     <w:tmpl w:val="60ECAB30"/>
@@ -1985,7 +2617,7 @@
       </w:rPr>
     </w:lvl>
   </w:abstractNum>
-  <w:abstractNum w:abstractNumId="1" w15:restartNumberingAfterBreak="0">
+  <w:abstractNum w:abstractNumId="2" w15:restartNumberingAfterBreak="0">
     <w:nsid w:val="49BC05C8"/>
     <w:multiLevelType w:val="multilevel"/>
     <w:tmpl w:val="0FBE3320"/>
@@ -2134,7 +2766,7 @@
       </w:rPr>
     </w:lvl>
   </w:abstractNum>
-  <w:abstractNum w:abstractNumId="2" w15:restartNumberingAfterBreak="0">
+  <w:abstractNum w:abstractNumId="3" w15:restartNumberingAfterBreak="0">
     <w:nsid w:val="4A4B573B"/>
     <w:multiLevelType w:val="multilevel"/>
     <w:tmpl w:val="56682CAC"/>
@@ -2283,7 +2915,7 @@
       </w:rPr>
     </w:lvl>
   </w:abstractNum>
-  <w:abstractNum w:abstractNumId="3" w15:restartNumberingAfterBreak="0">
+  <w:abstractNum w:abstractNumId="4" w15:restartNumberingAfterBreak="0">
     <w:nsid w:val="531C11F0"/>
     <w:multiLevelType w:val="multilevel"/>
     <w:tmpl w:val="971A32F6"/>
@@ -2396,7 +3028,156 @@
       </w:pPr>
     </w:lvl>
   </w:abstractNum>
-  <w:abstractNum w:abstractNumId="4" w15:restartNumberingAfterBreak="0">
+  <w:abstractNum w:abstractNumId="5" w15:restartNumberingAfterBreak="0">
+    <w:nsid w:val="6038058D"/>
+    <w:multiLevelType w:val="multilevel"/>
+    <w:tmpl w:val="4DCC0926"/>
+    <w:lvl w:ilvl="0">
+      <w:start w:val="1"/>
+      <w:numFmt w:val="bullet"/>
+      <w:lvlText w:val=""/>
+      <w:lvlJc w:val="left"/>
+      <w:pPr>
+        <w:tabs>
+          <w:tab w:val="num" w:pos="720"/>
+        </w:tabs>
+        <w:ind w:left="720" w:hanging="360"/>
+      </w:pPr>
+      <w:rPr>
+        <w:rFonts w:ascii="Symbol" w:hAnsi="Symbol" w:hint="default"/>
+        <w:sz w:val="20"/>
+      </w:rPr>
+    </w:lvl>
+    <w:lvl w:ilvl="1" w:tentative="1">
+      <w:start w:val="1"/>
+      <w:numFmt w:val="bullet"/>
+      <w:lvlText w:val="o"/>
+      <w:lvlJc w:val="left"/>
+      <w:pPr>
+        <w:tabs>
+          <w:tab w:val="num" w:pos="1440"/>
+        </w:tabs>
+        <w:ind w:left="1440" w:hanging="360"/>
+      </w:pPr>
+      <w:rPr>
+        <w:rFonts w:ascii="Courier New" w:hAnsi="Courier New" w:hint="default"/>
+        <w:sz w:val="20"/>
+      </w:rPr>
+    </w:lvl>
+    <w:lvl w:ilvl="2" w:tentative="1">
+      <w:start w:val="1"/>
+      <w:numFmt w:val="bullet"/>
+      <w:lvlText w:val=""/>
+      <w:lvlJc w:val="left"/>
+      <w:pPr>
+        <w:tabs>
+          <w:tab w:val="num" w:pos="2160"/>
+        </w:tabs>
+        <w:ind w:left="2160" w:hanging="360"/>
+      </w:pPr>
+      <w:rPr>
+        <w:rFonts w:ascii="Wingdings" w:hAnsi="Wingdings" w:hint="default"/>
+        <w:sz w:val="20"/>
+      </w:rPr>
+    </w:lvl>
+    <w:lvl w:ilvl="3" w:tentative="1">
+      <w:start w:val="1"/>
+      <w:numFmt w:val="bullet"/>
+      <w:lvlText w:val=""/>
+      <w:lvlJc w:val="left"/>
+      <w:pPr>
+        <w:tabs>
+          <w:tab w:val="num" w:pos="2880"/>
+        </w:tabs>
+        <w:ind w:left="2880" w:hanging="360"/>
+      </w:pPr>
+      <w:rPr>
+        <w:rFonts w:ascii="Wingdings" w:hAnsi="Wingdings" w:hint="default"/>
+        <w:sz w:val="20"/>
+      </w:rPr>
+    </w:lvl>
+    <w:lvl w:ilvl="4" w:tentative="1">
+      <w:start w:val="1"/>
+      <w:numFmt w:val="bullet"/>
+      <w:lvlText w:val=""/>
+      <w:lvlJc w:val="left"/>
+      <w:pPr>
+        <w:tabs>
+          <w:tab w:val="num" w:pos="3600"/>
+        </w:tabs>
+        <w:ind w:left="3600" w:hanging="360"/>
+      </w:pPr>
+      <w:rPr>
+        <w:rFonts w:ascii="Wingdings" w:hAnsi="Wingdings" w:hint="default"/>
+        <w:sz w:val="20"/>
+      </w:rPr>
+    </w:lvl>
+    <w:lvl w:ilvl="5" w:tentative="1">
+      <w:start w:val="1"/>
+      <w:numFmt w:val="bullet"/>
+      <w:lvlText w:val=""/>
+      <w:lvlJc w:val="left"/>
+      <w:pPr>
+        <w:tabs>
+          <w:tab w:val="num" w:pos="4320"/>
+        </w:tabs>
+        <w:ind w:left="4320" w:hanging="360"/>
+      </w:pPr>
+      <w:rPr>
+        <w:rFonts w:ascii="Wingdings" w:hAnsi="Wingdings" w:hint="default"/>
+        <w:sz w:val="20"/>
+      </w:rPr>
+    </w:lvl>
+    <w:lvl w:ilvl="6" w:tentative="1">
+      <w:start w:val="1"/>
+      <w:numFmt w:val="bullet"/>
+      <w:lvlText w:val=""/>
+      <w:lvlJc w:val="left"/>
+      <w:pPr>
+        <w:tabs>
+          <w:tab w:val="num" w:pos="5040"/>
+        </w:tabs>
+        <w:ind w:left="5040" w:hanging="360"/>
+      </w:pPr>
+      <w:rPr>
+        <w:rFonts w:ascii="Wingdings" w:hAnsi="Wingdings" w:hint="default"/>
+        <w:sz w:val="20"/>
+      </w:rPr>
+    </w:lvl>
+    <w:lvl w:ilvl="7" w:tentative="1">
+      <w:start w:val="1"/>
+      <w:numFmt w:val="bullet"/>
+      <w:lvlText w:val=""/>
+      <w:lvlJc w:val="left"/>
+      <w:pPr>
+        <w:tabs>
+          <w:tab w:val="num" w:pos="5760"/>
+        </w:tabs>
+        <w:ind w:left="5760" w:hanging="360"/>
+      </w:pPr>
+      <w:rPr>
+        <w:rFonts w:ascii="Wingdings" w:hAnsi="Wingdings" w:hint="default"/>
+        <w:sz w:val="20"/>
+      </w:rPr>
+    </w:lvl>
+    <w:lvl w:ilvl="8" w:tentative="1">
+      <w:start w:val="1"/>
+      <w:numFmt w:val="bullet"/>
+      <w:lvlText w:val=""/>
+      <w:lvlJc w:val="left"/>
+      <w:pPr>
+        <w:tabs>
+          <w:tab w:val="num" w:pos="6480"/>
+        </w:tabs>
+        <w:ind w:left="6480" w:hanging="360"/>
+      </w:pPr>
+      <w:rPr>
+        <w:rFonts w:ascii="Wingdings" w:hAnsi="Wingdings" w:hint="default"/>
+        <w:sz w:val="20"/>
+      </w:rPr>
+    </w:lvl>
+  </w:abstractNum>
+  <w:abstractNum w:abstractNumId="6" w15:restartNumberingAfterBreak="0">
     <w:nsid w:val="7B1E12D3"/>
     <w:multiLevelType w:val="multilevel"/>
     <w:tmpl w:val="CEC4AD36"/>
@@ -2546,19 +3327,25 @@
     </w:lvl>
   </w:abstractNum>
   <w:num w:numId="1" w16cid:durableId="1755397055">
+    <w:abstractNumId w:val="2"/>
+  </w:num>
+  <w:num w:numId="2" w16cid:durableId="1999840450">
     <w:abstractNumId w:val="1"/>
   </w:num>
-  <w:num w:numId="2" w16cid:durableId="1999840450">
+  <w:num w:numId="3" w16cid:durableId="783694229">
+    <w:abstractNumId w:val="4"/>
+  </w:num>
+  <w:num w:numId="4" w16cid:durableId="71589213">
+    <w:abstractNumId w:val="3"/>
+  </w:num>
+  <w:num w:numId="5" w16cid:durableId="896864988">
+    <w:abstractNumId w:val="6"/>
+  </w:num>
+  <w:num w:numId="6" w16cid:durableId="1412656734">
     <w:abstractNumId w:val="0"/>
   </w:num>
-  <w:num w:numId="3" w16cid:durableId="783694229">
-    <w:abstractNumId w:val="3"/>
-  </w:num>
-  <w:num w:numId="4" w16cid:durableId="71589213">
-    <w:abstractNumId w:val="2"/>
-  </w:num>
-  <w:num w:numId="5" w16cid:durableId="896864988">
-    <w:abstractNumId w:val="4"/>
+  <w:num w:numId="7" w16cid:durableId="434860212">
+    <w:abstractNumId w:val="5"/>
   </w:num>
 </w:numbering>
 </file>

</xml_diff>

<commit_message>
Add request and response model and it's test
</commit_message>
<xml_diff>
--- a/Prompts.docx
+++ b/Prompts.docx
@@ -2331,6 +2331,1463 @@
         </w:rPr>
         <w:pict w14:anchorId="00250D11">
           <v:rect id="_x0000_i1036" style="width:0;height:1.5pt" o:hralign="center" o:hrstd="t" o:hr="t" fillcolor="#a0a0a0" stroked="f"/>
+        </w:pict>
+      </w:r>
+    </w:p>
+    <w:p>
+      <w:pPr>
+        <w:rPr>
+          <w:b/>
+          <w:bCs/>
+        </w:rPr>
+      </w:pPr>
+      <w:r>
+        <w:rPr>
+          <w:b/>
+          <w:bCs/>
+        </w:rPr>
+        <w:lastRenderedPageBreak/>
+        <w:pict w14:anchorId="6A0EE8C3">
+          <v:rect id="_x0000_i1039" style="width:0;height:1.5pt" o:hralign="center" o:hrstd="t" o:hr="t" fillcolor="#a0a0a0" stroked="f"/>
+        </w:pict>
+      </w:r>
+    </w:p>
+    <w:p>
+      <w:pPr>
+        <w:rPr>
+          <w:b/>
+          <w:bCs/>
+        </w:rPr>
+      </w:pPr>
+      <w:r>
+        <w:rPr>
+          <w:b/>
+          <w:bCs/>
+        </w:rPr>
+        <w:t>Step 5: Define the API Request and Response Models</w:t>
+      </w:r>
+    </w:p>
+    <w:p>
+      <w:pPr>
+        <w:rPr>
+          <w:b/>
+          <w:bCs/>
+        </w:rPr>
+      </w:pPr>
+      <w:r>
+        <w:rPr>
+          <w:b/>
+          <w:bCs/>
+        </w:rPr>
+        <w:t xml:space="preserve">Prompt: In the model/request/ package, create a class </w:t>
+      </w:r>
+      <w:proofErr w:type="spellStart"/>
+      <w:r>
+        <w:rPr>
+          <w:b/>
+          <w:bCs/>
+        </w:rPr>
+        <w:t>DailyReturnRequest</w:t>
+      </w:r>
+      <w:proofErr w:type="spellEnd"/>
+      <w:r>
+        <w:rPr>
+          <w:b/>
+          <w:bCs/>
+        </w:rPr>
+        <w:t xml:space="preserve"> with the following fields and Jakarta Bean Validation annotations:</w:t>
+      </w:r>
+    </w:p>
+    <w:tbl>
+      <w:tblPr>
+        <w:tblW w:w="0" w:type="auto"/>
+        <w:tblCellSpacing w:w="15" w:type="dxa"/>
+        <w:tblCellMar>
+          <w:top w:w="15" w:type="dxa"/>
+          <w:left w:w="15" w:type="dxa"/>
+          <w:bottom w:w="15" w:type="dxa"/>
+          <w:right w:w="15" w:type="dxa"/>
+        </w:tblCellMar>
+        <w:tblLook w:val="04A0" w:firstRow="1" w:lastRow="0" w:firstColumn="1" w:lastColumn="0" w:noHBand="0" w:noVBand="1"/>
+      </w:tblPr>
+      <w:tblGrid>
+        <w:gridCol w:w="2006"/>
+        <w:gridCol w:w="1079"/>
+        <w:gridCol w:w="1122"/>
+      </w:tblGrid>
+      <w:tr>
+        <w:trPr>
+          <w:tblHeader/>
+          <w:tblCellSpacing w:w="15" w:type="dxa"/>
+        </w:trPr>
+        <w:tc>
+          <w:tcPr>
+            <w:tcW w:w="0" w:type="auto"/>
+            <w:vAlign w:val="center"/>
+            <w:hideMark/>
+          </w:tcPr>
+          <w:p>
+            <w:pPr>
+              <w:rPr>
+                <w:b/>
+                <w:bCs/>
+              </w:rPr>
+            </w:pPr>
+            <w:r>
+              <w:rPr>
+                <w:b/>
+                <w:bCs/>
+              </w:rPr>
+              <w:t>Field</w:t>
+            </w:r>
+          </w:p>
+        </w:tc>
+        <w:tc>
+          <w:tcPr>
+            <w:tcW w:w="0" w:type="auto"/>
+            <w:vAlign w:val="center"/>
+            <w:hideMark/>
+          </w:tcPr>
+          <w:p>
+            <w:pPr>
+              <w:rPr>
+                <w:b/>
+                <w:bCs/>
+              </w:rPr>
+            </w:pPr>
+            <w:r>
+              <w:rPr>
+                <w:b/>
+                <w:bCs/>
+              </w:rPr>
+              <w:t>Type</w:t>
+            </w:r>
+          </w:p>
+        </w:tc>
+        <w:tc>
+          <w:tcPr>
+            <w:tcW w:w="0" w:type="auto"/>
+            <w:vAlign w:val="center"/>
+            <w:hideMark/>
+          </w:tcPr>
+          <w:p>
+            <w:pPr>
+              <w:rPr>
+                <w:b/>
+                <w:bCs/>
+              </w:rPr>
+            </w:pPr>
+            <w:r>
+              <w:rPr>
+                <w:b/>
+                <w:bCs/>
+              </w:rPr>
+              <w:t>Validation</w:t>
+            </w:r>
+          </w:p>
+        </w:tc>
+      </w:tr>
+      <w:tr>
+        <w:trPr>
+          <w:tblCellSpacing w:w="15" w:type="dxa"/>
+        </w:trPr>
+        <w:tc>
+          <w:tcPr>
+            <w:tcW w:w="0" w:type="auto"/>
+            <w:vAlign w:val="center"/>
+            <w:hideMark/>
+          </w:tcPr>
+          <w:p>
+            <w:pPr>
+              <w:rPr>
+                <w:b/>
+                <w:bCs/>
+              </w:rPr>
+            </w:pPr>
+            <w:proofErr w:type="spellStart"/>
+            <w:r>
+              <w:rPr>
+                <w:b/>
+                <w:bCs/>
+              </w:rPr>
+              <w:t>portfolioId</w:t>
+            </w:r>
+            <w:proofErr w:type="spellEnd"/>
+          </w:p>
+        </w:tc>
+        <w:tc>
+          <w:tcPr>
+            <w:tcW w:w="0" w:type="auto"/>
+            <w:vAlign w:val="center"/>
+            <w:hideMark/>
+          </w:tcPr>
+          <w:p>
+            <w:pPr>
+              <w:rPr>
+                <w:b/>
+                <w:bCs/>
+              </w:rPr>
+            </w:pPr>
+            <w:r>
+              <w:rPr>
+                <w:b/>
+                <w:bCs/>
+              </w:rPr>
+              <w:t>String</w:t>
+            </w:r>
+          </w:p>
+        </w:tc>
+        <w:tc>
+          <w:tcPr>
+            <w:tcW w:w="0" w:type="auto"/>
+            <w:vAlign w:val="center"/>
+            <w:hideMark/>
+          </w:tcPr>
+          <w:p>
+            <w:pPr>
+              <w:rPr>
+                <w:b/>
+                <w:bCs/>
+              </w:rPr>
+            </w:pPr>
+            <w:r>
+              <w:rPr>
+                <w:b/>
+                <w:bCs/>
+              </w:rPr>
+              <w:t>@NotBlank</w:t>
+            </w:r>
+          </w:p>
+        </w:tc>
+      </w:tr>
+      <w:tr>
+        <w:trPr>
+          <w:tblCellSpacing w:w="15" w:type="dxa"/>
+        </w:trPr>
+        <w:tc>
+          <w:tcPr>
+            <w:tcW w:w="0" w:type="auto"/>
+            <w:vAlign w:val="center"/>
+            <w:hideMark/>
+          </w:tcPr>
+          <w:p>
+            <w:pPr>
+              <w:rPr>
+                <w:b/>
+                <w:bCs/>
+              </w:rPr>
+            </w:pPr>
+            <w:proofErr w:type="spellStart"/>
+            <w:r>
+              <w:rPr>
+                <w:b/>
+                <w:bCs/>
+              </w:rPr>
+              <w:t>valuationDate</w:t>
+            </w:r>
+            <w:proofErr w:type="spellEnd"/>
+          </w:p>
+        </w:tc>
+        <w:tc>
+          <w:tcPr>
+            <w:tcW w:w="0" w:type="auto"/>
+            <w:vAlign w:val="center"/>
+            <w:hideMark/>
+          </w:tcPr>
+          <w:p>
+            <w:pPr>
+              <w:rPr>
+                <w:b/>
+                <w:bCs/>
+              </w:rPr>
+            </w:pPr>
+            <w:proofErr w:type="spellStart"/>
+            <w:r>
+              <w:rPr>
+                <w:b/>
+                <w:bCs/>
+              </w:rPr>
+              <w:t>LocalDate</w:t>
+            </w:r>
+            <w:proofErr w:type="spellEnd"/>
+          </w:p>
+        </w:tc>
+        <w:tc>
+          <w:tcPr>
+            <w:tcW w:w="0" w:type="auto"/>
+            <w:vAlign w:val="center"/>
+            <w:hideMark/>
+          </w:tcPr>
+          <w:p>
+            <w:pPr>
+              <w:rPr>
+                <w:b/>
+                <w:bCs/>
+              </w:rPr>
+            </w:pPr>
+            <w:r>
+              <w:rPr>
+                <w:b/>
+                <w:bCs/>
+              </w:rPr>
+              <w:t>@NotNull</w:t>
+            </w:r>
+          </w:p>
+        </w:tc>
+      </w:tr>
+      <w:tr>
+        <w:trPr>
+          <w:tblCellSpacing w:w="15" w:type="dxa"/>
+        </w:trPr>
+        <w:tc>
+          <w:tcPr>
+            <w:tcW w:w="0" w:type="auto"/>
+            <w:vAlign w:val="center"/>
+            <w:hideMark/>
+          </w:tcPr>
+          <w:p>
+            <w:pPr>
+              <w:rPr>
+                <w:b/>
+                <w:bCs/>
+              </w:rPr>
+            </w:pPr>
+            <w:proofErr w:type="spellStart"/>
+            <w:r>
+              <w:rPr>
+                <w:b/>
+                <w:bCs/>
+              </w:rPr>
+              <w:t>beginMarketValue</w:t>
+            </w:r>
+            <w:proofErr w:type="spellEnd"/>
+          </w:p>
+        </w:tc>
+        <w:tc>
+          <w:tcPr>
+            <w:tcW w:w="0" w:type="auto"/>
+            <w:vAlign w:val="center"/>
+            <w:hideMark/>
+          </w:tcPr>
+          <w:p>
+            <w:pPr>
+              <w:rPr>
+                <w:b/>
+                <w:bCs/>
+              </w:rPr>
+            </w:pPr>
+            <w:proofErr w:type="spellStart"/>
+            <w:r>
+              <w:rPr>
+                <w:b/>
+                <w:bCs/>
+              </w:rPr>
+              <w:t>BigDecimal</w:t>
+            </w:r>
+            <w:proofErr w:type="spellEnd"/>
+          </w:p>
+        </w:tc>
+        <w:tc>
+          <w:tcPr>
+            <w:tcW w:w="0" w:type="auto"/>
+            <w:vAlign w:val="center"/>
+            <w:hideMark/>
+          </w:tcPr>
+          <w:p>
+            <w:pPr>
+              <w:rPr>
+                <w:b/>
+                <w:bCs/>
+              </w:rPr>
+            </w:pPr>
+            <w:r>
+              <w:rPr>
+                <w:b/>
+                <w:bCs/>
+              </w:rPr>
+              <w:t>@NotNull</w:t>
+            </w:r>
+          </w:p>
+        </w:tc>
+      </w:tr>
+      <w:tr>
+        <w:trPr>
+          <w:tblCellSpacing w:w="15" w:type="dxa"/>
+        </w:trPr>
+        <w:tc>
+          <w:tcPr>
+            <w:tcW w:w="0" w:type="auto"/>
+            <w:vAlign w:val="center"/>
+            <w:hideMark/>
+          </w:tcPr>
+          <w:p>
+            <w:pPr>
+              <w:rPr>
+                <w:b/>
+                <w:bCs/>
+              </w:rPr>
+            </w:pPr>
+            <w:proofErr w:type="spellStart"/>
+            <w:r>
+              <w:rPr>
+                <w:b/>
+                <w:bCs/>
+              </w:rPr>
+              <w:t>endMarketValue</w:t>
+            </w:r>
+            <w:proofErr w:type="spellEnd"/>
+          </w:p>
+        </w:tc>
+        <w:tc>
+          <w:tcPr>
+            <w:tcW w:w="0" w:type="auto"/>
+            <w:vAlign w:val="center"/>
+            <w:hideMark/>
+          </w:tcPr>
+          <w:p>
+            <w:pPr>
+              <w:rPr>
+                <w:b/>
+                <w:bCs/>
+              </w:rPr>
+            </w:pPr>
+            <w:proofErr w:type="spellStart"/>
+            <w:r>
+              <w:rPr>
+                <w:b/>
+                <w:bCs/>
+              </w:rPr>
+              <w:t>BigDecimal</w:t>
+            </w:r>
+            <w:proofErr w:type="spellEnd"/>
+          </w:p>
+        </w:tc>
+        <w:tc>
+          <w:tcPr>
+            <w:tcW w:w="0" w:type="auto"/>
+            <w:vAlign w:val="center"/>
+            <w:hideMark/>
+          </w:tcPr>
+          <w:p>
+            <w:pPr>
+              <w:rPr>
+                <w:b/>
+                <w:bCs/>
+              </w:rPr>
+            </w:pPr>
+            <w:r>
+              <w:rPr>
+                <w:b/>
+                <w:bCs/>
+              </w:rPr>
+              <w:t>@NotNull</w:t>
+            </w:r>
+          </w:p>
+        </w:tc>
+      </w:tr>
+      <w:tr>
+        <w:trPr>
+          <w:tblCellSpacing w:w="15" w:type="dxa"/>
+        </w:trPr>
+        <w:tc>
+          <w:tcPr>
+            <w:tcW w:w="0" w:type="auto"/>
+            <w:vAlign w:val="center"/>
+            <w:hideMark/>
+          </w:tcPr>
+          <w:p>
+            <w:pPr>
+              <w:rPr>
+                <w:b/>
+                <w:bCs/>
+              </w:rPr>
+            </w:pPr>
+            <w:proofErr w:type="spellStart"/>
+            <w:r>
+              <w:rPr>
+                <w:b/>
+                <w:bCs/>
+              </w:rPr>
+              <w:t>netCashFlow</w:t>
+            </w:r>
+            <w:proofErr w:type="spellEnd"/>
+          </w:p>
+        </w:tc>
+        <w:tc>
+          <w:tcPr>
+            <w:tcW w:w="0" w:type="auto"/>
+            <w:vAlign w:val="center"/>
+            <w:hideMark/>
+          </w:tcPr>
+          <w:p>
+            <w:pPr>
+              <w:rPr>
+                <w:b/>
+                <w:bCs/>
+              </w:rPr>
+            </w:pPr>
+            <w:proofErr w:type="spellStart"/>
+            <w:r>
+              <w:rPr>
+                <w:b/>
+                <w:bCs/>
+              </w:rPr>
+              <w:t>BigDecimal</w:t>
+            </w:r>
+            <w:proofErr w:type="spellEnd"/>
+          </w:p>
+        </w:tc>
+        <w:tc>
+          <w:tcPr>
+            <w:tcW w:w="0" w:type="auto"/>
+            <w:vAlign w:val="center"/>
+            <w:hideMark/>
+          </w:tcPr>
+          <w:p>
+            <w:pPr>
+              <w:rPr>
+                <w:b/>
+                <w:bCs/>
+              </w:rPr>
+            </w:pPr>
+            <w:r>
+              <w:rPr>
+                <w:b/>
+                <w:bCs/>
+              </w:rPr>
+              <w:t>@NotNull</w:t>
+            </w:r>
+          </w:p>
+        </w:tc>
+      </w:tr>
+      <w:tr>
+        <w:trPr>
+          <w:tblCellSpacing w:w="15" w:type="dxa"/>
+        </w:trPr>
+        <w:tc>
+          <w:tcPr>
+            <w:tcW w:w="0" w:type="auto"/>
+            <w:vAlign w:val="center"/>
+            <w:hideMark/>
+          </w:tcPr>
+          <w:p>
+            <w:pPr>
+              <w:rPr>
+                <w:b/>
+                <w:bCs/>
+              </w:rPr>
+            </w:pPr>
+            <w:proofErr w:type="spellStart"/>
+            <w:r>
+              <w:rPr>
+                <w:b/>
+                <w:bCs/>
+              </w:rPr>
+              <w:t>benchmarkReturnPct</w:t>
+            </w:r>
+            <w:proofErr w:type="spellEnd"/>
+          </w:p>
+        </w:tc>
+        <w:tc>
+          <w:tcPr>
+            <w:tcW w:w="0" w:type="auto"/>
+            <w:vAlign w:val="center"/>
+            <w:hideMark/>
+          </w:tcPr>
+          <w:p>
+            <w:pPr>
+              <w:rPr>
+                <w:b/>
+                <w:bCs/>
+              </w:rPr>
+            </w:pPr>
+            <w:proofErr w:type="spellStart"/>
+            <w:r>
+              <w:rPr>
+                <w:b/>
+                <w:bCs/>
+              </w:rPr>
+              <w:t>BigDecimal</w:t>
+            </w:r>
+            <w:proofErr w:type="spellEnd"/>
+          </w:p>
+        </w:tc>
+        <w:tc>
+          <w:tcPr>
+            <w:tcW w:w="0" w:type="auto"/>
+            <w:vAlign w:val="center"/>
+            <w:hideMark/>
+          </w:tcPr>
+          <w:p>
+            <w:pPr>
+              <w:rPr>
+                <w:b/>
+                <w:bCs/>
+              </w:rPr>
+            </w:pPr>
+            <w:r>
+              <w:rPr>
+                <w:b/>
+                <w:bCs/>
+              </w:rPr>
+              <w:t>@NotNull</w:t>
+            </w:r>
+          </w:p>
+        </w:tc>
+      </w:tr>
+      <w:tr>
+        <w:trPr>
+          <w:tblCellSpacing w:w="15" w:type="dxa"/>
+        </w:trPr>
+        <w:tc>
+          <w:tcPr>
+            <w:tcW w:w="0" w:type="auto"/>
+            <w:vAlign w:val="center"/>
+            <w:hideMark/>
+          </w:tcPr>
+          <w:p>
+            <w:pPr>
+              <w:rPr>
+                <w:b/>
+                <w:bCs/>
+              </w:rPr>
+            </w:pPr>
+            <w:r>
+              <w:rPr>
+                <w:b/>
+                <w:bCs/>
+              </w:rPr>
+              <w:t>currency</w:t>
+            </w:r>
+          </w:p>
+        </w:tc>
+        <w:tc>
+          <w:tcPr>
+            <w:tcW w:w="0" w:type="auto"/>
+            <w:vAlign w:val="center"/>
+            <w:hideMark/>
+          </w:tcPr>
+          <w:p>
+            <w:pPr>
+              <w:rPr>
+                <w:b/>
+                <w:bCs/>
+              </w:rPr>
+            </w:pPr>
+            <w:r>
+              <w:rPr>
+                <w:b/>
+                <w:bCs/>
+              </w:rPr>
+              <w:t>String</w:t>
+            </w:r>
+          </w:p>
+        </w:tc>
+        <w:tc>
+          <w:tcPr>
+            <w:tcW w:w="0" w:type="auto"/>
+            <w:vAlign w:val="center"/>
+            <w:hideMark/>
+          </w:tcPr>
+          <w:p>
+            <w:pPr>
+              <w:rPr>
+                <w:b/>
+                <w:bCs/>
+              </w:rPr>
+            </w:pPr>
+            <w:r>
+              <w:rPr>
+                <w:b/>
+                <w:bCs/>
+              </w:rPr>
+              <w:t>@NotBlank</w:t>
+            </w:r>
+          </w:p>
+        </w:tc>
+      </w:tr>
+      <w:tr>
+        <w:trPr>
+          <w:tblCellSpacing w:w="15" w:type="dxa"/>
+        </w:trPr>
+        <w:tc>
+          <w:tcPr>
+            <w:tcW w:w="0" w:type="auto"/>
+            <w:vAlign w:val="center"/>
+            <w:hideMark/>
+          </w:tcPr>
+          <w:p>
+            <w:pPr>
+              <w:rPr>
+                <w:b/>
+                <w:bCs/>
+              </w:rPr>
+            </w:pPr>
+            <w:proofErr w:type="spellStart"/>
+            <w:r>
+              <w:rPr>
+                <w:b/>
+                <w:bCs/>
+              </w:rPr>
+              <w:t>requestedBy</w:t>
+            </w:r>
+            <w:proofErr w:type="spellEnd"/>
+          </w:p>
+        </w:tc>
+        <w:tc>
+          <w:tcPr>
+            <w:tcW w:w="0" w:type="auto"/>
+            <w:vAlign w:val="center"/>
+            <w:hideMark/>
+          </w:tcPr>
+          <w:p>
+            <w:pPr>
+              <w:rPr>
+                <w:b/>
+                <w:bCs/>
+              </w:rPr>
+            </w:pPr>
+            <w:r>
+              <w:rPr>
+                <w:b/>
+                <w:bCs/>
+              </w:rPr>
+              <w:t>String</w:t>
+            </w:r>
+          </w:p>
+        </w:tc>
+        <w:tc>
+          <w:tcPr>
+            <w:tcW w:w="0" w:type="auto"/>
+            <w:vAlign w:val="center"/>
+            <w:hideMark/>
+          </w:tcPr>
+          <w:p>
+            <w:pPr>
+              <w:rPr>
+                <w:b/>
+                <w:bCs/>
+              </w:rPr>
+            </w:pPr>
+            <w:r>
+              <w:rPr>
+                <w:b/>
+                <w:bCs/>
+              </w:rPr>
+              <w:t>@NotBlank</w:t>
+            </w:r>
+          </w:p>
+        </w:tc>
+      </w:tr>
+    </w:tbl>
+    <w:p>
+      <w:pPr>
+        <w:rPr>
+          <w:b/>
+          <w:bCs/>
+        </w:rPr>
+      </w:pPr>
+      <w:r>
+        <w:rPr>
+          <w:b/>
+          <w:bCs/>
+        </w:rPr>
+        <w:t>Note: Do NOT add @Positive or @Min constraints on market values — negative value rejection is a business rule handled in the service layer, not a Bean Validation constraint. Bean Validation here only handles structural/null checks.</w:t>
+      </w:r>
+    </w:p>
+    <w:p>
+      <w:pPr>
+        <w:rPr>
+          <w:b/>
+          <w:bCs/>
+        </w:rPr>
+      </w:pPr>
+      <w:r>
+        <w:rPr>
+          <w:b/>
+          <w:bCs/>
+        </w:rPr>
+        <w:t xml:space="preserve">In the model/response/ package, create a class </w:t>
+      </w:r>
+      <w:proofErr w:type="spellStart"/>
+      <w:r>
+        <w:rPr>
+          <w:b/>
+          <w:bCs/>
+        </w:rPr>
+        <w:t>DailyReturnResponse</w:t>
+      </w:r>
+      <w:proofErr w:type="spellEnd"/>
+      <w:r>
+        <w:rPr>
+          <w:b/>
+          <w:bCs/>
+        </w:rPr>
+        <w:t xml:space="preserve"> with:</w:t>
+      </w:r>
+    </w:p>
+    <w:p>
+      <w:pPr>
+        <w:numPr>
+          <w:ilvl w:val="0"/>
+          <w:numId w:val="8"/>
+        </w:numPr>
+        <w:rPr>
+          <w:b/>
+          <w:bCs/>
+        </w:rPr>
+      </w:pPr>
+      <w:proofErr w:type="spellStart"/>
+      <w:r>
+        <w:rPr>
+          <w:b/>
+          <w:bCs/>
+        </w:rPr>
+        <w:t>portfolioId</w:t>
+      </w:r>
+      <w:proofErr w:type="spellEnd"/>
+      <w:r>
+        <w:rPr>
+          <w:b/>
+          <w:bCs/>
+        </w:rPr>
+        <w:t xml:space="preserve"> — String</w:t>
+      </w:r>
+    </w:p>
+    <w:p>
+      <w:pPr>
+        <w:numPr>
+          <w:ilvl w:val="0"/>
+          <w:numId w:val="8"/>
+        </w:numPr>
+        <w:rPr>
+          <w:b/>
+          <w:bCs/>
+        </w:rPr>
+      </w:pPr>
+      <w:proofErr w:type="spellStart"/>
+      <w:r>
+        <w:rPr>
+          <w:b/>
+          <w:bCs/>
+        </w:rPr>
+        <w:t>valuationDate</w:t>
+      </w:r>
+      <w:proofErr w:type="spellEnd"/>
+      <w:r>
+        <w:rPr>
+          <w:b/>
+          <w:bCs/>
+        </w:rPr>
+        <w:t xml:space="preserve"> — </w:t>
+      </w:r>
+      <w:proofErr w:type="spellStart"/>
+      <w:r>
+        <w:rPr>
+          <w:b/>
+          <w:bCs/>
+        </w:rPr>
+        <w:t>LocalDate</w:t>
+      </w:r>
+      <w:proofErr w:type="spellEnd"/>
+    </w:p>
+    <w:p>
+      <w:pPr>
+        <w:numPr>
+          <w:ilvl w:val="0"/>
+          <w:numId w:val="8"/>
+        </w:numPr>
+        <w:rPr>
+          <w:b/>
+          <w:bCs/>
+        </w:rPr>
+      </w:pPr>
+      <w:proofErr w:type="spellStart"/>
+      <w:r>
+        <w:rPr>
+          <w:b/>
+          <w:bCs/>
+        </w:rPr>
+        <w:t>portfolioReturnPct</w:t>
+      </w:r>
+      <w:proofErr w:type="spellEnd"/>
+      <w:r>
+        <w:rPr>
+          <w:b/>
+          <w:bCs/>
+        </w:rPr>
+        <w:t xml:space="preserve"> — </w:t>
+      </w:r>
+      <w:proofErr w:type="spellStart"/>
+      <w:r>
+        <w:rPr>
+          <w:b/>
+          <w:bCs/>
+        </w:rPr>
+        <w:t>BigDecimal</w:t>
+      </w:r>
+      <w:proofErr w:type="spellEnd"/>
+      <w:r>
+        <w:rPr>
+          <w:b/>
+          <w:bCs/>
+        </w:rPr>
+        <w:t xml:space="preserve"> (nullable)</w:t>
+      </w:r>
+    </w:p>
+    <w:p>
+      <w:pPr>
+        <w:numPr>
+          <w:ilvl w:val="0"/>
+          <w:numId w:val="8"/>
+        </w:numPr>
+        <w:rPr>
+          <w:b/>
+          <w:bCs/>
+        </w:rPr>
+      </w:pPr>
+      <w:proofErr w:type="spellStart"/>
+      <w:r>
+        <w:rPr>
+          <w:b/>
+          <w:bCs/>
+        </w:rPr>
+        <w:t>benchmarkReturnPct</w:t>
+      </w:r>
+      <w:proofErr w:type="spellEnd"/>
+      <w:r>
+        <w:rPr>
+          <w:b/>
+          <w:bCs/>
+        </w:rPr>
+        <w:t xml:space="preserve"> — </w:t>
+      </w:r>
+      <w:proofErr w:type="spellStart"/>
+      <w:r>
+        <w:rPr>
+          <w:b/>
+          <w:bCs/>
+        </w:rPr>
+        <w:t>BigDecimal</w:t>
+      </w:r>
+      <w:proofErr w:type="spellEnd"/>
+    </w:p>
+    <w:p>
+      <w:pPr>
+        <w:numPr>
+          <w:ilvl w:val="0"/>
+          <w:numId w:val="8"/>
+        </w:numPr>
+        <w:rPr>
+          <w:b/>
+          <w:bCs/>
+        </w:rPr>
+      </w:pPr>
+      <w:proofErr w:type="spellStart"/>
+      <w:r>
+        <w:rPr>
+          <w:b/>
+          <w:bCs/>
+        </w:rPr>
+        <w:t>excessReturnPct</w:t>
+      </w:r>
+      <w:proofErr w:type="spellEnd"/>
+      <w:r>
+        <w:rPr>
+          <w:b/>
+          <w:bCs/>
+        </w:rPr>
+        <w:t xml:space="preserve"> — </w:t>
+      </w:r>
+      <w:proofErr w:type="spellStart"/>
+      <w:r>
+        <w:rPr>
+          <w:b/>
+          <w:bCs/>
+        </w:rPr>
+        <w:t>BigDecimal</w:t>
+      </w:r>
+      <w:proofErr w:type="spellEnd"/>
+      <w:r>
+        <w:rPr>
+          <w:b/>
+          <w:bCs/>
+        </w:rPr>
+        <w:t xml:space="preserve"> (nullable)</w:t>
+      </w:r>
+    </w:p>
+    <w:p>
+      <w:pPr>
+        <w:numPr>
+          <w:ilvl w:val="0"/>
+          <w:numId w:val="8"/>
+        </w:numPr>
+        <w:rPr>
+          <w:b/>
+          <w:bCs/>
+        </w:rPr>
+      </w:pPr>
+      <w:r>
+        <w:rPr>
+          <w:b/>
+          <w:bCs/>
+        </w:rPr>
+        <w:t xml:space="preserve">status — </w:t>
+      </w:r>
+      <w:proofErr w:type="spellStart"/>
+      <w:r>
+        <w:rPr>
+          <w:b/>
+          <w:bCs/>
+        </w:rPr>
+        <w:t>PerformanceStatus</w:t>
+      </w:r>
+      <w:proofErr w:type="spellEnd"/>
+      <w:r>
+        <w:rPr>
+          <w:b/>
+          <w:bCs/>
+        </w:rPr>
+        <w:t xml:space="preserve"> </w:t>
+      </w:r>
+      <w:proofErr w:type="spellStart"/>
+      <w:r>
+        <w:rPr>
+          <w:b/>
+          <w:bCs/>
+        </w:rPr>
+        <w:t>enum</w:t>
+      </w:r>
+      <w:proofErr w:type="spellEnd"/>
+    </w:p>
+    <w:p>
+      <w:pPr>
+        <w:numPr>
+          <w:ilvl w:val="0"/>
+          <w:numId w:val="8"/>
+        </w:numPr>
+        <w:rPr>
+          <w:b/>
+          <w:bCs/>
+        </w:rPr>
+      </w:pPr>
+      <w:r>
+        <w:rPr>
+          <w:b/>
+          <w:bCs/>
+        </w:rPr>
+        <w:t>reasons — List&lt;String&gt; (empty list for VALID, populated for others)</w:t>
+      </w:r>
+    </w:p>
+    <w:p>
+      <w:pPr>
+        <w:numPr>
+          <w:ilvl w:val="0"/>
+          <w:numId w:val="8"/>
+        </w:numPr>
+        <w:rPr>
+          <w:b/>
+          <w:bCs/>
+        </w:rPr>
+      </w:pPr>
+      <w:proofErr w:type="spellStart"/>
+      <w:r>
+        <w:rPr>
+          <w:b/>
+          <w:bCs/>
+        </w:rPr>
+        <w:t>processedAt</w:t>
+      </w:r>
+      <w:proofErr w:type="spellEnd"/>
+      <w:r>
+        <w:rPr>
+          <w:b/>
+          <w:bCs/>
+        </w:rPr>
+        <w:t xml:space="preserve"> — Instant</w:t>
+      </w:r>
+    </w:p>
+    <w:p>
+      <w:pPr>
+        <w:rPr>
+          <w:b/>
+          <w:bCs/>
+        </w:rPr>
+      </w:pPr>
+      <w:r>
+        <w:rPr>
+          <w:b/>
+          <w:bCs/>
+        </w:rPr>
+        <w:t xml:space="preserve">Use Lombok @Data, @Builder, @NoArgsConstructor, @AllArgsConstructor on both classes. Add @JsonFormat on </w:t>
+      </w:r>
+      <w:proofErr w:type="spellStart"/>
+      <w:r>
+        <w:rPr>
+          <w:b/>
+          <w:bCs/>
+        </w:rPr>
+        <w:t>valuationDate</w:t>
+      </w:r>
+      <w:proofErr w:type="spellEnd"/>
+      <w:r>
+        <w:rPr>
+          <w:b/>
+          <w:bCs/>
+        </w:rPr>
+        <w:t xml:space="preserve"> with pattern "</w:t>
+      </w:r>
+      <w:proofErr w:type="spellStart"/>
+      <w:r>
+        <w:rPr>
+          <w:b/>
+          <w:bCs/>
+        </w:rPr>
+        <w:t>yyyy</w:t>
+      </w:r>
+      <w:proofErr w:type="spellEnd"/>
+      <w:r>
+        <w:rPr>
+          <w:b/>
+          <w:bCs/>
+        </w:rPr>
+        <w:t xml:space="preserve">-MM-dd" and on </w:t>
+      </w:r>
+      <w:proofErr w:type="spellStart"/>
+      <w:r>
+        <w:rPr>
+          <w:b/>
+          <w:bCs/>
+        </w:rPr>
+        <w:t>processedAt</w:t>
+      </w:r>
+      <w:proofErr w:type="spellEnd"/>
+      <w:r>
+        <w:rPr>
+          <w:b/>
+          <w:bCs/>
+        </w:rPr>
+        <w:t xml:space="preserve"> for ISO-8601 output.</w:t>
+      </w:r>
+    </w:p>
+    <w:p>
+      <w:pPr>
+        <w:rPr>
+          <w:b/>
+          <w:bCs/>
+        </w:rPr>
+      </w:pPr>
+      <w:r>
+        <w:rPr>
+          <w:b/>
+          <w:bCs/>
+        </w:rPr>
+        <w:t xml:space="preserve">Validation Gate: Write a plain unit test </w:t>
+      </w:r>
+      <w:proofErr w:type="spellStart"/>
+      <w:r>
+        <w:rPr>
+          <w:b/>
+          <w:bCs/>
+        </w:rPr>
+        <w:t>DailyReturnRequestValidationTest</w:t>
+      </w:r>
+      <w:proofErr w:type="spellEnd"/>
+      <w:r>
+        <w:rPr>
+          <w:b/>
+          <w:bCs/>
+        </w:rPr>
+        <w:t xml:space="preserve"> (no Spring context) that:</w:t>
+      </w:r>
+    </w:p>
+    <w:p>
+      <w:pPr>
+        <w:numPr>
+          <w:ilvl w:val="0"/>
+          <w:numId w:val="9"/>
+        </w:numPr>
+        <w:rPr>
+          <w:b/>
+          <w:bCs/>
+        </w:rPr>
+      </w:pPr>
+      <w:r>
+        <w:rPr>
+          <w:b/>
+          <w:bCs/>
+        </w:rPr>
+        <w:t xml:space="preserve">Uses a </w:t>
+      </w:r>
+      <w:proofErr w:type="spellStart"/>
+      <w:proofErr w:type="gramStart"/>
+      <w:r>
+        <w:rPr>
+          <w:b/>
+          <w:bCs/>
+        </w:rPr>
+        <w:t>jakarta.validation</w:t>
+      </w:r>
+      <w:proofErr w:type="gramEnd"/>
+      <w:r>
+        <w:rPr>
+          <w:b/>
+          <w:bCs/>
+        </w:rPr>
+        <w:t>.Validator</w:t>
+      </w:r>
+      <w:proofErr w:type="spellEnd"/>
+      <w:r>
+        <w:rPr>
+          <w:b/>
+          <w:bCs/>
+        </w:rPr>
+        <w:t xml:space="preserve"> obtained via </w:t>
+      </w:r>
+      <w:proofErr w:type="spellStart"/>
+      <w:r>
+        <w:rPr>
+          <w:b/>
+          <w:bCs/>
+        </w:rPr>
+        <w:t>Validation.buildDefaultValidatorFactory</w:t>
+      </w:r>
+      <w:proofErr w:type="spellEnd"/>
+      <w:r>
+        <w:rPr>
+          <w:b/>
+          <w:bCs/>
+        </w:rPr>
+        <w:t>(</w:t>
+      </w:r>
+      <w:proofErr w:type="gramStart"/>
+      <w:r>
+        <w:rPr>
+          <w:b/>
+          <w:bCs/>
+        </w:rPr>
+        <w:t>).</w:t>
+      </w:r>
+      <w:proofErr w:type="spellStart"/>
+      <w:r>
+        <w:rPr>
+          <w:b/>
+          <w:bCs/>
+        </w:rPr>
+        <w:t>getValidator</w:t>
+      </w:r>
+      <w:proofErr w:type="spellEnd"/>
+      <w:proofErr w:type="gramEnd"/>
+      <w:r>
+        <w:rPr>
+          <w:b/>
+          <w:bCs/>
+        </w:rPr>
+        <w:t>()</w:t>
+      </w:r>
+    </w:p>
+    <w:p>
+      <w:pPr>
+        <w:numPr>
+          <w:ilvl w:val="0"/>
+          <w:numId w:val="9"/>
+        </w:numPr>
+        <w:rPr>
+          <w:b/>
+          <w:bCs/>
+        </w:rPr>
+      </w:pPr>
+      <w:r>
+        <w:rPr>
+          <w:b/>
+          <w:bCs/>
+        </w:rPr>
+        <w:lastRenderedPageBreak/>
+        <w:t xml:space="preserve">Creates a valid </w:t>
+      </w:r>
+      <w:proofErr w:type="spellStart"/>
+      <w:r>
+        <w:rPr>
+          <w:b/>
+          <w:bCs/>
+        </w:rPr>
+        <w:t>DailyReturnRequest</w:t>
+      </w:r>
+      <w:proofErr w:type="spellEnd"/>
+      <w:r>
+        <w:rPr>
+          <w:b/>
+          <w:bCs/>
+        </w:rPr>
+        <w:t xml:space="preserve"> with all fields populated and asserts zero constraint violations</w:t>
+      </w:r>
+    </w:p>
+    <w:p>
+      <w:pPr>
+        <w:numPr>
+          <w:ilvl w:val="0"/>
+          <w:numId w:val="9"/>
+        </w:numPr>
+        <w:rPr>
+          <w:b/>
+          <w:bCs/>
+        </w:rPr>
+      </w:pPr>
+      <w:r>
+        <w:rPr>
+          <w:b/>
+          <w:bCs/>
+        </w:rPr>
+        <w:t xml:space="preserve">Creates a request with </w:t>
+      </w:r>
+      <w:proofErr w:type="spellStart"/>
+      <w:r>
+        <w:rPr>
+          <w:b/>
+          <w:bCs/>
+        </w:rPr>
+        <w:t>portfolioId</w:t>
+      </w:r>
+      <w:proofErr w:type="spellEnd"/>
+      <w:r>
+        <w:rPr>
+          <w:b/>
+          <w:bCs/>
+        </w:rPr>
+        <w:t xml:space="preserve"> as blank and asserts exactly 1 violation on the </w:t>
+      </w:r>
+      <w:proofErr w:type="spellStart"/>
+      <w:r>
+        <w:rPr>
+          <w:b/>
+          <w:bCs/>
+        </w:rPr>
+        <w:t>portfolioId</w:t>
+      </w:r>
+      <w:proofErr w:type="spellEnd"/>
+      <w:r>
+        <w:rPr>
+          <w:b/>
+          <w:bCs/>
+        </w:rPr>
+        <w:t xml:space="preserve"> field</w:t>
+      </w:r>
+    </w:p>
+    <w:p>
+      <w:pPr>
+        <w:numPr>
+          <w:ilvl w:val="0"/>
+          <w:numId w:val="9"/>
+        </w:numPr>
+        <w:rPr>
+          <w:b/>
+          <w:bCs/>
+        </w:rPr>
+      </w:pPr>
+      <w:r>
+        <w:rPr>
+          <w:b/>
+          <w:bCs/>
+        </w:rPr>
+        <w:t>Creates a request with currency as null and asserts exactly 1 violation on the currency field</w:t>
+      </w:r>
+    </w:p>
+    <w:p>
+      <w:pPr>
+        <w:numPr>
+          <w:ilvl w:val="0"/>
+          <w:numId w:val="9"/>
+        </w:numPr>
+        <w:rPr>
+          <w:b/>
+          <w:bCs/>
+        </w:rPr>
+      </w:pPr>
+      <w:r>
+        <w:rPr>
+          <w:b/>
+          <w:bCs/>
+        </w:rPr>
+        <w:t xml:space="preserve">Creates a request with </w:t>
+      </w:r>
+      <w:proofErr w:type="spellStart"/>
+      <w:r>
+        <w:rPr>
+          <w:b/>
+          <w:bCs/>
+        </w:rPr>
+        <w:t>valuationDate</w:t>
+      </w:r>
+      <w:proofErr w:type="spellEnd"/>
+      <w:r>
+        <w:rPr>
+          <w:b/>
+          <w:bCs/>
+        </w:rPr>
+        <w:t xml:space="preserve"> as null and asserts exactly 1 violation on the </w:t>
+      </w:r>
+      <w:proofErr w:type="spellStart"/>
+      <w:r>
+        <w:rPr>
+          <w:b/>
+          <w:bCs/>
+        </w:rPr>
+        <w:t>valuationDate</w:t>
+      </w:r>
+      <w:proofErr w:type="spellEnd"/>
+      <w:r>
+        <w:rPr>
+          <w:b/>
+          <w:bCs/>
+        </w:rPr>
+        <w:t xml:space="preserve"> field</w:t>
+      </w:r>
+    </w:p>
+    <w:p>
+      <w:pPr>
+        <w:rPr>
+          <w:b/>
+          <w:bCs/>
+        </w:rPr>
+      </w:pPr>
+      <w:r>
+        <w:rPr>
+          <w:b/>
+          <w:bCs/>
+        </w:rPr>
+        <w:t xml:space="preserve">Run </w:t>
+      </w:r>
+      <w:proofErr w:type="spellStart"/>
+      <w:r>
+        <w:rPr>
+          <w:b/>
+          <w:bCs/>
+        </w:rPr>
+        <w:t>mvn</w:t>
+      </w:r>
+      <w:proofErr w:type="spellEnd"/>
+      <w:r>
+        <w:rPr>
+          <w:b/>
+          <w:bCs/>
+        </w:rPr>
+        <w:t xml:space="preserve"> test. All validation assertions must pass before proceeding.</w:t>
+      </w:r>
+    </w:p>
+    <w:p>
+      <w:pPr>
+        <w:rPr>
+          <w:b/>
+          <w:bCs/>
+        </w:rPr>
+      </w:pPr>
+      <w:r>
+        <w:rPr>
+          <w:b/>
+          <w:bCs/>
+        </w:rPr>
+        <w:pict w14:anchorId="590468C4">
+          <v:rect id="_x0000_i1040" style="width:0;height:1.5pt" o:hralign="center" o:hrstd="t" o:hr="t" fillcolor="#a0a0a0" stroked="f"/>
         </w:pict>
       </w:r>
     </w:p>
@@ -3029,6 +4486,155 @@
     </w:lvl>
   </w:abstractNum>
   <w:abstractNum w:abstractNumId="5" w15:restartNumberingAfterBreak="0">
+    <w:nsid w:val="57C039E6"/>
+    <w:multiLevelType w:val="multilevel"/>
+    <w:tmpl w:val="B83A3582"/>
+    <w:lvl w:ilvl="0">
+      <w:start w:val="1"/>
+      <w:numFmt w:val="bullet"/>
+      <w:lvlText w:val=""/>
+      <w:lvlJc w:val="left"/>
+      <w:pPr>
+        <w:tabs>
+          <w:tab w:val="num" w:pos="720"/>
+        </w:tabs>
+        <w:ind w:left="720" w:hanging="360"/>
+      </w:pPr>
+      <w:rPr>
+        <w:rFonts w:ascii="Symbol" w:hAnsi="Symbol" w:hint="default"/>
+        <w:sz w:val="20"/>
+      </w:rPr>
+    </w:lvl>
+    <w:lvl w:ilvl="1" w:tentative="1">
+      <w:start w:val="1"/>
+      <w:numFmt w:val="bullet"/>
+      <w:lvlText w:val="o"/>
+      <w:lvlJc w:val="left"/>
+      <w:pPr>
+        <w:tabs>
+          <w:tab w:val="num" w:pos="1440"/>
+        </w:tabs>
+        <w:ind w:left="1440" w:hanging="360"/>
+      </w:pPr>
+      <w:rPr>
+        <w:rFonts w:ascii="Courier New" w:hAnsi="Courier New" w:hint="default"/>
+        <w:sz w:val="20"/>
+      </w:rPr>
+    </w:lvl>
+    <w:lvl w:ilvl="2" w:tentative="1">
+      <w:start w:val="1"/>
+      <w:numFmt w:val="bullet"/>
+      <w:lvlText w:val=""/>
+      <w:lvlJc w:val="left"/>
+      <w:pPr>
+        <w:tabs>
+          <w:tab w:val="num" w:pos="2160"/>
+        </w:tabs>
+        <w:ind w:left="2160" w:hanging="360"/>
+      </w:pPr>
+      <w:rPr>
+        <w:rFonts w:ascii="Wingdings" w:hAnsi="Wingdings" w:hint="default"/>
+        <w:sz w:val="20"/>
+      </w:rPr>
+    </w:lvl>
+    <w:lvl w:ilvl="3" w:tentative="1">
+      <w:start w:val="1"/>
+      <w:numFmt w:val="bullet"/>
+      <w:lvlText w:val=""/>
+      <w:lvlJc w:val="left"/>
+      <w:pPr>
+        <w:tabs>
+          <w:tab w:val="num" w:pos="2880"/>
+        </w:tabs>
+        <w:ind w:left="2880" w:hanging="360"/>
+      </w:pPr>
+      <w:rPr>
+        <w:rFonts w:ascii="Wingdings" w:hAnsi="Wingdings" w:hint="default"/>
+        <w:sz w:val="20"/>
+      </w:rPr>
+    </w:lvl>
+    <w:lvl w:ilvl="4" w:tentative="1">
+      <w:start w:val="1"/>
+      <w:numFmt w:val="bullet"/>
+      <w:lvlText w:val=""/>
+      <w:lvlJc w:val="left"/>
+      <w:pPr>
+        <w:tabs>
+          <w:tab w:val="num" w:pos="3600"/>
+        </w:tabs>
+        <w:ind w:left="3600" w:hanging="360"/>
+      </w:pPr>
+      <w:rPr>
+        <w:rFonts w:ascii="Wingdings" w:hAnsi="Wingdings" w:hint="default"/>
+        <w:sz w:val="20"/>
+      </w:rPr>
+    </w:lvl>
+    <w:lvl w:ilvl="5" w:tentative="1">
+      <w:start w:val="1"/>
+      <w:numFmt w:val="bullet"/>
+      <w:lvlText w:val=""/>
+      <w:lvlJc w:val="left"/>
+      <w:pPr>
+        <w:tabs>
+          <w:tab w:val="num" w:pos="4320"/>
+        </w:tabs>
+        <w:ind w:left="4320" w:hanging="360"/>
+      </w:pPr>
+      <w:rPr>
+        <w:rFonts w:ascii="Wingdings" w:hAnsi="Wingdings" w:hint="default"/>
+        <w:sz w:val="20"/>
+      </w:rPr>
+    </w:lvl>
+    <w:lvl w:ilvl="6" w:tentative="1">
+      <w:start w:val="1"/>
+      <w:numFmt w:val="bullet"/>
+      <w:lvlText w:val=""/>
+      <w:lvlJc w:val="left"/>
+      <w:pPr>
+        <w:tabs>
+          <w:tab w:val="num" w:pos="5040"/>
+        </w:tabs>
+        <w:ind w:left="5040" w:hanging="360"/>
+      </w:pPr>
+      <w:rPr>
+        <w:rFonts w:ascii="Wingdings" w:hAnsi="Wingdings" w:hint="default"/>
+        <w:sz w:val="20"/>
+      </w:rPr>
+    </w:lvl>
+    <w:lvl w:ilvl="7" w:tentative="1">
+      <w:start w:val="1"/>
+      <w:numFmt w:val="bullet"/>
+      <w:lvlText w:val=""/>
+      <w:lvlJc w:val="left"/>
+      <w:pPr>
+        <w:tabs>
+          <w:tab w:val="num" w:pos="5760"/>
+        </w:tabs>
+        <w:ind w:left="5760" w:hanging="360"/>
+      </w:pPr>
+      <w:rPr>
+        <w:rFonts w:ascii="Wingdings" w:hAnsi="Wingdings" w:hint="default"/>
+        <w:sz w:val="20"/>
+      </w:rPr>
+    </w:lvl>
+    <w:lvl w:ilvl="8" w:tentative="1">
+      <w:start w:val="1"/>
+      <w:numFmt w:val="bullet"/>
+      <w:lvlText w:val=""/>
+      <w:lvlJc w:val="left"/>
+      <w:pPr>
+        <w:tabs>
+          <w:tab w:val="num" w:pos="6480"/>
+        </w:tabs>
+        <w:ind w:left="6480" w:hanging="360"/>
+      </w:pPr>
+      <w:rPr>
+        <w:rFonts w:ascii="Wingdings" w:hAnsi="Wingdings" w:hint="default"/>
+        <w:sz w:val="20"/>
+      </w:rPr>
+    </w:lvl>
+  </w:abstractNum>
+  <w:abstractNum w:abstractNumId="6" w15:restartNumberingAfterBreak="0">
     <w:nsid w:val="6038058D"/>
     <w:multiLevelType w:val="multilevel"/>
     <w:tmpl w:val="4DCC0926"/>
@@ -3177,7 +4783,156 @@
       </w:rPr>
     </w:lvl>
   </w:abstractNum>
-  <w:abstractNum w:abstractNumId="6" w15:restartNumberingAfterBreak="0">
+  <w:abstractNum w:abstractNumId="7" w15:restartNumberingAfterBreak="0">
+    <w:nsid w:val="74F53D88"/>
+    <w:multiLevelType w:val="multilevel"/>
+    <w:tmpl w:val="BB2E5C4E"/>
+    <w:lvl w:ilvl="0">
+      <w:start w:val="1"/>
+      <w:numFmt w:val="bullet"/>
+      <w:lvlText w:val=""/>
+      <w:lvlJc w:val="left"/>
+      <w:pPr>
+        <w:tabs>
+          <w:tab w:val="num" w:pos="720"/>
+        </w:tabs>
+        <w:ind w:left="720" w:hanging="360"/>
+      </w:pPr>
+      <w:rPr>
+        <w:rFonts w:ascii="Symbol" w:hAnsi="Symbol" w:hint="default"/>
+        <w:sz w:val="20"/>
+      </w:rPr>
+    </w:lvl>
+    <w:lvl w:ilvl="1" w:tentative="1">
+      <w:start w:val="1"/>
+      <w:numFmt w:val="bullet"/>
+      <w:lvlText w:val="o"/>
+      <w:lvlJc w:val="left"/>
+      <w:pPr>
+        <w:tabs>
+          <w:tab w:val="num" w:pos="1440"/>
+        </w:tabs>
+        <w:ind w:left="1440" w:hanging="360"/>
+      </w:pPr>
+      <w:rPr>
+        <w:rFonts w:ascii="Courier New" w:hAnsi="Courier New" w:hint="default"/>
+        <w:sz w:val="20"/>
+      </w:rPr>
+    </w:lvl>
+    <w:lvl w:ilvl="2" w:tentative="1">
+      <w:start w:val="1"/>
+      <w:numFmt w:val="bullet"/>
+      <w:lvlText w:val=""/>
+      <w:lvlJc w:val="left"/>
+      <w:pPr>
+        <w:tabs>
+          <w:tab w:val="num" w:pos="2160"/>
+        </w:tabs>
+        <w:ind w:left="2160" w:hanging="360"/>
+      </w:pPr>
+      <w:rPr>
+        <w:rFonts w:ascii="Wingdings" w:hAnsi="Wingdings" w:hint="default"/>
+        <w:sz w:val="20"/>
+      </w:rPr>
+    </w:lvl>
+    <w:lvl w:ilvl="3" w:tentative="1">
+      <w:start w:val="1"/>
+      <w:numFmt w:val="bullet"/>
+      <w:lvlText w:val=""/>
+      <w:lvlJc w:val="left"/>
+      <w:pPr>
+        <w:tabs>
+          <w:tab w:val="num" w:pos="2880"/>
+        </w:tabs>
+        <w:ind w:left="2880" w:hanging="360"/>
+      </w:pPr>
+      <w:rPr>
+        <w:rFonts w:ascii="Wingdings" w:hAnsi="Wingdings" w:hint="default"/>
+        <w:sz w:val="20"/>
+      </w:rPr>
+    </w:lvl>
+    <w:lvl w:ilvl="4" w:tentative="1">
+      <w:start w:val="1"/>
+      <w:numFmt w:val="bullet"/>
+      <w:lvlText w:val=""/>
+      <w:lvlJc w:val="left"/>
+      <w:pPr>
+        <w:tabs>
+          <w:tab w:val="num" w:pos="3600"/>
+        </w:tabs>
+        <w:ind w:left="3600" w:hanging="360"/>
+      </w:pPr>
+      <w:rPr>
+        <w:rFonts w:ascii="Wingdings" w:hAnsi="Wingdings" w:hint="default"/>
+        <w:sz w:val="20"/>
+      </w:rPr>
+    </w:lvl>
+    <w:lvl w:ilvl="5" w:tentative="1">
+      <w:start w:val="1"/>
+      <w:numFmt w:val="bullet"/>
+      <w:lvlText w:val=""/>
+      <w:lvlJc w:val="left"/>
+      <w:pPr>
+        <w:tabs>
+          <w:tab w:val="num" w:pos="4320"/>
+        </w:tabs>
+        <w:ind w:left="4320" w:hanging="360"/>
+      </w:pPr>
+      <w:rPr>
+        <w:rFonts w:ascii="Wingdings" w:hAnsi="Wingdings" w:hint="default"/>
+        <w:sz w:val="20"/>
+      </w:rPr>
+    </w:lvl>
+    <w:lvl w:ilvl="6" w:tentative="1">
+      <w:start w:val="1"/>
+      <w:numFmt w:val="bullet"/>
+      <w:lvlText w:val=""/>
+      <w:lvlJc w:val="left"/>
+      <w:pPr>
+        <w:tabs>
+          <w:tab w:val="num" w:pos="5040"/>
+        </w:tabs>
+        <w:ind w:left="5040" w:hanging="360"/>
+      </w:pPr>
+      <w:rPr>
+        <w:rFonts w:ascii="Wingdings" w:hAnsi="Wingdings" w:hint="default"/>
+        <w:sz w:val="20"/>
+      </w:rPr>
+    </w:lvl>
+    <w:lvl w:ilvl="7" w:tentative="1">
+      <w:start w:val="1"/>
+      <w:numFmt w:val="bullet"/>
+      <w:lvlText w:val=""/>
+      <w:lvlJc w:val="left"/>
+      <w:pPr>
+        <w:tabs>
+          <w:tab w:val="num" w:pos="5760"/>
+        </w:tabs>
+        <w:ind w:left="5760" w:hanging="360"/>
+      </w:pPr>
+      <w:rPr>
+        <w:rFonts w:ascii="Wingdings" w:hAnsi="Wingdings" w:hint="default"/>
+        <w:sz w:val="20"/>
+      </w:rPr>
+    </w:lvl>
+    <w:lvl w:ilvl="8" w:tentative="1">
+      <w:start w:val="1"/>
+      <w:numFmt w:val="bullet"/>
+      <w:lvlText w:val=""/>
+      <w:lvlJc w:val="left"/>
+      <w:pPr>
+        <w:tabs>
+          <w:tab w:val="num" w:pos="6480"/>
+        </w:tabs>
+        <w:ind w:left="6480" w:hanging="360"/>
+      </w:pPr>
+      <w:rPr>
+        <w:rFonts w:ascii="Wingdings" w:hAnsi="Wingdings" w:hint="default"/>
+        <w:sz w:val="20"/>
+      </w:rPr>
+    </w:lvl>
+  </w:abstractNum>
+  <w:abstractNum w:abstractNumId="8" w15:restartNumberingAfterBreak="0">
     <w:nsid w:val="7B1E12D3"/>
     <w:multiLevelType w:val="multilevel"/>
     <w:tmpl w:val="CEC4AD36"/>
@@ -3339,13 +5094,19 @@
     <w:abstractNumId w:val="3"/>
   </w:num>
   <w:num w:numId="5" w16cid:durableId="896864988">
-    <w:abstractNumId w:val="6"/>
+    <w:abstractNumId w:val="8"/>
   </w:num>
   <w:num w:numId="6" w16cid:durableId="1412656734">
     <w:abstractNumId w:val="0"/>
   </w:num>
   <w:num w:numId="7" w16cid:durableId="434860212">
+    <w:abstractNumId w:val="6"/>
+  </w:num>
+  <w:num w:numId="8" w16cid:durableId="593440189">
     <w:abstractNumId w:val="5"/>
+  </w:num>
+  <w:num w:numId="9" w16cid:durableId="1305701990">
+    <w:abstractNumId w:val="7"/>
   </w:num>
 </w:numbering>
 </file>

</xml_diff>

<commit_message>
Add rest controller and it's testing evidences
</commit_message>
<xml_diff>
--- a/Prompts.docx
+++ b/Prompts.docx
@@ -9,6 +9,13 @@
           <w:bCs/>
         </w:rPr>
       </w:pPr>
+      <w:r>
+        <w:rPr>
+          <w:b/>
+          <w:bCs/>
+        </w:rPr>
+        <w:tab/>
+      </w:r>
     </w:p>
     <w:p>
       <w:pPr>
@@ -60,23 +67,7 @@
           <w:b/>
           <w:bCs/>
         </w:rPr>
-        <w:t xml:space="preserve">Prompt: Using Spring </w:t>
-      </w:r>
-      <w:proofErr w:type="spellStart"/>
-      <w:r>
-        <w:rPr>
-          <w:b/>
-          <w:bCs/>
-        </w:rPr>
-        <w:t>Initializr</w:t>
-      </w:r>
-      <w:proofErr w:type="spellEnd"/>
-      <w:r>
-        <w:rPr>
-          <w:b/>
-          <w:bCs/>
-        </w:rPr>
-        <w:t xml:space="preserve"> (start.spring.io) or your IDE, create a new Maven project with the following specifications:</w:t>
+        <w:t>Prompt: Using Spring Initializr (start.spring.io) or your IDE, create a new Maven project with the following specifications:</w:t>
       </w:r>
     </w:p>
     <w:p>
@@ -95,19 +86,8 @@
           <w:b/>
           <w:bCs/>
         </w:rPr>
-        <w:t xml:space="preserve">Group: </w:t>
-      </w:r>
-      <w:proofErr w:type="spellStart"/>
-      <w:proofErr w:type="gramStart"/>
-      <w:r>
-        <w:rPr>
-          <w:b/>
-          <w:bCs/>
-        </w:rPr>
-        <w:t>com.portfolio</w:t>
-      </w:r>
-      <w:proofErr w:type="spellEnd"/>
-      <w:proofErr w:type="gramEnd"/>
+        <w:t>Group: com.portfolio</w:t>
+      </w:r>
     </w:p>
     <w:p>
       <w:pPr>
@@ -202,56 +182,22 @@
           <w:b/>
           <w:bCs/>
         </w:rPr>
-        <w:t>Dependencies to add: Spring Web, Spring Data JPA, H2 Database, Spring Boot Validation (</w:t>
-      </w:r>
-      <w:proofErr w:type="spellStart"/>
-      <w:proofErr w:type="gramStart"/>
-      <w:r>
-        <w:rPr>
-          <w:b/>
-          <w:bCs/>
-        </w:rPr>
-        <w:t>jakarta.validation</w:t>
-      </w:r>
-      <w:proofErr w:type="spellEnd"/>
-      <w:proofErr w:type="gramEnd"/>
-      <w:r>
-        <w:rPr>
-          <w:b/>
-          <w:bCs/>
-        </w:rPr>
-        <w:t>), Spring Boot Test, Lombok</w:t>
-      </w:r>
-    </w:p>
-    <w:p>
-      <w:pPr>
-        <w:rPr>
-          <w:b/>
-          <w:bCs/>
-        </w:rPr>
-      </w:pPr>
-      <w:r>
-        <w:rPr>
-          <w:b/>
-          <w:bCs/>
-        </w:rPr>
-        <w:t xml:space="preserve">Once generated, establish the following package structure under </w:t>
-      </w:r>
-      <w:proofErr w:type="spellStart"/>
-      <w:r>
-        <w:rPr>
-          <w:b/>
-          <w:bCs/>
-        </w:rPr>
-        <w:t>src</w:t>
-      </w:r>
-      <w:proofErr w:type="spellEnd"/>
-      <w:r>
-        <w:rPr>
-          <w:b/>
-          <w:bCs/>
-        </w:rPr>
-        <w:t>/main/java/com/portfolio/performance/:</w:t>
+        <w:t>Dependencies to add: Spring Web, Spring Data JPA, H2 Database, Spring Boot Validation (jakarta.validation), Spring Boot Test, Lombok</w:t>
+      </w:r>
+    </w:p>
+    <w:p>
+      <w:pPr>
+        <w:rPr>
+          <w:b/>
+          <w:bCs/>
+        </w:rPr>
+      </w:pPr>
+      <w:r>
+        <w:rPr>
+          <w:b/>
+          <w:bCs/>
+        </w:rPr>
+        <w:t>Once generated, establish the following package structure under src/main/java/com/portfolio/performance/:</w:t>
       </w:r>
     </w:p>
     <w:p>
@@ -356,23 +302,7 @@
           <w:b/>
           <w:bCs/>
         </w:rPr>
-        <w:t>model/</w:t>
-      </w:r>
-      <w:proofErr w:type="spellStart"/>
-      <w:r>
-        <w:rPr>
-          <w:b/>
-          <w:bCs/>
-        </w:rPr>
-        <w:t>enums</w:t>
-      </w:r>
-      <w:proofErr w:type="spellEnd"/>
-      <w:r>
-        <w:rPr>
-          <w:b/>
-          <w:bCs/>
-        </w:rPr>
-        <w:t>/</w:t>
+        <w:t>model/enums/</w:t>
       </w:r>
     </w:p>
     <w:p>
@@ -417,72 +347,22 @@
           <w:b/>
           <w:bCs/>
         </w:rPr>
-        <w:t xml:space="preserve">Also create </w:t>
-      </w:r>
-      <w:proofErr w:type="spellStart"/>
-      <w:r>
-        <w:rPr>
-          <w:b/>
-          <w:bCs/>
-        </w:rPr>
-        <w:t>src</w:t>
-      </w:r>
-      <w:proofErr w:type="spellEnd"/>
-      <w:r>
-        <w:rPr>
-          <w:b/>
-          <w:bCs/>
-        </w:rPr>
-        <w:t>/test/java/com/portfolio/performance/ mirroring the same structure.</w:t>
-      </w:r>
-    </w:p>
-    <w:p>
-      <w:pPr>
-        <w:rPr>
-          <w:b/>
-          <w:bCs/>
-        </w:rPr>
-      </w:pPr>
-      <w:r>
-        <w:rPr>
-          <w:b/>
-          <w:bCs/>
-        </w:rPr>
-        <w:t xml:space="preserve">In </w:t>
-      </w:r>
-      <w:proofErr w:type="spellStart"/>
-      <w:r>
-        <w:rPr>
-          <w:b/>
-          <w:bCs/>
-        </w:rPr>
-        <w:t>src</w:t>
-      </w:r>
-      <w:proofErr w:type="spellEnd"/>
-      <w:r>
-        <w:rPr>
-          <w:b/>
-          <w:bCs/>
-        </w:rPr>
-        <w:t xml:space="preserve">/main/resources/, set up </w:t>
-      </w:r>
-      <w:proofErr w:type="spellStart"/>
-      <w:proofErr w:type="gramStart"/>
-      <w:r>
-        <w:rPr>
-          <w:b/>
-          <w:bCs/>
-        </w:rPr>
-        <w:t>application.properties</w:t>
-      </w:r>
-      <w:proofErr w:type="spellEnd"/>
-      <w:proofErr w:type="gramEnd"/>
-      <w:r>
-        <w:rPr>
-          <w:b/>
-          <w:bCs/>
-        </w:rPr>
-        <w:t xml:space="preserve"> with:</w:t>
+        <w:t>Also create src/test/java/com/portfolio/performance/ mirroring the same structure.</w:t>
+      </w:r>
+    </w:p>
+    <w:p>
+      <w:pPr>
+        <w:rPr>
+          <w:b/>
+          <w:bCs/>
+        </w:rPr>
+      </w:pPr>
+      <w:r>
+        <w:rPr>
+          <w:b/>
+          <w:bCs/>
+        </w:rPr>
+        <w:t>In src/main/resources/, set up application.properties with:</w:t>
       </w:r>
     </w:p>
     <w:p>
@@ -501,23 +381,7 @@
           <w:b/>
           <w:bCs/>
         </w:rPr>
-        <w:t xml:space="preserve">H2 in-memory </w:t>
-      </w:r>
-      <w:proofErr w:type="spellStart"/>
-      <w:r>
-        <w:rPr>
-          <w:b/>
-          <w:bCs/>
-        </w:rPr>
-        <w:t>datasource</w:t>
-      </w:r>
-      <w:proofErr w:type="spellEnd"/>
-      <w:r>
-        <w:rPr>
-          <w:b/>
-          <w:bCs/>
-        </w:rPr>
-        <w:t xml:space="preserve"> URL, driver, username, password</w:t>
+        <w:t>H2 in-memory datasource URL, driver, username, password</w:t>
       </w:r>
     </w:p>
     <w:p>
@@ -628,64 +492,7 @@
           <w:bCs/>
         </w:rPr>
         <w:lastRenderedPageBreak/>
-        <w:t xml:space="preserve">Validation Gate: Run </w:t>
-      </w:r>
-      <w:proofErr w:type="spellStart"/>
-      <w:r>
-        <w:rPr>
-          <w:b/>
-          <w:bCs/>
-        </w:rPr>
-        <w:t>mvn</w:t>
-      </w:r>
-      <w:proofErr w:type="spellEnd"/>
-      <w:r>
-        <w:rPr>
-          <w:b/>
-          <w:bCs/>
-        </w:rPr>
-        <w:t xml:space="preserve"> </w:t>
-      </w:r>
-      <w:proofErr w:type="spellStart"/>
-      <w:r>
-        <w:rPr>
-          <w:b/>
-          <w:bCs/>
-        </w:rPr>
-        <w:t>spring-</w:t>
-      </w:r>
-      <w:proofErr w:type="gramStart"/>
-      <w:r>
-        <w:rPr>
-          <w:b/>
-          <w:bCs/>
-        </w:rPr>
-        <w:t>boot:run</w:t>
-      </w:r>
-      <w:proofErr w:type="spellEnd"/>
-      <w:proofErr w:type="gramEnd"/>
-      <w:r>
-        <w:rPr>
-          <w:b/>
-          <w:bCs/>
-        </w:rPr>
-        <w:t xml:space="preserve">. The application must start successfully on port 8080 with no errors. Visit http://localhost:8080/h2-console in a browser and confirm the H2 console loads. Run </w:t>
-      </w:r>
-      <w:proofErr w:type="spellStart"/>
-      <w:r>
-        <w:rPr>
-          <w:b/>
-          <w:bCs/>
-        </w:rPr>
-        <w:t>mvn</w:t>
-      </w:r>
-      <w:proofErr w:type="spellEnd"/>
-      <w:r>
-        <w:rPr>
-          <w:b/>
-          <w:bCs/>
-        </w:rPr>
-        <w:t xml:space="preserve"> test — the default context load test generated by Spring Initializ</w:t>
+        <w:t>Validation Gate: Run mvn spring-boot:run. The application must start successfully on port 8080 with no errors. Visit http://localhost:8080/h2-console in a browser and confirm the H2 console loads. Run mvn test — the default context load test generated by Spring Initializ</w:t>
       </w:r>
       <w:r>
         <w:rPr>
@@ -804,39 +611,7 @@
           <w:b/>
           <w:bCs/>
         </w:rPr>
-        <w:t>Prompt: Inside the model/</w:t>
-      </w:r>
-      <w:proofErr w:type="spellStart"/>
-      <w:r>
-        <w:rPr>
-          <w:b/>
-          <w:bCs/>
-        </w:rPr>
-        <w:t>enums</w:t>
-      </w:r>
-      <w:proofErr w:type="spellEnd"/>
-      <w:r>
-        <w:rPr>
-          <w:b/>
-          <w:bCs/>
-        </w:rPr>
-        <w:t xml:space="preserve">/ package, create the following two </w:t>
-      </w:r>
-      <w:proofErr w:type="spellStart"/>
-      <w:r>
-        <w:rPr>
-          <w:b/>
-          <w:bCs/>
-        </w:rPr>
-        <w:t>enums</w:t>
-      </w:r>
-      <w:proofErr w:type="spellEnd"/>
-      <w:r>
-        <w:rPr>
-          <w:b/>
-          <w:bCs/>
-        </w:rPr>
-        <w:t>:</w:t>
+        <w:t>Prompt: Inside the model/enums/ package, create the following two enums:</w:t>
       </w:r>
     </w:p>
     <w:p>
@@ -850,21 +625,12 @@
           <w:bCs/>
         </w:rPr>
       </w:pPr>
-      <w:proofErr w:type="spellStart"/>
-      <w:r>
-        <w:rPr>
-          <w:b/>
-          <w:bCs/>
-        </w:rPr>
-        <w:t>PerformanceStatus</w:t>
-      </w:r>
-      <w:proofErr w:type="spellEnd"/>
-      <w:r>
-        <w:rPr>
-          <w:b/>
-          <w:bCs/>
-        </w:rPr>
-        <w:t xml:space="preserve"> — with three values: VALID, REVIEW_REQUIRED, INVALID_INPUT</w:t>
+      <w:r>
+        <w:rPr>
+          <w:b/>
+          <w:bCs/>
+        </w:rPr>
+        <w:t>PerformanceStatus — with three values: VALID, REVIEW_REQUIRED, INVALID_INPUT</w:t>
       </w:r>
     </w:p>
     <w:p>
@@ -898,70 +664,22 @@
           <w:b/>
           <w:bCs/>
         </w:rPr>
-        <w:t xml:space="preserve">No logic yet — these are pure </w:t>
-      </w:r>
-      <w:proofErr w:type="spellStart"/>
-      <w:r>
-        <w:rPr>
-          <w:b/>
-          <w:bCs/>
-        </w:rPr>
-        <w:t>enum</w:t>
-      </w:r>
-      <w:proofErr w:type="spellEnd"/>
-      <w:r>
-        <w:rPr>
-          <w:b/>
-          <w:bCs/>
-        </w:rPr>
-        <w:t xml:space="preserve"> types. Ensure they are in the correct package so they can be imported across all layers.</w:t>
-      </w:r>
-    </w:p>
-    <w:p>
-      <w:pPr>
-        <w:rPr>
-          <w:b/>
-          <w:bCs/>
-        </w:rPr>
-      </w:pPr>
-      <w:r>
-        <w:rPr>
-          <w:b/>
-          <w:bCs/>
-        </w:rPr>
-        <w:t xml:space="preserve">Validation Gate: Write a single, simple JUnit </w:t>
-      </w:r>
-      <w:proofErr w:type="gramStart"/>
-      <w:r>
-        <w:rPr>
-          <w:b/>
-          <w:bCs/>
-        </w:rPr>
-        <w:t>5 unit</w:t>
-      </w:r>
-      <w:proofErr w:type="gramEnd"/>
-      <w:r>
-        <w:rPr>
-          <w:b/>
-          <w:bCs/>
-        </w:rPr>
-        <w:t xml:space="preserve"> test class </w:t>
-      </w:r>
-      <w:proofErr w:type="spellStart"/>
-      <w:r>
-        <w:rPr>
-          <w:b/>
-          <w:bCs/>
-        </w:rPr>
-        <w:t>PerformanceStatusTest</w:t>
-      </w:r>
-      <w:proofErr w:type="spellEnd"/>
-      <w:r>
-        <w:rPr>
-          <w:b/>
-          <w:bCs/>
-        </w:rPr>
-        <w:t xml:space="preserve"> in the test directory that:</w:t>
+        <w:t>No logic yet — these are pure enum types. Ensure they are in the correct package so they can be imported across all layers.</w:t>
+      </w:r>
+    </w:p>
+    <w:p>
+      <w:pPr>
+        <w:rPr>
+          <w:b/>
+          <w:bCs/>
+        </w:rPr>
+      </w:pPr>
+      <w:r>
+        <w:rPr>
+          <w:b/>
+          <w:bCs/>
+        </w:rPr>
+        <w:t>Validation Gate: Write a single, simple JUnit 5 unit test class PerformanceStatusTest in the test directory that:</w:t>
       </w:r>
     </w:p>
     <w:p>
@@ -980,23 +698,7 @@
           <w:b/>
           <w:bCs/>
         </w:rPr>
-        <w:t xml:space="preserve">Asserts </w:t>
-      </w:r>
-      <w:proofErr w:type="spellStart"/>
-      <w:r>
-        <w:rPr>
-          <w:b/>
-          <w:bCs/>
-        </w:rPr>
-        <w:t>PerformanceStatus.values</w:t>
-      </w:r>
-      <w:proofErr w:type="spellEnd"/>
-      <w:r>
-        <w:rPr>
-          <w:b/>
-          <w:bCs/>
-        </w:rPr>
-        <w:t>() contains exactly 3 entries</w:t>
+        <w:t>Asserts PerformanceStatus.values() contains exactly 3 entries</w:t>
       </w:r>
     </w:p>
     <w:p>
@@ -1015,23 +717,7 @@
           <w:b/>
           <w:bCs/>
         </w:rPr>
-        <w:t xml:space="preserve">Asserts </w:t>
-      </w:r>
-      <w:proofErr w:type="spellStart"/>
-      <w:r>
-        <w:rPr>
-          <w:b/>
-          <w:bCs/>
-        </w:rPr>
-        <w:t>PerformanceStatus.valueOf</w:t>
-      </w:r>
-      <w:proofErr w:type="spellEnd"/>
-      <w:r>
-        <w:rPr>
-          <w:b/>
-          <w:bCs/>
-        </w:rPr>
-        <w:t>("VALID") does not throw</w:t>
+        <w:t>Asserts PerformanceStatus.valueOf("VALID") does not throw</w:t>
       </w:r>
     </w:p>
     <w:p>
@@ -1050,23 +736,7 @@
           <w:b/>
           <w:bCs/>
         </w:rPr>
-        <w:t xml:space="preserve">Asserts </w:t>
-      </w:r>
-      <w:proofErr w:type="spellStart"/>
-      <w:r>
-        <w:rPr>
-          <w:b/>
-          <w:bCs/>
-        </w:rPr>
-        <w:t>PerformanceStatus.valueOf</w:t>
-      </w:r>
-      <w:proofErr w:type="spellEnd"/>
-      <w:r>
-        <w:rPr>
-          <w:b/>
-          <w:bCs/>
-        </w:rPr>
-        <w:t>("REVIEW_REQUIRED") does not throw</w:t>
+        <w:t>Asserts PerformanceStatus.valueOf("REVIEW_REQUIRED") does not throw</w:t>
       </w:r>
     </w:p>
     <w:p>
@@ -1085,54 +755,22 @@
           <w:b/>
           <w:bCs/>
         </w:rPr>
-        <w:t xml:space="preserve">Asserts </w:t>
-      </w:r>
-      <w:proofErr w:type="spellStart"/>
-      <w:r>
-        <w:rPr>
-          <w:b/>
-          <w:bCs/>
-        </w:rPr>
-        <w:t>PerformanceStatus.valueOf</w:t>
-      </w:r>
-      <w:proofErr w:type="spellEnd"/>
-      <w:r>
-        <w:rPr>
-          <w:b/>
-          <w:bCs/>
-        </w:rPr>
-        <w:t>("INVALID_INPUT") does not throw</w:t>
-      </w:r>
-    </w:p>
-    <w:p>
-      <w:pPr>
-        <w:rPr>
-          <w:b/>
-          <w:bCs/>
-        </w:rPr>
-      </w:pPr>
-      <w:r>
-        <w:rPr>
-          <w:b/>
-          <w:bCs/>
-        </w:rPr>
-        <w:t xml:space="preserve">Run </w:t>
-      </w:r>
-      <w:proofErr w:type="spellStart"/>
-      <w:r>
-        <w:rPr>
-          <w:b/>
-          <w:bCs/>
-        </w:rPr>
-        <w:t>mvn</w:t>
-      </w:r>
-      <w:proofErr w:type="spellEnd"/>
-      <w:r>
-        <w:rPr>
-          <w:b/>
-          <w:bCs/>
-        </w:rPr>
-        <w:t xml:space="preserve"> test. All assertions must pass before proceeding.</w:t>
+        <w:t>Asserts PerformanceStatus.valueOf("INVALID_INPUT") does not throw</w:t>
+      </w:r>
+    </w:p>
+    <w:p>
+      <w:pPr>
+        <w:rPr>
+          <w:b/>
+          <w:bCs/>
+        </w:rPr>
+      </w:pPr>
+      <w:r>
+        <w:rPr>
+          <w:b/>
+          <w:bCs/>
+        </w:rPr>
+        <w:t>Run mvn test. All assertions must pass before proceeding.</w:t>
       </w:r>
     </w:p>
     <w:p>
@@ -1179,39 +817,7 @@
           <w:b/>
           <w:bCs/>
         </w:rPr>
-        <w:t xml:space="preserve">Prompt: In the model/entity/ package, create a JPA entity class named </w:t>
-      </w:r>
-      <w:proofErr w:type="spellStart"/>
-      <w:r>
-        <w:rPr>
-          <w:b/>
-          <w:bCs/>
-        </w:rPr>
-        <w:t>DailyReturnAudit</w:t>
-      </w:r>
-      <w:proofErr w:type="spellEnd"/>
-      <w:r>
-        <w:rPr>
-          <w:b/>
-          <w:bCs/>
-        </w:rPr>
-        <w:t xml:space="preserve"> that maps to a table called </w:t>
-      </w:r>
-      <w:proofErr w:type="spellStart"/>
-      <w:r>
-        <w:rPr>
-          <w:b/>
-          <w:bCs/>
-        </w:rPr>
-        <w:t>daily_return_audit</w:t>
-      </w:r>
-      <w:proofErr w:type="spellEnd"/>
-      <w:r>
-        <w:rPr>
-          <w:b/>
-          <w:bCs/>
-        </w:rPr>
-        <w:t>. This entity represents a persisted record of every calculation request processed by the API — for audit trail and operational review.</w:t>
+        <w:t>Prompt: In the model/entity/ package, create a JPA entity class named DailyReturnAudit that maps to a table called daily_return_audit. This entity represents a persisted record of every calculation request processed by the API — for audit trail and operational review.</w:t>
       </w:r>
     </w:p>
     <w:p>
@@ -1259,21 +865,12 @@
           <w:bCs/>
         </w:rPr>
       </w:pPr>
-      <w:proofErr w:type="spellStart"/>
-      <w:r>
-        <w:rPr>
-          <w:b/>
-          <w:bCs/>
-        </w:rPr>
-        <w:t>portfolioId</w:t>
-      </w:r>
-      <w:proofErr w:type="spellEnd"/>
-      <w:r>
-        <w:rPr>
-          <w:b/>
-          <w:bCs/>
-        </w:rPr>
-        <w:t xml:space="preserve"> — String, not nullable</w:t>
+      <w:r>
+        <w:rPr>
+          <w:b/>
+          <w:bCs/>
+        </w:rPr>
+        <w:t>portfolioId — String, not nullable</w:t>
       </w:r>
     </w:p>
     <w:p>
@@ -1287,46 +884,12 @@
           <w:bCs/>
         </w:rPr>
       </w:pPr>
-      <w:proofErr w:type="spellStart"/>
-      <w:r>
-        <w:rPr>
-          <w:b/>
-          <w:bCs/>
-        </w:rPr>
-        <w:t>valuationDate</w:t>
-      </w:r>
-      <w:proofErr w:type="spellEnd"/>
-      <w:r>
-        <w:rPr>
-          <w:b/>
-          <w:bCs/>
-        </w:rPr>
-        <w:t xml:space="preserve"> — </w:t>
-      </w:r>
-      <w:proofErr w:type="spellStart"/>
-      <w:proofErr w:type="gramStart"/>
-      <w:r>
-        <w:rPr>
-          <w:b/>
-          <w:bCs/>
-        </w:rPr>
-        <w:t>java.time</w:t>
-      </w:r>
-      <w:proofErr w:type="gramEnd"/>
-      <w:r>
-        <w:rPr>
-          <w:b/>
-          <w:bCs/>
-        </w:rPr>
-        <w:t>.LocalDate</w:t>
-      </w:r>
-      <w:proofErr w:type="spellEnd"/>
-      <w:r>
-        <w:rPr>
-          <w:b/>
-          <w:bCs/>
-        </w:rPr>
-        <w:t>, not nullable</w:t>
+      <w:r>
+        <w:rPr>
+          <w:b/>
+          <w:bCs/>
+        </w:rPr>
+        <w:t>valuationDate — java.time.LocalDate, not nullable</w:t>
       </w:r>
     </w:p>
     <w:p>
@@ -1340,31 +903,13 @@
           <w:bCs/>
         </w:rPr>
       </w:pPr>
-      <w:proofErr w:type="spellStart"/>
-      <w:r>
-        <w:rPr>
-          <w:b/>
-          <w:bCs/>
-        </w:rPr>
-        <w:t>beginMarketValue</w:t>
-      </w:r>
-      <w:proofErr w:type="spellEnd"/>
-      <w:r>
-        <w:rPr>
-          <w:b/>
-          <w:bCs/>
-        </w:rPr>
-        <w:t xml:space="preserve"> — </w:t>
-      </w:r>
-      <w:proofErr w:type="spellStart"/>
-      <w:r>
-        <w:rPr>
-          <w:b/>
-          <w:bCs/>
-        </w:rPr>
-        <w:t>BigDecimal</w:t>
-      </w:r>
-      <w:proofErr w:type="spellEnd"/>
+      <w:r>
+        <w:rPr>
+          <w:b/>
+          <w:bCs/>
+        </w:rPr>
+        <w:t>beginMarketValue — BigDecimal</w:t>
+      </w:r>
     </w:p>
     <w:p>
       <w:pPr>
@@ -1377,31 +922,13 @@
           <w:bCs/>
         </w:rPr>
       </w:pPr>
-      <w:proofErr w:type="spellStart"/>
-      <w:r>
-        <w:rPr>
-          <w:b/>
-          <w:bCs/>
-        </w:rPr>
-        <w:t>endMarketValue</w:t>
-      </w:r>
-      <w:proofErr w:type="spellEnd"/>
-      <w:r>
-        <w:rPr>
-          <w:b/>
-          <w:bCs/>
-        </w:rPr>
-        <w:t xml:space="preserve"> — </w:t>
-      </w:r>
-      <w:proofErr w:type="spellStart"/>
-      <w:r>
-        <w:rPr>
-          <w:b/>
-          <w:bCs/>
-        </w:rPr>
-        <w:t>BigDecimal</w:t>
-      </w:r>
-      <w:proofErr w:type="spellEnd"/>
+      <w:r>
+        <w:rPr>
+          <w:b/>
+          <w:bCs/>
+        </w:rPr>
+        <w:t>endMarketValue — BigDecimal</w:t>
+      </w:r>
     </w:p>
     <w:p>
       <w:pPr>
@@ -1414,31 +941,13 @@
           <w:bCs/>
         </w:rPr>
       </w:pPr>
-      <w:proofErr w:type="spellStart"/>
-      <w:r>
-        <w:rPr>
-          <w:b/>
-          <w:bCs/>
-        </w:rPr>
-        <w:t>netCashFlow</w:t>
-      </w:r>
-      <w:proofErr w:type="spellEnd"/>
-      <w:r>
-        <w:rPr>
-          <w:b/>
-          <w:bCs/>
-        </w:rPr>
-        <w:t xml:space="preserve"> — </w:t>
-      </w:r>
-      <w:proofErr w:type="spellStart"/>
-      <w:r>
-        <w:rPr>
-          <w:b/>
-          <w:bCs/>
-        </w:rPr>
-        <w:t>BigDecimal</w:t>
-      </w:r>
-      <w:proofErr w:type="spellEnd"/>
+      <w:r>
+        <w:rPr>
+          <w:b/>
+          <w:bCs/>
+        </w:rPr>
+        <w:t>netCashFlow — BigDecimal</w:t>
+      </w:r>
     </w:p>
     <w:p>
       <w:pPr>
@@ -1451,31 +960,13 @@
           <w:bCs/>
         </w:rPr>
       </w:pPr>
-      <w:proofErr w:type="spellStart"/>
-      <w:r>
-        <w:rPr>
-          <w:b/>
-          <w:bCs/>
-        </w:rPr>
-        <w:t>benchmarkReturnPct</w:t>
-      </w:r>
-      <w:proofErr w:type="spellEnd"/>
-      <w:r>
-        <w:rPr>
-          <w:b/>
-          <w:bCs/>
-        </w:rPr>
-        <w:t xml:space="preserve"> — </w:t>
-      </w:r>
-      <w:proofErr w:type="spellStart"/>
-      <w:r>
-        <w:rPr>
-          <w:b/>
-          <w:bCs/>
-        </w:rPr>
-        <w:t>BigDecimal</w:t>
-      </w:r>
-      <w:proofErr w:type="spellEnd"/>
+      <w:r>
+        <w:rPr>
+          <w:b/>
+          <w:bCs/>
+        </w:rPr>
+        <w:t>benchmarkReturnPct — BigDecimal</w:t>
+      </w:r>
     </w:p>
     <w:p>
       <w:pPr>
@@ -1508,21 +999,12 @@
           <w:bCs/>
         </w:rPr>
       </w:pPr>
-      <w:proofErr w:type="spellStart"/>
-      <w:r>
-        <w:rPr>
-          <w:b/>
-          <w:bCs/>
-        </w:rPr>
-        <w:t>requestedBy</w:t>
-      </w:r>
-      <w:proofErr w:type="spellEnd"/>
-      <w:r>
-        <w:rPr>
-          <w:b/>
-          <w:bCs/>
-        </w:rPr>
-        <w:t xml:space="preserve"> — String</w:t>
+      <w:r>
+        <w:rPr>
+          <w:b/>
+          <w:bCs/>
+        </w:rPr>
+        <w:t>requestedBy — String</w:t>
       </w:r>
     </w:p>
     <w:p>
@@ -1536,37 +1018,12 @@
           <w:bCs/>
         </w:rPr>
       </w:pPr>
-      <w:proofErr w:type="spellStart"/>
-      <w:r>
-        <w:rPr>
-          <w:b/>
-          <w:bCs/>
-        </w:rPr>
-        <w:t>portfolioReturnPct</w:t>
-      </w:r>
-      <w:proofErr w:type="spellEnd"/>
-      <w:r>
-        <w:rPr>
-          <w:b/>
-          <w:bCs/>
-        </w:rPr>
-        <w:t xml:space="preserve"> — </w:t>
-      </w:r>
-      <w:proofErr w:type="spellStart"/>
-      <w:r>
-        <w:rPr>
-          <w:b/>
-          <w:bCs/>
-        </w:rPr>
-        <w:t>BigDecimal</w:t>
-      </w:r>
-      <w:proofErr w:type="spellEnd"/>
-      <w:r>
-        <w:rPr>
-          <w:b/>
-          <w:bCs/>
-        </w:rPr>
-        <w:t xml:space="preserve"> (nullable — will be null on INVALID_INPUT)</w:t>
+      <w:r>
+        <w:rPr>
+          <w:b/>
+          <w:bCs/>
+        </w:rPr>
+        <w:t>portfolioReturnPct — BigDecimal (nullable — will be null on INVALID_INPUT)</w:t>
       </w:r>
     </w:p>
     <w:p>
@@ -1580,37 +1037,12 @@
           <w:bCs/>
         </w:rPr>
       </w:pPr>
-      <w:proofErr w:type="spellStart"/>
-      <w:r>
-        <w:rPr>
-          <w:b/>
-          <w:bCs/>
-        </w:rPr>
-        <w:t>excessReturnPct</w:t>
-      </w:r>
-      <w:proofErr w:type="spellEnd"/>
-      <w:r>
-        <w:rPr>
-          <w:b/>
-          <w:bCs/>
-        </w:rPr>
-        <w:t xml:space="preserve"> — </w:t>
-      </w:r>
-      <w:proofErr w:type="spellStart"/>
-      <w:r>
-        <w:rPr>
-          <w:b/>
-          <w:bCs/>
-        </w:rPr>
-        <w:t>BigDecimal</w:t>
-      </w:r>
-      <w:proofErr w:type="spellEnd"/>
-      <w:r>
-        <w:rPr>
-          <w:b/>
-          <w:bCs/>
-        </w:rPr>
-        <w:t xml:space="preserve"> (nullable — will be null on INVALID_INPUT)</w:t>
+      <w:r>
+        <w:rPr>
+          <w:b/>
+          <w:bCs/>
+        </w:rPr>
+        <w:t>excessReturnPct — BigDecimal (nullable — will be null on INVALID_INPUT)</w:t>
       </w:r>
     </w:p>
     <w:p>
@@ -1629,23 +1061,7 @@
           <w:b/>
           <w:bCs/>
         </w:rPr>
-        <w:t xml:space="preserve">status — String (store the </w:t>
-      </w:r>
-      <w:proofErr w:type="spellStart"/>
-      <w:r>
-        <w:rPr>
-          <w:b/>
-          <w:bCs/>
-        </w:rPr>
-        <w:t>enum</w:t>
-      </w:r>
-      <w:proofErr w:type="spellEnd"/>
-      <w:r>
-        <w:rPr>
-          <w:b/>
-          <w:bCs/>
-        </w:rPr>
-        <w:t xml:space="preserve"> name as a string)</w:t>
+        <w:t>status — String (store the enum name as a string)</w:t>
       </w:r>
     </w:p>
     <w:p>
@@ -1678,46 +1094,12 @@
           <w:bCs/>
         </w:rPr>
       </w:pPr>
-      <w:proofErr w:type="spellStart"/>
-      <w:r>
-        <w:rPr>
-          <w:b/>
-          <w:bCs/>
-        </w:rPr>
-        <w:t>processedAt</w:t>
-      </w:r>
-      <w:proofErr w:type="spellEnd"/>
-      <w:r>
-        <w:rPr>
-          <w:b/>
-          <w:bCs/>
-        </w:rPr>
-        <w:t xml:space="preserve"> — </w:t>
-      </w:r>
-      <w:proofErr w:type="spellStart"/>
-      <w:proofErr w:type="gramStart"/>
-      <w:r>
-        <w:rPr>
-          <w:b/>
-          <w:bCs/>
-        </w:rPr>
-        <w:t>java.time</w:t>
-      </w:r>
-      <w:proofErr w:type="gramEnd"/>
-      <w:r>
-        <w:rPr>
-          <w:b/>
-          <w:bCs/>
-        </w:rPr>
-        <w:t>.Instant</w:t>
-      </w:r>
-      <w:proofErr w:type="spellEnd"/>
-      <w:r>
-        <w:rPr>
-          <w:b/>
-          <w:bCs/>
-        </w:rPr>
-        <w:t>, not nullable</w:t>
+      <w:r>
+        <w:rPr>
+          <w:b/>
+          <w:bCs/>
+        </w:rPr>
+        <w:t>processedAt — java.time.Instant, not nullable</w:t>
       </w:r>
     </w:p>
     <w:p>
@@ -1747,80 +1129,7 @@
           <w:b/>
           <w:bCs/>
         </w:rPr>
-        <w:t xml:space="preserve">Validation Gate: Run </w:t>
-      </w:r>
-      <w:proofErr w:type="spellStart"/>
-      <w:r>
-        <w:rPr>
-          <w:b/>
-          <w:bCs/>
-        </w:rPr>
-        <w:t>mvn</w:t>
-      </w:r>
-      <w:proofErr w:type="spellEnd"/>
-      <w:r>
-        <w:rPr>
-          <w:b/>
-          <w:bCs/>
-        </w:rPr>
-        <w:t xml:space="preserve"> </w:t>
-      </w:r>
-      <w:proofErr w:type="spellStart"/>
-      <w:r>
-        <w:rPr>
-          <w:b/>
-          <w:bCs/>
-        </w:rPr>
-        <w:t>spring-</w:t>
-      </w:r>
-      <w:proofErr w:type="gramStart"/>
-      <w:r>
-        <w:rPr>
-          <w:b/>
-          <w:bCs/>
-        </w:rPr>
-        <w:t>boot:run</w:t>
-      </w:r>
-      <w:proofErr w:type="spellEnd"/>
-      <w:proofErr w:type="gramEnd"/>
-      <w:r>
-        <w:rPr>
-          <w:b/>
-          <w:bCs/>
-        </w:rPr>
-        <w:t xml:space="preserve">. Check the application log output — Spring/Hibernate must print a create table </w:t>
-      </w:r>
-      <w:proofErr w:type="spellStart"/>
-      <w:r>
-        <w:rPr>
-          <w:b/>
-          <w:bCs/>
-        </w:rPr>
-        <w:t>daily_return_audit</w:t>
-      </w:r>
-      <w:proofErr w:type="spellEnd"/>
-      <w:r>
-        <w:rPr>
-          <w:b/>
-          <w:bCs/>
-        </w:rPr>
-        <w:t xml:space="preserve"> DDL statement confirming the entity was picked up and the schema was generated. Open H2 console at http://localhost:8080/h2-console, connect, and run SELECT * FROM DAILY_RETURN_AUDIT; — it must return an empty result (no error). Stop the app and run </w:t>
-      </w:r>
-      <w:proofErr w:type="spellStart"/>
-      <w:r>
-        <w:rPr>
-          <w:b/>
-          <w:bCs/>
-        </w:rPr>
-        <w:t>mvn</w:t>
-      </w:r>
-      <w:proofErr w:type="spellEnd"/>
-      <w:r>
-        <w:rPr>
-          <w:b/>
-          <w:bCs/>
-        </w:rPr>
-        <w:t xml:space="preserve"> test to confirm no regressions before proceeding.</w:t>
+        <w:t>Validation Gate: Run mvn spring-boot:run. Check the application log output — Spring/Hibernate must print a create table daily_return_audit DDL statement confirming the entity was picked up and the schema was generated. Open H2 console at http://localhost:8080/h2-console, connect, and run SELECT * FROM DAILY_RETURN_AUDIT; — it must return an empty result (no error). Stop the app and run mvn test to confirm no regressions before proceeding.</w:t>
       </w:r>
     </w:p>
     <w:p>
@@ -1836,7 +1145,7 @@
           <w:bCs/>
         </w:rPr>
         <w:pict w14:anchorId="437BD19B">
-          <v:rect id="_x0000_i1035" style="width:0;height:1.5pt" o:hralign="center" o:hrstd="t" o:hr="t" fillcolor="#a0a0a0" stroked="f"/>
+          <v:rect id="_x0000_i1027" style="width:0;height:1.5pt" o:hralign="center" o:hrstd="t" o:hr="t" fillcolor="#a0a0a0" stroked="f"/>
         </w:pict>
       </w:r>
     </w:p>
@@ -1867,55 +1176,7 @@
           <w:b/>
           <w:bCs/>
         </w:rPr>
-        <w:t xml:space="preserve">Prompt: In the repository/ package, create a Spring Data JPA repository interface named </w:t>
-      </w:r>
-      <w:proofErr w:type="spellStart"/>
-      <w:r>
-        <w:rPr>
-          <w:b/>
-          <w:bCs/>
-        </w:rPr>
-        <w:t>DailyReturnAuditRepository</w:t>
-      </w:r>
-      <w:proofErr w:type="spellEnd"/>
-      <w:r>
-        <w:rPr>
-          <w:b/>
-          <w:bCs/>
-        </w:rPr>
-        <w:t xml:space="preserve"> that extends </w:t>
-      </w:r>
-      <w:proofErr w:type="spellStart"/>
-      <w:r>
-        <w:rPr>
-          <w:b/>
-          <w:bCs/>
-        </w:rPr>
-        <w:t>JpaRepository</w:t>
-      </w:r>
-      <w:proofErr w:type="spellEnd"/>
-      <w:r>
-        <w:rPr>
-          <w:b/>
-          <w:bCs/>
-        </w:rPr>
-        <w:t>&lt;</w:t>
-      </w:r>
-      <w:proofErr w:type="spellStart"/>
-      <w:r>
-        <w:rPr>
-          <w:b/>
-          <w:bCs/>
-        </w:rPr>
-        <w:t>DailyReturnAudit</w:t>
-      </w:r>
-      <w:proofErr w:type="spellEnd"/>
-      <w:r>
-        <w:rPr>
-          <w:b/>
-          <w:bCs/>
-        </w:rPr>
-        <w:t>, Long&gt;.</w:t>
+        <w:t>Prompt: In the repository/ package, create a Spring Data JPA repository interface named DailyReturnAuditRepository that extends JpaRepository&lt;DailyReturnAudit, Long&gt;.</w:t>
       </w:r>
     </w:p>
     <w:p>
@@ -1949,17 +1210,8 @@
           <w:b/>
           <w:bCs/>
         </w:rPr>
-        <w:t xml:space="preserve">A method to find all audit records by </w:t>
-      </w:r>
-      <w:proofErr w:type="spellStart"/>
-      <w:r>
-        <w:rPr>
-          <w:b/>
-          <w:bCs/>
-        </w:rPr>
-        <w:t>portfolioId</w:t>
-      </w:r>
-      <w:proofErr w:type="spellEnd"/>
+        <w:t>A method to find all audit records by portfolioId</w:t>
+      </w:r>
     </w:p>
     <w:p>
       <w:pPr>
@@ -1996,33 +1248,8 @@
           <w:b/>
           <w:bCs/>
         </w:rPr>
-        <w:t xml:space="preserve">A method to find a list of records by </w:t>
-      </w:r>
-      <w:proofErr w:type="spellStart"/>
-      <w:r>
-        <w:rPr>
-          <w:b/>
-          <w:bCs/>
-        </w:rPr>
-        <w:t>portfolioId</w:t>
-      </w:r>
-      <w:proofErr w:type="spellEnd"/>
-      <w:r>
-        <w:rPr>
-          <w:b/>
-          <w:bCs/>
-        </w:rPr>
-        <w:t xml:space="preserve"> and </w:t>
-      </w:r>
-      <w:proofErr w:type="spellStart"/>
-      <w:r>
-        <w:rPr>
-          <w:b/>
-          <w:bCs/>
-        </w:rPr>
-        <w:t>valuationDate</w:t>
-      </w:r>
-      <w:proofErr w:type="spellEnd"/>
+        <w:t>A method to find a list of records by portfolioId and valuationDate</w:t>
+      </w:r>
     </w:p>
     <w:p>
       <w:pPr>
@@ -2051,23 +1278,7 @@
           <w:b/>
           <w:bCs/>
         </w:rPr>
-        <w:t xml:space="preserve">Validation Gate: Create a Spring Data slice test class </w:t>
-      </w:r>
-      <w:proofErr w:type="spellStart"/>
-      <w:r>
-        <w:rPr>
-          <w:b/>
-          <w:bCs/>
-        </w:rPr>
-        <w:t>DailyReturnAuditRepositoryTest</w:t>
-      </w:r>
-      <w:proofErr w:type="spellEnd"/>
-      <w:r>
-        <w:rPr>
-          <w:b/>
-          <w:bCs/>
-        </w:rPr>
-        <w:t xml:space="preserve"> using @DataJpaTest. In this test:</w:t>
+        <w:t>Validation Gate: Create a Spring Data slice test class DailyReturnAuditRepositoryTest using @DataJpaTest. In this test:</w:t>
       </w:r>
     </w:p>
     <w:p>
@@ -2086,55 +1297,7 @@
           <w:b/>
           <w:bCs/>
         </w:rPr>
-        <w:t xml:space="preserve">Save a manually constructed </w:t>
-      </w:r>
-      <w:proofErr w:type="spellStart"/>
-      <w:r>
-        <w:rPr>
-          <w:b/>
-          <w:bCs/>
-        </w:rPr>
-        <w:t>DailyReturnAudit</w:t>
-      </w:r>
-      <w:proofErr w:type="spellEnd"/>
-      <w:r>
-        <w:rPr>
-          <w:b/>
-          <w:bCs/>
-        </w:rPr>
-        <w:t xml:space="preserve"> entity with status "VALID" and </w:t>
-      </w:r>
-      <w:proofErr w:type="spellStart"/>
-      <w:r>
-        <w:rPr>
-          <w:b/>
-          <w:bCs/>
-        </w:rPr>
-        <w:t>portfolioId</w:t>
-      </w:r>
-      <w:proofErr w:type="spellEnd"/>
-      <w:r>
-        <w:rPr>
-          <w:b/>
-          <w:bCs/>
-        </w:rPr>
-        <w:t xml:space="preserve"> "PF-TEST" and </w:t>
-      </w:r>
-      <w:proofErr w:type="spellStart"/>
-      <w:r>
-        <w:rPr>
-          <w:b/>
-          <w:bCs/>
-        </w:rPr>
-        <w:t>valuationDate</w:t>
-      </w:r>
-      <w:proofErr w:type="spellEnd"/>
-      <w:r>
-        <w:rPr>
-          <w:b/>
-          <w:bCs/>
-        </w:rPr>
-        <w:t xml:space="preserve"> of today</w:t>
+        <w:t>Save a manually constructed DailyReturnAudit entity with status "VALID" and portfolioId "PF-TEST" and valuationDate of today</w:t>
       </w:r>
     </w:p>
     <w:p>
@@ -2153,23 +1316,7 @@
           <w:b/>
           <w:bCs/>
         </w:rPr>
-        <w:t xml:space="preserve">Assert that </w:t>
-      </w:r>
-      <w:proofErr w:type="spellStart"/>
-      <w:r>
-        <w:rPr>
-          <w:b/>
-          <w:bCs/>
-        </w:rPr>
-        <w:t>findByPortfolioId</w:t>
-      </w:r>
-      <w:proofErr w:type="spellEnd"/>
-      <w:r>
-        <w:rPr>
-          <w:b/>
-          <w:bCs/>
-        </w:rPr>
-        <w:t>("PF-TEST") returns exactly 1 result</w:t>
+        <w:t>Assert that findByPortfolioId("PF-TEST") returns exactly 1 result</w:t>
       </w:r>
     </w:p>
     <w:p>
@@ -2188,23 +1335,7 @@
           <w:b/>
           <w:bCs/>
         </w:rPr>
-        <w:t xml:space="preserve">Assert that </w:t>
-      </w:r>
-      <w:proofErr w:type="spellStart"/>
-      <w:r>
-        <w:rPr>
-          <w:b/>
-          <w:bCs/>
-        </w:rPr>
-        <w:t>findByStatus</w:t>
-      </w:r>
-      <w:proofErr w:type="spellEnd"/>
-      <w:r>
-        <w:rPr>
-          <w:b/>
-          <w:bCs/>
-        </w:rPr>
-        <w:t>("VALID") returns at least 1 result</w:t>
+        <w:t>Assert that findByStatus("VALID") returns at least 1 result</w:t>
       </w:r>
     </w:p>
     <w:p>
@@ -2223,32 +1354,7 @@
           <w:b/>
           <w:bCs/>
         </w:rPr>
-        <w:t xml:space="preserve">Assert that </w:t>
-      </w:r>
-      <w:proofErr w:type="spellStart"/>
-      <w:proofErr w:type="gramStart"/>
-      <w:r>
-        <w:rPr>
-          <w:b/>
-          <w:bCs/>
-        </w:rPr>
-        <w:t>findByPortfolioIdAndValuationDate</w:t>
-      </w:r>
-      <w:proofErr w:type="spellEnd"/>
-      <w:r>
-        <w:rPr>
-          <w:b/>
-          <w:bCs/>
-        </w:rPr>
-        <w:t>(</w:t>
-      </w:r>
-      <w:proofErr w:type="gramEnd"/>
-      <w:r>
-        <w:rPr>
-          <w:b/>
-          <w:bCs/>
-        </w:rPr>
-        <w:t>"PF-TEST", today) returns 1 result</w:t>
+        <w:t>Assert that findByPortfolioIdAndValuationDate("PF-TEST", today) returns 1 result</w:t>
       </w:r>
     </w:p>
     <w:p>
@@ -2267,70 +1373,38 @@
           <w:b/>
           <w:bCs/>
         </w:rPr>
-        <w:t xml:space="preserve">Assert that </w:t>
-      </w:r>
-      <w:proofErr w:type="spellStart"/>
-      <w:r>
-        <w:rPr>
-          <w:b/>
-          <w:bCs/>
-        </w:rPr>
-        <w:t>findByPortfolioId</w:t>
-      </w:r>
-      <w:proofErr w:type="spellEnd"/>
-      <w:r>
-        <w:rPr>
-          <w:b/>
-          <w:bCs/>
-        </w:rPr>
-        <w:t>("PF-UNKNOWN") returns an empty list</w:t>
-      </w:r>
-    </w:p>
-    <w:p>
-      <w:pPr>
-        <w:rPr>
-          <w:b/>
-          <w:bCs/>
-        </w:rPr>
-      </w:pPr>
-      <w:r>
-        <w:rPr>
-          <w:b/>
-          <w:bCs/>
-        </w:rPr>
-        <w:t xml:space="preserve">Run </w:t>
-      </w:r>
-      <w:proofErr w:type="spellStart"/>
-      <w:r>
-        <w:rPr>
-          <w:b/>
-          <w:bCs/>
-        </w:rPr>
-        <w:t>mvn</w:t>
-      </w:r>
-      <w:proofErr w:type="spellEnd"/>
-      <w:r>
-        <w:rPr>
-          <w:b/>
-          <w:bCs/>
-        </w:rPr>
-        <w:t xml:space="preserve"> test. All 4 assertions must pass before proceeding.</w:t>
-      </w:r>
-    </w:p>
-    <w:p>
-      <w:pPr>
-        <w:rPr>
-          <w:b/>
-          <w:bCs/>
-        </w:rPr>
-      </w:pPr>
-      <w:r>
-        <w:rPr>
-          <w:b/>
-          <w:bCs/>
-        </w:rPr>
-        <w:pict w14:anchorId="00250D11">
-          <v:rect id="_x0000_i1036" style="width:0;height:1.5pt" o:hralign="center" o:hrstd="t" o:hr="t" fillcolor="#a0a0a0" stroked="f"/>
+        <w:t>Assert that findByPortfolioId("PF-UNKNOWN") returns an empty list</w:t>
+      </w:r>
+    </w:p>
+    <w:p>
+      <w:pPr>
+        <w:rPr>
+          <w:b/>
+          <w:bCs/>
+        </w:rPr>
+      </w:pPr>
+      <w:r>
+        <w:rPr>
+          <w:b/>
+          <w:bCs/>
+        </w:rPr>
+        <w:t>Run mvn test. All 4 assertions must pass before proceeding.</w:t>
+      </w:r>
+    </w:p>
+    <w:p>
+      <w:pPr>
+        <w:rPr>
+          <w:b/>
+          <w:bCs/>
+        </w:rPr>
+      </w:pPr>
+      <w:r>
+        <w:rPr>
+          <w:b/>
+          <w:bCs/>
+        </w:rPr>
+        <w:pict w14:anchorId="6A0EE8C3">
+          <v:rect id="_x0000_i1029" style="width:0;height:1.5pt" o:hralign="center" o:hrstd="t" o:hr="t" fillcolor="#a0a0a0" stroked="f"/>
         </w:pict>
       </w:r>
     </w:p>
@@ -2347,23 +1421,6 @@
           <w:bCs/>
         </w:rPr>
         <w:lastRenderedPageBreak/>
-        <w:pict w14:anchorId="6A0EE8C3">
-          <v:rect id="_x0000_i1039" style="width:0;height:1.5pt" o:hralign="center" o:hrstd="t" o:hr="t" fillcolor="#a0a0a0" stroked="f"/>
-        </w:pict>
-      </w:r>
-    </w:p>
-    <w:p>
-      <w:pPr>
-        <w:rPr>
-          <w:b/>
-          <w:bCs/>
-        </w:rPr>
-      </w:pPr>
-      <w:r>
-        <w:rPr>
-          <w:b/>
-          <w:bCs/>
-        </w:rPr>
         <w:t>Step 5: Define the API Request and Response Models</w:t>
       </w:r>
     </w:p>
@@ -2379,23 +1436,7 @@
           <w:b/>
           <w:bCs/>
         </w:rPr>
-        <w:t xml:space="preserve">Prompt: In the model/request/ package, create a class </w:t>
-      </w:r>
-      <w:proofErr w:type="spellStart"/>
-      <w:r>
-        <w:rPr>
-          <w:b/>
-          <w:bCs/>
-        </w:rPr>
-        <w:t>DailyReturnRequest</w:t>
-      </w:r>
-      <w:proofErr w:type="spellEnd"/>
-      <w:r>
-        <w:rPr>
-          <w:b/>
-          <w:bCs/>
-        </w:rPr>
-        <w:t xml:space="preserve"> with the following fields and Jakarta Bean Validation annotations:</w:t>
+        <w:t>Prompt: In the model/request/ package, create a class DailyReturnRequest with the following fields and Jakarta Bean Validation annotations:</w:t>
       </w:r>
     </w:p>
     <w:tbl>
@@ -2504,7 +1545,6 @@
                 <w:bCs/>
               </w:rPr>
             </w:pPr>
-            <w:proofErr w:type="spellStart"/>
             <w:r>
               <w:rPr>
                 <w:b/>
@@ -2512,7 +1552,6 @@
               </w:rPr>
               <w:t>portfolioId</w:t>
             </w:r>
-            <w:proofErr w:type="spellEnd"/>
           </w:p>
         </w:tc>
         <w:tc>
@@ -2577,7 +1616,6 @@
                 <w:bCs/>
               </w:rPr>
             </w:pPr>
-            <w:proofErr w:type="spellStart"/>
             <w:r>
               <w:rPr>
                 <w:b/>
@@ -2585,7 +1623,6 @@
               </w:rPr>
               <w:t>valuationDate</w:t>
             </w:r>
-            <w:proofErr w:type="spellEnd"/>
           </w:p>
         </w:tc>
         <w:tc>
@@ -2601,7 +1638,6 @@
                 <w:bCs/>
               </w:rPr>
             </w:pPr>
-            <w:proofErr w:type="spellStart"/>
             <w:r>
               <w:rPr>
                 <w:b/>
@@ -2609,7 +1645,6 @@
               </w:rPr>
               <w:t>LocalDate</w:t>
             </w:r>
-            <w:proofErr w:type="spellEnd"/>
           </w:p>
         </w:tc>
         <w:tc>
@@ -2652,7 +1687,6 @@
                 <w:bCs/>
               </w:rPr>
             </w:pPr>
-            <w:proofErr w:type="spellStart"/>
             <w:r>
               <w:rPr>
                 <w:b/>
@@ -2660,7 +1694,6 @@
               </w:rPr>
               <w:t>beginMarketValue</w:t>
             </w:r>
-            <w:proofErr w:type="spellEnd"/>
           </w:p>
         </w:tc>
         <w:tc>
@@ -2676,7 +1709,6 @@
                 <w:bCs/>
               </w:rPr>
             </w:pPr>
-            <w:proofErr w:type="spellStart"/>
             <w:r>
               <w:rPr>
                 <w:b/>
@@ -2684,7 +1716,6 @@
               </w:rPr>
               <w:t>BigDecimal</w:t>
             </w:r>
-            <w:proofErr w:type="spellEnd"/>
           </w:p>
         </w:tc>
         <w:tc>
@@ -2727,7 +1758,6 @@
                 <w:bCs/>
               </w:rPr>
             </w:pPr>
-            <w:proofErr w:type="spellStart"/>
             <w:r>
               <w:rPr>
                 <w:b/>
@@ -2735,7 +1765,6 @@
               </w:rPr>
               <w:t>endMarketValue</w:t>
             </w:r>
-            <w:proofErr w:type="spellEnd"/>
           </w:p>
         </w:tc>
         <w:tc>
@@ -2751,7 +1780,6 @@
                 <w:bCs/>
               </w:rPr>
             </w:pPr>
-            <w:proofErr w:type="spellStart"/>
             <w:r>
               <w:rPr>
                 <w:b/>
@@ -2759,7 +1787,6 @@
               </w:rPr>
               <w:t>BigDecimal</w:t>
             </w:r>
-            <w:proofErr w:type="spellEnd"/>
           </w:p>
         </w:tc>
         <w:tc>
@@ -2802,7 +1829,6 @@
                 <w:bCs/>
               </w:rPr>
             </w:pPr>
-            <w:proofErr w:type="spellStart"/>
             <w:r>
               <w:rPr>
                 <w:b/>
@@ -2810,7 +1836,6 @@
               </w:rPr>
               <w:t>netCashFlow</w:t>
             </w:r>
-            <w:proofErr w:type="spellEnd"/>
           </w:p>
         </w:tc>
         <w:tc>
@@ -2826,7 +1851,6 @@
                 <w:bCs/>
               </w:rPr>
             </w:pPr>
-            <w:proofErr w:type="spellStart"/>
             <w:r>
               <w:rPr>
                 <w:b/>
@@ -2834,7 +1858,6 @@
               </w:rPr>
               <w:t>BigDecimal</w:t>
             </w:r>
-            <w:proofErr w:type="spellEnd"/>
           </w:p>
         </w:tc>
         <w:tc>
@@ -2877,7 +1900,6 @@
                 <w:bCs/>
               </w:rPr>
             </w:pPr>
-            <w:proofErr w:type="spellStart"/>
             <w:r>
               <w:rPr>
                 <w:b/>
@@ -2885,7 +1907,6 @@
               </w:rPr>
               <w:t>benchmarkReturnPct</w:t>
             </w:r>
-            <w:proofErr w:type="spellEnd"/>
           </w:p>
         </w:tc>
         <w:tc>
@@ -2901,7 +1922,6 @@
                 <w:bCs/>
               </w:rPr>
             </w:pPr>
-            <w:proofErr w:type="spellStart"/>
             <w:r>
               <w:rPr>
                 <w:b/>
@@ -2909,7 +1929,6 @@
               </w:rPr>
               <w:t>BigDecimal</w:t>
             </w:r>
-            <w:proofErr w:type="spellEnd"/>
           </w:p>
         </w:tc>
         <w:tc>
@@ -3023,7 +2042,6 @@
                 <w:bCs/>
               </w:rPr>
             </w:pPr>
-            <w:proofErr w:type="spellStart"/>
             <w:r>
               <w:rPr>
                 <w:b/>
@@ -3031,7 +2049,6 @@
               </w:rPr>
               <w:t>requestedBy</w:t>
             </w:r>
-            <w:proofErr w:type="spellEnd"/>
           </w:p>
         </w:tc>
         <w:tc>
@@ -3107,23 +2124,7 @@
           <w:b/>
           <w:bCs/>
         </w:rPr>
-        <w:t xml:space="preserve">In the model/response/ package, create a class </w:t>
-      </w:r>
-      <w:proofErr w:type="spellStart"/>
-      <w:r>
-        <w:rPr>
-          <w:b/>
-          <w:bCs/>
-        </w:rPr>
-        <w:t>DailyReturnResponse</w:t>
-      </w:r>
-      <w:proofErr w:type="spellEnd"/>
-      <w:r>
-        <w:rPr>
-          <w:b/>
-          <w:bCs/>
-        </w:rPr>
-        <w:t xml:space="preserve"> with:</w:t>
+        <w:t>In the model/response/ package, create a class DailyReturnResponse with:</w:t>
       </w:r>
     </w:p>
     <w:p>
@@ -3137,21 +2138,12 @@
           <w:bCs/>
         </w:rPr>
       </w:pPr>
-      <w:proofErr w:type="spellStart"/>
-      <w:r>
-        <w:rPr>
-          <w:b/>
-          <w:bCs/>
-        </w:rPr>
-        <w:t>portfolioId</w:t>
-      </w:r>
-      <w:proofErr w:type="spellEnd"/>
-      <w:r>
-        <w:rPr>
-          <w:b/>
-          <w:bCs/>
-        </w:rPr>
-        <w:t xml:space="preserve"> — String</w:t>
+      <w:r>
+        <w:rPr>
+          <w:b/>
+          <w:bCs/>
+        </w:rPr>
+        <w:t>portfolioId — String</w:t>
       </w:r>
     </w:p>
     <w:p>
@@ -3165,31 +2157,13 @@
           <w:bCs/>
         </w:rPr>
       </w:pPr>
-      <w:proofErr w:type="spellStart"/>
-      <w:r>
-        <w:rPr>
-          <w:b/>
-          <w:bCs/>
-        </w:rPr>
-        <w:t>valuationDate</w:t>
-      </w:r>
-      <w:proofErr w:type="spellEnd"/>
-      <w:r>
-        <w:rPr>
-          <w:b/>
-          <w:bCs/>
-        </w:rPr>
-        <w:t xml:space="preserve"> — </w:t>
-      </w:r>
-      <w:proofErr w:type="spellStart"/>
-      <w:r>
-        <w:rPr>
-          <w:b/>
-          <w:bCs/>
-        </w:rPr>
-        <w:t>LocalDate</w:t>
-      </w:r>
-      <w:proofErr w:type="spellEnd"/>
+      <w:r>
+        <w:rPr>
+          <w:b/>
+          <w:bCs/>
+        </w:rPr>
+        <w:t>valuationDate — LocalDate</w:t>
+      </w:r>
     </w:p>
     <w:p>
       <w:pPr>
@@ -3202,37 +2176,12 @@
           <w:bCs/>
         </w:rPr>
       </w:pPr>
-      <w:proofErr w:type="spellStart"/>
-      <w:r>
-        <w:rPr>
-          <w:b/>
-          <w:bCs/>
-        </w:rPr>
-        <w:t>portfolioReturnPct</w:t>
-      </w:r>
-      <w:proofErr w:type="spellEnd"/>
-      <w:r>
-        <w:rPr>
-          <w:b/>
-          <w:bCs/>
-        </w:rPr>
-        <w:t xml:space="preserve"> — </w:t>
-      </w:r>
-      <w:proofErr w:type="spellStart"/>
-      <w:r>
-        <w:rPr>
-          <w:b/>
-          <w:bCs/>
-        </w:rPr>
-        <w:t>BigDecimal</w:t>
-      </w:r>
-      <w:proofErr w:type="spellEnd"/>
-      <w:r>
-        <w:rPr>
-          <w:b/>
-          <w:bCs/>
-        </w:rPr>
-        <w:t xml:space="preserve"> (nullable)</w:t>
+      <w:r>
+        <w:rPr>
+          <w:b/>
+          <w:bCs/>
+        </w:rPr>
+        <w:t>portfolioReturnPct — BigDecimal (nullable)</w:t>
       </w:r>
     </w:p>
     <w:p>
@@ -3246,31 +2195,13 @@
           <w:bCs/>
         </w:rPr>
       </w:pPr>
-      <w:proofErr w:type="spellStart"/>
-      <w:r>
-        <w:rPr>
-          <w:b/>
-          <w:bCs/>
-        </w:rPr>
-        <w:t>benchmarkReturnPct</w:t>
-      </w:r>
-      <w:proofErr w:type="spellEnd"/>
-      <w:r>
-        <w:rPr>
-          <w:b/>
-          <w:bCs/>
-        </w:rPr>
-        <w:t xml:space="preserve"> — </w:t>
-      </w:r>
-      <w:proofErr w:type="spellStart"/>
-      <w:r>
-        <w:rPr>
-          <w:b/>
-          <w:bCs/>
-        </w:rPr>
-        <w:t>BigDecimal</w:t>
-      </w:r>
-      <w:proofErr w:type="spellEnd"/>
+      <w:r>
+        <w:rPr>
+          <w:b/>
+          <w:bCs/>
+        </w:rPr>
+        <w:t>benchmarkReturnPct — BigDecimal</w:t>
+      </w:r>
     </w:p>
     <w:p>
       <w:pPr>
@@ -3283,37 +2214,12 @@
           <w:bCs/>
         </w:rPr>
       </w:pPr>
-      <w:proofErr w:type="spellStart"/>
-      <w:r>
-        <w:rPr>
-          <w:b/>
-          <w:bCs/>
-        </w:rPr>
-        <w:t>excessReturnPct</w:t>
-      </w:r>
-      <w:proofErr w:type="spellEnd"/>
-      <w:r>
-        <w:rPr>
-          <w:b/>
-          <w:bCs/>
-        </w:rPr>
-        <w:t xml:space="preserve"> — </w:t>
-      </w:r>
-      <w:proofErr w:type="spellStart"/>
-      <w:r>
-        <w:rPr>
-          <w:b/>
-          <w:bCs/>
-        </w:rPr>
-        <w:t>BigDecimal</w:t>
-      </w:r>
-      <w:proofErr w:type="spellEnd"/>
-      <w:r>
-        <w:rPr>
-          <w:b/>
-          <w:bCs/>
-        </w:rPr>
-        <w:t xml:space="preserve"> (nullable)</w:t>
+      <w:r>
+        <w:rPr>
+          <w:b/>
+          <w:bCs/>
+        </w:rPr>
+        <w:t>excessReturnPct — BigDecimal (nullable)</w:t>
       </w:r>
     </w:p>
     <w:p>
@@ -3332,33 +2238,8 @@
           <w:b/>
           <w:bCs/>
         </w:rPr>
-        <w:t xml:space="preserve">status — </w:t>
-      </w:r>
-      <w:proofErr w:type="spellStart"/>
-      <w:r>
-        <w:rPr>
-          <w:b/>
-          <w:bCs/>
-        </w:rPr>
-        <w:t>PerformanceStatus</w:t>
-      </w:r>
-      <w:proofErr w:type="spellEnd"/>
-      <w:r>
-        <w:rPr>
-          <w:b/>
-          <w:bCs/>
-        </w:rPr>
-        <w:t xml:space="preserve"> </w:t>
-      </w:r>
-      <w:proofErr w:type="spellStart"/>
-      <w:r>
-        <w:rPr>
-          <w:b/>
-          <w:bCs/>
-        </w:rPr>
-        <w:t>enum</w:t>
-      </w:r>
-      <w:proofErr w:type="spellEnd"/>
+        <w:t>status — PerformanceStatus enum</w:t>
+      </w:r>
     </w:p>
     <w:p>
       <w:pPr>
@@ -3390,115 +2271,42 @@
           <w:bCs/>
         </w:rPr>
       </w:pPr>
-      <w:proofErr w:type="spellStart"/>
-      <w:r>
-        <w:rPr>
-          <w:b/>
-          <w:bCs/>
-        </w:rPr>
-        <w:t>processedAt</w:t>
-      </w:r>
-      <w:proofErr w:type="spellEnd"/>
-      <w:r>
-        <w:rPr>
-          <w:b/>
-          <w:bCs/>
-        </w:rPr>
-        <w:t xml:space="preserve"> — Instant</w:t>
-      </w:r>
-    </w:p>
-    <w:p>
-      <w:pPr>
-        <w:rPr>
-          <w:b/>
-          <w:bCs/>
-        </w:rPr>
-      </w:pPr>
-      <w:r>
-        <w:rPr>
-          <w:b/>
-          <w:bCs/>
-        </w:rPr>
-        <w:t xml:space="preserve">Use Lombok @Data, @Builder, @NoArgsConstructor, @AllArgsConstructor on both classes. Add @JsonFormat on </w:t>
-      </w:r>
-      <w:proofErr w:type="spellStart"/>
-      <w:r>
-        <w:rPr>
-          <w:b/>
-          <w:bCs/>
-        </w:rPr>
-        <w:t>valuationDate</w:t>
-      </w:r>
-      <w:proofErr w:type="spellEnd"/>
-      <w:r>
-        <w:rPr>
-          <w:b/>
-          <w:bCs/>
-        </w:rPr>
-        <w:t xml:space="preserve"> with pattern "</w:t>
-      </w:r>
-      <w:proofErr w:type="spellStart"/>
-      <w:r>
-        <w:rPr>
-          <w:b/>
-          <w:bCs/>
-        </w:rPr>
-        <w:t>yyyy</w:t>
-      </w:r>
-      <w:proofErr w:type="spellEnd"/>
-      <w:r>
-        <w:rPr>
-          <w:b/>
-          <w:bCs/>
-        </w:rPr>
-        <w:t xml:space="preserve">-MM-dd" and on </w:t>
-      </w:r>
-      <w:proofErr w:type="spellStart"/>
-      <w:r>
-        <w:rPr>
-          <w:b/>
-          <w:bCs/>
-        </w:rPr>
-        <w:t>processedAt</w:t>
-      </w:r>
-      <w:proofErr w:type="spellEnd"/>
-      <w:r>
-        <w:rPr>
-          <w:b/>
-          <w:bCs/>
-        </w:rPr>
-        <w:t xml:space="preserve"> for ISO-8601 output.</w:t>
-      </w:r>
-    </w:p>
-    <w:p>
-      <w:pPr>
-        <w:rPr>
-          <w:b/>
-          <w:bCs/>
-        </w:rPr>
-      </w:pPr>
-      <w:r>
-        <w:rPr>
-          <w:b/>
-          <w:bCs/>
-        </w:rPr>
-        <w:t xml:space="preserve">Validation Gate: Write a plain unit test </w:t>
-      </w:r>
-      <w:proofErr w:type="spellStart"/>
-      <w:r>
-        <w:rPr>
-          <w:b/>
-          <w:bCs/>
-        </w:rPr>
-        <w:t>DailyReturnRequestValidationTest</w:t>
-      </w:r>
-      <w:proofErr w:type="spellEnd"/>
-      <w:r>
-        <w:rPr>
-          <w:b/>
-          <w:bCs/>
-        </w:rPr>
-        <w:t xml:space="preserve"> (no Spring context) that:</w:t>
+      <w:r>
+        <w:rPr>
+          <w:b/>
+          <w:bCs/>
+        </w:rPr>
+        <w:t>processedAt — Instant</w:t>
+      </w:r>
+    </w:p>
+    <w:p>
+      <w:pPr>
+        <w:rPr>
+          <w:b/>
+          <w:bCs/>
+        </w:rPr>
+      </w:pPr>
+      <w:r>
+        <w:rPr>
+          <w:b/>
+          <w:bCs/>
+        </w:rPr>
+        <w:t>Use Lombok @Data, @Builder, @NoArgsConstructor, @AllArgsConstructor on both classes. Add @JsonFormat on valuationDate with pattern "yyyy-MM-dd" and on processedAt for ISO-8601 output.</w:t>
+      </w:r>
+    </w:p>
+    <w:p>
+      <w:pPr>
+        <w:rPr>
+          <w:b/>
+          <w:bCs/>
+        </w:rPr>
+      </w:pPr>
+      <w:r>
+        <w:rPr>
+          <w:b/>
+          <w:bCs/>
+        </w:rPr>
+        <w:t>Validation Gate: Write a plain unit test DailyReturnRequestValidationTest (no Spring context) that:</w:t>
       </w:r>
     </w:p>
     <w:p>
@@ -3517,73 +2325,7 @@
           <w:b/>
           <w:bCs/>
         </w:rPr>
-        <w:t xml:space="preserve">Uses a </w:t>
-      </w:r>
-      <w:proofErr w:type="spellStart"/>
-      <w:proofErr w:type="gramStart"/>
-      <w:r>
-        <w:rPr>
-          <w:b/>
-          <w:bCs/>
-        </w:rPr>
-        <w:t>jakarta.validation</w:t>
-      </w:r>
-      <w:proofErr w:type="gramEnd"/>
-      <w:r>
-        <w:rPr>
-          <w:b/>
-          <w:bCs/>
-        </w:rPr>
-        <w:t>.Validator</w:t>
-      </w:r>
-      <w:proofErr w:type="spellEnd"/>
-      <w:r>
-        <w:rPr>
-          <w:b/>
-          <w:bCs/>
-        </w:rPr>
-        <w:t xml:space="preserve"> obtained via </w:t>
-      </w:r>
-      <w:proofErr w:type="spellStart"/>
-      <w:r>
-        <w:rPr>
-          <w:b/>
-          <w:bCs/>
-        </w:rPr>
-        <w:t>Validation.buildDefaultValidatorFactory</w:t>
-      </w:r>
-      <w:proofErr w:type="spellEnd"/>
-      <w:r>
-        <w:rPr>
-          <w:b/>
-          <w:bCs/>
-        </w:rPr>
-        <w:t>(</w:t>
-      </w:r>
-      <w:proofErr w:type="gramStart"/>
-      <w:r>
-        <w:rPr>
-          <w:b/>
-          <w:bCs/>
-        </w:rPr>
-        <w:t>).</w:t>
-      </w:r>
-      <w:proofErr w:type="spellStart"/>
-      <w:r>
-        <w:rPr>
-          <w:b/>
-          <w:bCs/>
-        </w:rPr>
-        <w:t>getValidator</w:t>
-      </w:r>
-      <w:proofErr w:type="spellEnd"/>
-      <w:proofErr w:type="gramEnd"/>
-      <w:r>
-        <w:rPr>
-          <w:b/>
-          <w:bCs/>
-        </w:rPr>
-        <w:t>()</w:t>
+        <w:t>Uses a jakarta.validation.Validator obtained via Validation.buildDefaultValidatorFactory().getValidator()</w:t>
       </w:r>
     </w:p>
     <w:p>
@@ -3602,24 +2344,27 @@
           <w:b/>
           <w:bCs/>
         </w:rPr>
+        <w:t>Creates a valid DailyReturnRequest with all fields populated and asserts zero constraint violations</w:t>
+      </w:r>
+    </w:p>
+    <w:p>
+      <w:pPr>
+        <w:numPr>
+          <w:ilvl w:val="0"/>
+          <w:numId w:val="9"/>
+        </w:numPr>
+        <w:rPr>
+          <w:b/>
+          <w:bCs/>
+        </w:rPr>
+      </w:pPr>
+      <w:r>
+        <w:rPr>
+          <w:b/>
+          <w:bCs/>
+        </w:rPr>
         <w:lastRenderedPageBreak/>
-        <w:t xml:space="preserve">Creates a valid </w:t>
-      </w:r>
-      <w:proofErr w:type="spellStart"/>
-      <w:r>
-        <w:rPr>
-          <w:b/>
-          <w:bCs/>
-        </w:rPr>
-        <w:t>DailyReturnRequest</w:t>
-      </w:r>
-      <w:proofErr w:type="spellEnd"/>
-      <w:r>
-        <w:rPr>
-          <w:b/>
-          <w:bCs/>
-        </w:rPr>
-        <w:t xml:space="preserve"> with all fields populated and asserts zero constraint violations</w:t>
+        <w:t>Creates a request with portfolioId as blank and asserts exactly 1 violation on the portfolioId field</w:t>
       </w:r>
     </w:p>
     <w:p>
@@ -3638,39 +2383,7 @@
           <w:b/>
           <w:bCs/>
         </w:rPr>
-        <w:t xml:space="preserve">Creates a request with </w:t>
-      </w:r>
-      <w:proofErr w:type="spellStart"/>
-      <w:r>
-        <w:rPr>
-          <w:b/>
-          <w:bCs/>
-        </w:rPr>
-        <w:t>portfolioId</w:t>
-      </w:r>
-      <w:proofErr w:type="spellEnd"/>
-      <w:r>
-        <w:rPr>
-          <w:b/>
-          <w:bCs/>
-        </w:rPr>
-        <w:t xml:space="preserve"> as blank and asserts exactly 1 violation on the </w:t>
-      </w:r>
-      <w:proofErr w:type="spellStart"/>
-      <w:r>
-        <w:rPr>
-          <w:b/>
-          <w:bCs/>
-        </w:rPr>
-        <w:t>portfolioId</w:t>
-      </w:r>
-      <w:proofErr w:type="spellEnd"/>
-      <w:r>
-        <w:rPr>
-          <w:b/>
-          <w:bCs/>
-        </w:rPr>
-        <w:t xml:space="preserve"> field</w:t>
+        <w:t>Creates a request with currency as null and asserts exactly 1 violation on the currency field</w:t>
       </w:r>
     </w:p>
     <w:p>
@@ -3689,89 +2402,22 @@
           <w:b/>
           <w:bCs/>
         </w:rPr>
-        <w:t>Creates a request with currency as null and asserts exactly 1 violation on the currency field</w:t>
-      </w:r>
-    </w:p>
-    <w:p>
-      <w:pPr>
-        <w:numPr>
-          <w:ilvl w:val="0"/>
-          <w:numId w:val="9"/>
-        </w:numPr>
-        <w:rPr>
-          <w:b/>
-          <w:bCs/>
-        </w:rPr>
-      </w:pPr>
-      <w:r>
-        <w:rPr>
-          <w:b/>
-          <w:bCs/>
-        </w:rPr>
-        <w:t xml:space="preserve">Creates a request with </w:t>
-      </w:r>
-      <w:proofErr w:type="spellStart"/>
-      <w:r>
-        <w:rPr>
-          <w:b/>
-          <w:bCs/>
-        </w:rPr>
-        <w:t>valuationDate</w:t>
-      </w:r>
-      <w:proofErr w:type="spellEnd"/>
-      <w:r>
-        <w:rPr>
-          <w:b/>
-          <w:bCs/>
-        </w:rPr>
-        <w:t xml:space="preserve"> as null and asserts exactly 1 violation on the </w:t>
-      </w:r>
-      <w:proofErr w:type="spellStart"/>
-      <w:r>
-        <w:rPr>
-          <w:b/>
-          <w:bCs/>
-        </w:rPr>
-        <w:t>valuationDate</w:t>
-      </w:r>
-      <w:proofErr w:type="spellEnd"/>
-      <w:r>
-        <w:rPr>
-          <w:b/>
-          <w:bCs/>
-        </w:rPr>
-        <w:t xml:space="preserve"> field</w:t>
-      </w:r>
-    </w:p>
-    <w:p>
-      <w:pPr>
-        <w:rPr>
-          <w:b/>
-          <w:bCs/>
-        </w:rPr>
-      </w:pPr>
-      <w:r>
-        <w:rPr>
-          <w:b/>
-          <w:bCs/>
-        </w:rPr>
-        <w:t xml:space="preserve">Run </w:t>
-      </w:r>
-      <w:proofErr w:type="spellStart"/>
-      <w:r>
-        <w:rPr>
-          <w:b/>
-          <w:bCs/>
-        </w:rPr>
-        <w:t>mvn</w:t>
-      </w:r>
-      <w:proofErr w:type="spellEnd"/>
-      <w:r>
-        <w:rPr>
-          <w:b/>
-          <w:bCs/>
-        </w:rPr>
-        <w:t xml:space="preserve"> test. All validation assertions must pass before proceeding.</w:t>
+        <w:t>Creates a request with valuationDate as null and asserts exactly 1 violation on the valuationDate field</w:t>
+      </w:r>
+    </w:p>
+    <w:p>
+      <w:pPr>
+        <w:rPr>
+          <w:b/>
+          <w:bCs/>
+        </w:rPr>
+      </w:pPr>
+      <w:r>
+        <w:rPr>
+          <w:b/>
+          <w:bCs/>
+        </w:rPr>
+        <w:t>Run mvn test. All validation assertions must pass before proceeding.</w:t>
       </w:r>
     </w:p>
     <w:p>
@@ -3787,7 +2433,7 @@
           <w:bCs/>
         </w:rPr>
         <w:pict w14:anchorId="590468C4">
-          <v:rect id="_x0000_i1040" style="width:0;height:1.5pt" o:hralign="center" o:hrstd="t" o:hr="t" fillcolor="#a0a0a0" stroked="f"/>
+          <v:rect id="_x0000_i1030" style="width:0;height:1.5pt" o:hralign="center" o:hrstd="t" o:hr="t" fillcolor="#a0a0a0" stroked="f"/>
         </w:pict>
       </w:r>
     </w:p>
@@ -3798,6 +2444,1253 @@
           <w:bCs/>
         </w:rPr>
       </w:pPr>
+      <w:r>
+        <w:rPr>
+          <w:b/>
+          <w:bCs/>
+        </w:rPr>
+        <w:t>Step 6: Implement the Core Calculation and Business Rules Service</w:t>
+      </w:r>
+    </w:p>
+    <w:p>
+      <w:pPr>
+        <w:rPr>
+          <w:b/>
+          <w:bCs/>
+        </w:rPr>
+      </w:pPr>
+      <w:r>
+        <w:rPr>
+          <w:b/>
+          <w:bCs/>
+        </w:rPr>
+        <w:t>Prompt: In the service/ package, create an interface PerformanceCalculationService with a single method signature that accepts a DailyReturnRequest and returns a DailyReturnResponse.</w:t>
+      </w:r>
+    </w:p>
+    <w:p>
+      <w:pPr>
+        <w:rPr>
+          <w:b/>
+          <w:bCs/>
+        </w:rPr>
+      </w:pPr>
+      <w:r>
+        <w:rPr>
+          <w:b/>
+          <w:bCs/>
+        </w:rPr>
+        <w:t>Then create the implementation class PerformanceCalculationServiceImpl annotated with @Service. Implement the complete business logic in strict priority order as follows:</w:t>
+      </w:r>
+    </w:p>
+    <w:p>
+      <w:pPr>
+        <w:rPr>
+          <w:b/>
+          <w:bCs/>
+        </w:rPr>
+      </w:pPr>
+      <w:r>
+        <w:rPr>
+          <w:b/>
+          <w:bCs/>
+        </w:rPr>
+        <w:t>Rule evaluation sequence (apply in this exact order):</w:t>
+      </w:r>
+    </w:p>
+    <w:p>
+      <w:pPr>
+        <w:numPr>
+          <w:ilvl w:val="0"/>
+          <w:numId w:val="10"/>
+        </w:numPr>
+        <w:rPr>
+          <w:b/>
+          <w:bCs/>
+        </w:rPr>
+      </w:pPr>
+      <w:r>
+        <w:rPr>
+          <w:b/>
+          <w:bCs/>
+        </w:rPr>
+        <w:t>INVALID_INPUT — Negative market values: If beginMarketValue is less than zero OR endMarketValue is less than zero, immediately return a response with status INVALID_INPUT, a reason string "Begin or end market value cannot be negative", null for return percentages, and processedAt set to Instant.now().</w:t>
+      </w:r>
+    </w:p>
+    <w:p>
+      <w:pPr>
+        <w:numPr>
+          <w:ilvl w:val="0"/>
+          <w:numId w:val="10"/>
+        </w:numPr>
+        <w:rPr>
+          <w:b/>
+          <w:bCs/>
+        </w:rPr>
+      </w:pPr>
+      <w:r>
+        <w:rPr>
+          <w:b/>
+          <w:bCs/>
+        </w:rPr>
+        <w:t>INVALID_INPUT — Missing/unsupported currency: If currency is blank or not one of the supported values (USD, GBP, EUR, CAD, AUD), return INVALID_INPUT with reason "Currency is missing or not supported".</w:t>
+      </w:r>
+    </w:p>
+    <w:p>
+      <w:pPr>
+        <w:numPr>
+          <w:ilvl w:val="0"/>
+          <w:numId w:val="10"/>
+        </w:numPr>
+        <w:rPr>
+          <w:b/>
+          <w:bCs/>
+        </w:rPr>
+      </w:pPr>
+      <w:r>
+        <w:rPr>
+          <w:b/>
+          <w:bCs/>
+        </w:rPr>
+        <w:t>INVALID_INPUT — Zero begin value with non-zero end value: If beginMarketValue equals zero AND endMarketValue does not equal zero, return INVALID_INPUT with reason "Cannot calculate return: begin value is zero but end value is non-zero".</w:t>
+      </w:r>
+    </w:p>
+    <w:p>
+      <w:pPr>
+        <w:numPr>
+          <w:ilvl w:val="0"/>
+          <w:numId w:val="10"/>
+        </w:numPr>
+        <w:rPr>
+          <w:b/>
+          <w:bCs/>
+        </w:rPr>
+      </w:pPr>
+      <w:r>
+        <w:rPr>
+          <w:b/>
+          <w:bCs/>
+        </w:rPr>
+        <w:t>Handle zero begin value / zero-to-zero case: If beginMarketValue equals zero AND endMarketValue equals zero, set portfolioReturnPct to BigDecimal.ZERO and proceed to status evaluation.</w:t>
+      </w:r>
+    </w:p>
+    <w:p>
+      <w:pPr>
+        <w:numPr>
+          <w:ilvl w:val="0"/>
+          <w:numId w:val="10"/>
+        </w:numPr>
+        <w:rPr>
+          <w:b/>
+          <w:bCs/>
+        </w:rPr>
+      </w:pPr>
+      <w:r>
+        <w:rPr>
+          <w:b/>
+          <w:bCs/>
+        </w:rPr>
+        <w:t>Calculate portfolio return: Using the formula ((endValue - beginValue - netCashFlow) / beginValue) * 100. Use BigDecimal arithmetic throughout with RoundingMode.HALF_UP and scale of 4 decimal places for intermediate calculations, but round the final portfolioReturnPct to 2 decimal places.</w:t>
+      </w:r>
+    </w:p>
+    <w:p>
+      <w:pPr>
+        <w:numPr>
+          <w:ilvl w:val="0"/>
+          <w:numId w:val="10"/>
+        </w:numPr>
+        <w:rPr>
+          <w:b/>
+          <w:bCs/>
+        </w:rPr>
+      </w:pPr>
+      <w:r>
+        <w:rPr>
+          <w:b/>
+          <w:bCs/>
+        </w:rPr>
+        <w:t>Calculate excess return: portfolioReturnPct - benchmarkReturnPct, rounded to 2 decimal places.</w:t>
+      </w:r>
+    </w:p>
+    <w:p>
+      <w:pPr>
+        <w:numPr>
+          <w:ilvl w:val="0"/>
+          <w:numId w:val="10"/>
+        </w:numPr>
+        <w:rPr>
+          <w:b/>
+          <w:bCs/>
+        </w:rPr>
+      </w:pPr>
+      <w:r>
+        <w:rPr>
+          <w:b/>
+          <w:bCs/>
+        </w:rPr>
+        <w:t>REVIEW_REQUIRED checks (collect ALL that apply into reasons list):</w:t>
+      </w:r>
+    </w:p>
+    <w:p>
+      <w:pPr>
+        <w:numPr>
+          <w:ilvl w:val="1"/>
+          <w:numId w:val="10"/>
+        </w:numPr>
+        <w:rPr>
+          <w:b/>
+          <w:bCs/>
+        </w:rPr>
+      </w:pPr>
+      <w:r>
+        <w:rPr>
+          <w:b/>
+          <w:bCs/>
+        </w:rPr>
+        <w:t>If |portfolioReturnPct - benchmarkReturnPct| &gt; 5.0, add reason: "Portfolio return deviates from benchmark by more than 5%"</w:t>
+      </w:r>
+    </w:p>
+    <w:p>
+      <w:pPr>
+        <w:numPr>
+          <w:ilvl w:val="1"/>
+          <w:numId w:val="10"/>
+        </w:numPr>
+        <w:rPr>
+          <w:b/>
+          <w:bCs/>
+        </w:rPr>
+      </w:pPr>
+      <w:r>
+        <w:rPr>
+          <w:b/>
+          <w:bCs/>
+        </w:rPr>
+        <w:t>If |netCashFlow| &gt; 0.20 * beginMarketValue, add reason: "Net cash flow exceeds 20% of begin market value"</w:t>
+      </w:r>
+    </w:p>
+    <w:p>
+      <w:pPr>
+        <w:numPr>
+          <w:ilvl w:val="0"/>
+          <w:numId w:val="10"/>
+        </w:numPr>
+        <w:rPr>
+          <w:b/>
+          <w:bCs/>
+        </w:rPr>
+      </w:pPr>
+      <w:r>
+        <w:rPr>
+          <w:b/>
+          <w:bCs/>
+        </w:rPr>
+        <w:lastRenderedPageBreak/>
+        <w:t>Status decision: If the reasons list is non-empty → REVIEW_REQUIRED. Otherwise → VALID.</w:t>
+      </w:r>
+    </w:p>
+    <w:p>
+      <w:pPr>
+        <w:numPr>
+          <w:ilvl w:val="0"/>
+          <w:numId w:val="10"/>
+        </w:numPr>
+        <w:rPr>
+          <w:b/>
+          <w:bCs/>
+        </w:rPr>
+      </w:pPr>
+      <w:r>
+        <w:rPr>
+          <w:b/>
+          <w:bCs/>
+        </w:rPr>
+        <w:t>Persist the audit record using DailyReturnAuditRepository before returning. Store reasons as a comma-joined string.</w:t>
+      </w:r>
+    </w:p>
+    <w:p>
+      <w:pPr>
+        <w:rPr>
+          <w:b/>
+          <w:bCs/>
+        </w:rPr>
+      </w:pPr>
+      <w:r>
+        <w:rPr>
+          <w:b/>
+          <w:bCs/>
+        </w:rPr>
+        <w:t>Use BigDecimal.ZERO.compareTo(value) == 0 for zero comparisons (never use == on BigDecimal). Inject the repository via constructor injection.</w:t>
+      </w:r>
+    </w:p>
+    <w:p>
+      <w:pPr>
+        <w:rPr>
+          <w:b/>
+          <w:bCs/>
+        </w:rPr>
+      </w:pPr>
+      <w:r>
+        <w:rPr>
+          <w:b/>
+          <w:bCs/>
+        </w:rPr>
+        <w:t>Validation Gate: Write a pure unit test class PerformanceCalculationServiceImplTest that mocks the repository using Mockito (@ExtendWith(MockitoExtension.class)) and tests the following 7 scenarios:</w:t>
+      </w:r>
+    </w:p>
+    <w:p>
+      <w:pPr>
+        <w:numPr>
+          <w:ilvl w:val="0"/>
+          <w:numId w:val="11"/>
+        </w:numPr>
+        <w:rPr>
+          <w:b/>
+          <w:bCs/>
+        </w:rPr>
+      </w:pPr>
+      <w:r>
+        <w:rPr>
+          <w:b/>
+          <w:bCs/>
+        </w:rPr>
+        <w:t>Happy path VALID: beginValue=1,000,000 / endValue=1,035,000 / netCashFlow=10,000 / benchmarkReturnPct=1.8 → assert status=VALID, portfolioReturnPct=2.50, excessReturnPct=0.70, reasons list is empty</w:t>
+      </w:r>
+    </w:p>
+    <w:p>
+      <w:pPr>
+        <w:numPr>
+          <w:ilvl w:val="0"/>
+          <w:numId w:val="11"/>
+        </w:numPr>
+        <w:rPr>
+          <w:b/>
+          <w:bCs/>
+        </w:rPr>
+      </w:pPr>
+      <w:r>
+        <w:rPr>
+          <w:b/>
+          <w:bCs/>
+        </w:rPr>
+        <w:t>REVIEW_REQUIRED — benchmark deviation: beginValue=1,000,000 / endValue=1,080,000 / netCashFlow=0 / benchmarkReturnPct=1.0 → assert status=REVIEW_REQUIRED, reasons list contains the benchmark deviation message</w:t>
+      </w:r>
+    </w:p>
+    <w:p>
+      <w:pPr>
+        <w:numPr>
+          <w:ilvl w:val="0"/>
+          <w:numId w:val="11"/>
+        </w:numPr>
+        <w:rPr>
+          <w:b/>
+          <w:bCs/>
+        </w:rPr>
+      </w:pPr>
+      <w:r>
+        <w:rPr>
+          <w:b/>
+          <w:bCs/>
+        </w:rPr>
+        <w:t>REVIEW_REQUIRED — cash flow threshold: beginValue=1,000,000 / endValue=1,010,000 / netCashFlow=250,000 / benchmarkReturnPct=1.0 → assert status=REVIEW_REQUIRED, reasons contains cash flow message</w:t>
+      </w:r>
+    </w:p>
+    <w:p>
+      <w:pPr>
+        <w:numPr>
+          <w:ilvl w:val="0"/>
+          <w:numId w:val="11"/>
+        </w:numPr>
+        <w:rPr>
+          <w:b/>
+          <w:bCs/>
+        </w:rPr>
+      </w:pPr>
+      <w:r>
+        <w:rPr>
+          <w:b/>
+          <w:bCs/>
+        </w:rPr>
+        <w:t>INVALID_INPUT — negative begin value: beginValue=-500 → assert status=INVALID_INPUT, portfolioReturnPct is null</w:t>
+      </w:r>
+    </w:p>
+    <w:p>
+      <w:pPr>
+        <w:numPr>
+          <w:ilvl w:val="0"/>
+          <w:numId w:val="11"/>
+        </w:numPr>
+        <w:rPr>
+          <w:b/>
+          <w:bCs/>
+        </w:rPr>
+      </w:pPr>
+      <w:r>
+        <w:rPr>
+          <w:b/>
+          <w:bCs/>
+        </w:rPr>
+        <w:t>INVALID_INPUT — negative end value: beginValue=1000, endValue=-100 → assert status=INVALID_INPUT</w:t>
+      </w:r>
+    </w:p>
+    <w:p>
+      <w:pPr>
+        <w:numPr>
+          <w:ilvl w:val="0"/>
+          <w:numId w:val="11"/>
+        </w:numPr>
+        <w:rPr>
+          <w:b/>
+          <w:bCs/>
+        </w:rPr>
+      </w:pPr>
+      <w:r>
+        <w:rPr>
+          <w:b/>
+          <w:bCs/>
+        </w:rPr>
+        <w:t>INVALID_INPUT — missing currency: currency="" → assert status=INVALID_INPUT</w:t>
+      </w:r>
+    </w:p>
+    <w:p>
+      <w:pPr>
+        <w:numPr>
+          <w:ilvl w:val="0"/>
+          <w:numId w:val="11"/>
+        </w:numPr>
+        <w:rPr>
+          <w:b/>
+          <w:bCs/>
+        </w:rPr>
+      </w:pPr>
+      <w:r>
+        <w:rPr>
+          <w:b/>
+          <w:bCs/>
+        </w:rPr>
+        <w:t>INVALID_INPUT — zero begin, non-zero end: beginValue=0, endValue=50,000 → assert status=INVALID_INPUT</w:t>
+      </w:r>
+    </w:p>
+    <w:p>
+      <w:pPr>
+        <w:rPr>
+          <w:b/>
+          <w:bCs/>
+        </w:rPr>
+      </w:pPr>
+      <w:r>
+        <w:rPr>
+          <w:b/>
+          <w:bCs/>
+        </w:rPr>
+        <w:t>Run mvn test. All 7 tests must pass with no failures before proceeding.</w:t>
+      </w:r>
+    </w:p>
+    <w:p>
+      <w:pPr>
+        <w:rPr>
+          <w:b/>
+          <w:bCs/>
+        </w:rPr>
+      </w:pPr>
+      <w:r>
+        <w:rPr>
+          <w:b/>
+          <w:bCs/>
+        </w:rPr>
+        <w:pict w14:anchorId="106E8162">
+          <v:rect id="_x0000_i1031" style="width:0;height:1.5pt" o:hralign="center" o:hrstd="t" o:hr="t" fillcolor="#a0a0a0" stroked="f"/>
+        </w:pict>
+      </w:r>
+    </w:p>
+    <w:p>
+      <w:pPr>
+        <w:rPr>
+          <w:b/>
+          <w:bCs/>
+        </w:rPr>
+      </w:pPr>
+      <w:r>
+        <w:rPr>
+          <w:b/>
+          <w:bCs/>
+        </w:rPr>
+        <w:t>Step 7: Implement the Exception Handler</w:t>
+      </w:r>
+    </w:p>
+    <w:p>
+      <w:pPr>
+        <w:rPr>
+          <w:b/>
+          <w:bCs/>
+        </w:rPr>
+      </w:pPr>
+      <w:r>
+        <w:rPr>
+          <w:b/>
+          <w:bCs/>
+        </w:rPr>
+        <w:t>Prompt: In the exception/ package, create a GlobalExceptionHandler class annotated with @RestControllerAdvice. This class intercepts exceptions thrown across all controllers and returns structured JSON error responses instead of Spring's default error pages.</w:t>
+      </w:r>
+    </w:p>
+    <w:p>
+      <w:pPr>
+        <w:rPr>
+          <w:b/>
+          <w:bCs/>
+        </w:rPr>
+      </w:pPr>
+      <w:r>
+        <w:rPr>
+          <w:b/>
+          <w:bCs/>
+        </w:rPr>
+        <w:t>Create a simple inner or separate class ErrorResponse (or a Java record) with fields: timestamp (Instant), status (int), error (String), message (String), path (String).</w:t>
+      </w:r>
+    </w:p>
+    <w:p>
+      <w:pPr>
+        <w:rPr>
+          <w:b/>
+          <w:bCs/>
+        </w:rPr>
+      </w:pPr>
+      <w:r>
+        <w:rPr>
+          <w:b/>
+          <w:bCs/>
+        </w:rPr>
+        <w:t>Handle the following exception types in the global handler:</w:t>
+      </w:r>
+    </w:p>
+    <w:p>
+      <w:pPr>
+        <w:numPr>
+          <w:ilvl w:val="0"/>
+          <w:numId w:val="12"/>
+        </w:numPr>
+        <w:rPr>
+          <w:b/>
+          <w:bCs/>
+        </w:rPr>
+      </w:pPr>
+      <w:r>
+        <w:rPr>
+          <w:b/>
+          <w:bCs/>
+        </w:rPr>
+        <w:t>MethodArgumentNotValidException — thrown when @Valid fails on the request body. Extract all field errors from ex.getBindingResult().getFieldErrors(), join them into a single message string like "portfolioId: must not be blank; currency: must not be blank", return HTTP 400 with error "Validation Failed".</w:t>
+      </w:r>
+    </w:p>
+    <w:p>
+      <w:pPr>
+        <w:numPr>
+          <w:ilvl w:val="0"/>
+          <w:numId w:val="12"/>
+        </w:numPr>
+        <w:rPr>
+          <w:b/>
+          <w:bCs/>
+        </w:rPr>
+      </w:pPr>
+      <w:r>
+        <w:rPr>
+          <w:b/>
+          <w:bCs/>
+        </w:rPr>
+        <w:lastRenderedPageBreak/>
+        <w:t>HttpMessageNotReadableException — thrown when the request body JSON is malformed or a field type is wrong (e.g., string where a number is expected). Return HTTP 400 with error "Malformed Request" and message "Request body is missing or cannot be parsed".</w:t>
+      </w:r>
+    </w:p>
+    <w:p>
+      <w:pPr>
+        <w:numPr>
+          <w:ilvl w:val="0"/>
+          <w:numId w:val="12"/>
+        </w:numPr>
+        <w:rPr>
+          <w:b/>
+          <w:bCs/>
+        </w:rPr>
+      </w:pPr>
+      <w:r>
+        <w:rPr>
+          <w:b/>
+          <w:bCs/>
+        </w:rPr>
+        <w:t>Exception (catch-all)** — return HTTP 500 with error "Internal Server Error" and message "An unexpected error occurred".</w:t>
+      </w:r>
+    </w:p>
+    <w:p>
+      <w:pPr>
+        <w:rPr>
+          <w:b/>
+          <w:bCs/>
+        </w:rPr>
+      </w:pPr>
+      <w:r>
+        <w:rPr>
+          <w:b/>
+          <w:bCs/>
+        </w:rPr>
+        <w:t>For each handler method, inject HttpServletRequest to extract the request URI for the path field.</w:t>
+      </w:r>
+    </w:p>
+    <w:p>
+      <w:pPr>
+        <w:rPr>
+          <w:b/>
+          <w:bCs/>
+        </w:rPr>
+      </w:pPr>
+      <w:r>
+        <w:rPr>
+          <w:b/>
+          <w:bCs/>
+        </w:rPr>
+        <w:t>Validation Gate: Start the application with mvn spring-boot:run. Use curl or Postman to send the following requests and verify the responses:</w:t>
+      </w:r>
+    </w:p>
+    <w:p>
+      <w:pPr>
+        <w:numPr>
+          <w:ilvl w:val="0"/>
+          <w:numId w:val="13"/>
+        </w:numPr>
+        <w:rPr>
+          <w:b/>
+          <w:bCs/>
+        </w:rPr>
+      </w:pPr>
+      <w:r>
+        <w:rPr>
+          <w:b/>
+          <w:bCs/>
+        </w:rPr>
+        <w:t>Send a POST to /api/performance/daily-return with an empty JSON body {} → expect HTTP 400 with a JSON body containing "error": "Validation Failed" and a message listing the missing fields (the controller does not exist yet, so first verify the handler class compiles cleanly with mvn compile)</w:t>
+      </w:r>
+    </w:p>
+    <w:p>
+      <w:pPr>
+        <w:numPr>
+          <w:ilvl w:val="0"/>
+          <w:numId w:val="13"/>
+        </w:numPr>
+        <w:rPr>
+          <w:b/>
+          <w:bCs/>
+        </w:rPr>
+      </w:pPr>
+      <w:r>
+        <w:rPr>
+          <w:b/>
+          <w:bCs/>
+        </w:rPr>
+        <w:t>Run mvn test to confirm no regressions from previous steps before proceeding.</w:t>
+      </w:r>
+    </w:p>
+    <w:p>
+      <w:pPr>
+        <w:rPr>
+          <w:b/>
+          <w:bCs/>
+        </w:rPr>
+      </w:pPr>
+      <w:r>
+        <w:rPr>
+          <w:b/>
+          <w:bCs/>
+        </w:rPr>
+        <w:pict w14:anchorId="7A663FED">
+          <v:rect id="_x0000_i1032" style="width:0;height:1.5pt" o:hralign="center" o:hrstd="t" o:hr="t" fillcolor="#a0a0a0" stroked="f"/>
+        </w:pict>
+      </w:r>
+    </w:p>
+    <w:p>
+      <w:pPr>
+        <w:rPr>
+          <w:b/>
+          <w:bCs/>
+        </w:rPr>
+      </w:pPr>
+      <w:r>
+        <w:rPr>
+          <w:b/>
+          <w:bCs/>
+        </w:rPr>
+        <w:t>Step 8: Implement the REST Controller</w:t>
+      </w:r>
+    </w:p>
+    <w:p>
+      <w:pPr>
+        <w:rPr>
+          <w:b/>
+          <w:bCs/>
+        </w:rPr>
+      </w:pPr>
+      <w:r>
+        <w:rPr>
+          <w:b/>
+          <w:bCs/>
+        </w:rPr>
+        <w:t>Prompt: In the controller/ package, create PerformanceController annotated with @RestController and @RequestMapping("/api/performance").</w:t>
+      </w:r>
+    </w:p>
+    <w:p>
+      <w:pPr>
+        <w:rPr>
+          <w:b/>
+          <w:bCs/>
+        </w:rPr>
+      </w:pPr>
+      <w:r>
+        <w:rPr>
+          <w:b/>
+          <w:bCs/>
+        </w:rPr>
+        <w:t>Inject PerformanceCalculationService via constructor injection.</w:t>
+      </w:r>
+    </w:p>
+    <w:p>
+      <w:pPr>
+        <w:rPr>
+          <w:b/>
+          <w:bCs/>
+        </w:rPr>
+      </w:pPr>
+      <w:r>
+        <w:rPr>
+          <w:b/>
+          <w:bCs/>
+        </w:rPr>
+        <w:t>Implement a single endpoint:</w:t>
+      </w:r>
+    </w:p>
+    <w:p>
+      <w:pPr>
+        <w:numPr>
+          <w:ilvl w:val="0"/>
+          <w:numId w:val="14"/>
+        </w:numPr>
+        <w:rPr>
+          <w:b/>
+          <w:bCs/>
+        </w:rPr>
+      </w:pPr>
+      <w:r>
+        <w:rPr>
+          <w:b/>
+          <w:bCs/>
+        </w:rPr>
+        <w:t>Method: POST</w:t>
+      </w:r>
+    </w:p>
+    <w:p>
+      <w:pPr>
+        <w:numPr>
+          <w:ilvl w:val="0"/>
+          <w:numId w:val="14"/>
+        </w:numPr>
+        <w:rPr>
+          <w:b/>
+          <w:bCs/>
+        </w:rPr>
+      </w:pPr>
+      <w:r>
+        <w:rPr>
+          <w:b/>
+          <w:bCs/>
+        </w:rPr>
+        <w:t>Path: /daily-return</w:t>
+      </w:r>
+    </w:p>
+    <w:p>
+      <w:pPr>
+        <w:numPr>
+          <w:ilvl w:val="0"/>
+          <w:numId w:val="14"/>
+        </w:numPr>
+        <w:rPr>
+          <w:b/>
+          <w:bCs/>
+        </w:rPr>
+      </w:pPr>
+      <w:r>
+        <w:rPr>
+          <w:b/>
+          <w:bCs/>
+        </w:rPr>
+        <w:t>Request body: @RequestBody @Valid DailyReturnRequest request</w:t>
+      </w:r>
+    </w:p>
+    <w:p>
+      <w:pPr>
+        <w:numPr>
+          <w:ilvl w:val="0"/>
+          <w:numId w:val="14"/>
+        </w:numPr>
+        <w:rPr>
+          <w:b/>
+          <w:bCs/>
+        </w:rPr>
+      </w:pPr>
+      <w:r>
+        <w:rPr>
+          <w:b/>
+          <w:bCs/>
+        </w:rPr>
+        <w:t>Returns: ResponseEntity&lt;DailyReturnResponse&gt;</w:t>
+      </w:r>
+    </w:p>
+    <w:p>
+      <w:pPr>
+        <w:rPr>
+          <w:b/>
+          <w:bCs/>
+        </w:rPr>
+      </w:pPr>
+      <w:r>
+        <w:rPr>
+          <w:b/>
+          <w:bCs/>
+        </w:rPr>
+        <w:t>The method logic:</w:t>
+      </w:r>
+    </w:p>
+    <w:p>
+      <w:pPr>
+        <w:numPr>
+          <w:ilvl w:val="0"/>
+          <w:numId w:val="15"/>
+        </w:numPr>
+        <w:rPr>
+          <w:b/>
+          <w:bCs/>
+        </w:rPr>
+      </w:pPr>
+      <w:r>
+        <w:rPr>
+          <w:b/>
+          <w:bCs/>
+        </w:rPr>
+        <w:t>Delegate entirely to performanceCalculationService.calculate(request)</w:t>
+      </w:r>
+    </w:p>
+    <w:p>
+      <w:pPr>
+        <w:numPr>
+          <w:ilvl w:val="0"/>
+          <w:numId w:val="15"/>
+        </w:numPr>
+        <w:rPr>
+          <w:b/>
+          <w:bCs/>
+        </w:rPr>
+      </w:pPr>
+      <w:r>
+        <w:rPr>
+          <w:b/>
+          <w:bCs/>
+        </w:rPr>
+        <w:t xml:space="preserve">Inspect the returned response's status field: </w:t>
+      </w:r>
+    </w:p>
+    <w:p>
+      <w:pPr>
+        <w:numPr>
+          <w:ilvl w:val="1"/>
+          <w:numId w:val="15"/>
+        </w:numPr>
+        <w:rPr>
+          <w:b/>
+          <w:bCs/>
+        </w:rPr>
+      </w:pPr>
+      <w:r>
+        <w:rPr>
+          <w:b/>
+          <w:bCs/>
+        </w:rPr>
+        <w:t>If status is INVALID_INPUT → return ResponseEntity with HTTP 422 Unprocessable Entity</w:t>
+      </w:r>
+    </w:p>
+    <w:p>
+      <w:pPr>
+        <w:numPr>
+          <w:ilvl w:val="1"/>
+          <w:numId w:val="15"/>
+        </w:numPr>
+        <w:rPr>
+          <w:b/>
+          <w:bCs/>
+        </w:rPr>
+      </w:pPr>
+      <w:r>
+        <w:rPr>
+          <w:b/>
+          <w:bCs/>
+        </w:rPr>
+        <w:t>If status is REVIEW_REQUIRED → return ResponseEntity with HTTP 200 OK</w:t>
+      </w:r>
+    </w:p>
+    <w:p>
+      <w:pPr>
+        <w:numPr>
+          <w:ilvl w:val="1"/>
+          <w:numId w:val="15"/>
+        </w:numPr>
+        <w:rPr>
+          <w:b/>
+          <w:bCs/>
+        </w:rPr>
+      </w:pPr>
+      <w:r>
+        <w:rPr>
+          <w:b/>
+          <w:bCs/>
+        </w:rPr>
+        <w:t>If status is VALID → return ResponseEntity with HTTP 200 OK</w:t>
+      </w:r>
+    </w:p>
+    <w:p>
+      <w:pPr>
+        <w:numPr>
+          <w:ilvl w:val="0"/>
+          <w:numId w:val="15"/>
+        </w:numPr>
+        <w:rPr>
+          <w:b/>
+          <w:bCs/>
+        </w:rPr>
+      </w:pPr>
+      <w:r>
+        <w:rPr>
+          <w:b/>
+          <w:bCs/>
+        </w:rPr>
+        <w:t>Always return the full DailyReturnResponse body regardless of status</w:t>
+      </w:r>
+    </w:p>
+    <w:p>
+      <w:pPr>
+        <w:rPr>
+          <w:b/>
+          <w:bCs/>
+        </w:rPr>
+      </w:pPr>
+      <w:r>
+        <w:rPr>
+          <w:b/>
+          <w:bCs/>
+        </w:rPr>
+        <w:t>Add @Slf4j (Lombok) and log at INFO level: the portfolioId, valuationDate, and resulting status for every request processed.</w:t>
+      </w:r>
+      <w:r>
+        <w:rPr>
+          <w:b/>
+          <w:bCs/>
+        </w:rPr>
+        <w:t xml:space="preserve"> Add Junit test case </w:t>
+      </w:r>
+      <w:r>
+        <w:rPr>
+          <w:b/>
+          <w:bCs/>
+        </w:rPr>
+        <w:t>PerformanceController</w:t>
+      </w:r>
+      <w:r>
+        <w:rPr>
+          <w:b/>
+          <w:bCs/>
+        </w:rPr>
+        <w:t xml:space="preserve">Test for </w:t>
+      </w:r>
+      <w:r>
+        <w:rPr>
+          <w:b/>
+          <w:bCs/>
+        </w:rPr>
+        <w:t>PerformanceController</w:t>
+      </w:r>
+      <w:r>
+        <w:rPr>
+          <w:b/>
+          <w:bCs/>
+        </w:rPr>
+        <w:t>.</w:t>
+      </w:r>
+    </w:p>
+    <w:p>
+      <w:pPr>
+        <w:rPr>
+          <w:b/>
+          <w:bCs/>
+        </w:rPr>
+      </w:pPr>
+      <w:r>
+        <w:rPr>
+          <w:b/>
+          <w:bCs/>
+        </w:rPr>
+        <w:lastRenderedPageBreak/>
+        <w:t>Validation Gate: Run mvn spring-boot:run. Execute the following curl commands and verify each response precisely:</w:t>
+      </w:r>
+    </w:p>
+    <w:p>
+      <w:pPr>
+        <w:rPr>
+          <w:b/>
+          <w:bCs/>
+        </w:rPr>
+      </w:pPr>
+      <w:r>
+        <w:rPr>
+          <w:b/>
+          <w:bCs/>
+        </w:rPr>
+        <w:t># Test 1 - Expected: 200 VALID</w:t>
+      </w:r>
+    </w:p>
+    <w:p>
+      <w:pPr>
+        <w:rPr>
+          <w:b/>
+          <w:bCs/>
+        </w:rPr>
+      </w:pPr>
+      <w:r>
+        <w:rPr>
+          <w:b/>
+          <w:bCs/>
+        </w:rPr>
+        <w:t xml:space="preserve">curl -X POST </w:t>
+      </w:r>
+      <w:r>
+        <w:rPr>
+          <w:b/>
+          <w:bCs/>
+        </w:rPr>
+        <w:t>http://localhost:8080/portfolio-performance-service/api/</w:t>
+      </w:r>
+      <w:r>
+        <w:rPr>
+          <w:b/>
+          <w:bCs/>
+        </w:rPr>
+        <w:t>performance/daily-return \</w:t>
+      </w:r>
+    </w:p>
+    <w:p>
+      <w:pPr>
+        <w:rPr>
+          <w:b/>
+          <w:bCs/>
+        </w:rPr>
+      </w:pPr>
+      <w:r>
+        <w:rPr>
+          <w:b/>
+          <w:bCs/>
+        </w:rPr>
+        <w:t xml:space="preserve">  -H "Content-Type: application/json" \</w:t>
+      </w:r>
+    </w:p>
+    <w:p>
+      <w:pPr>
+        <w:rPr>
+          <w:b/>
+          <w:bCs/>
+        </w:rPr>
+      </w:pPr>
+      <w:r>
+        <w:rPr>
+          <w:b/>
+          <w:bCs/>
+        </w:rPr>
+        <w:t xml:space="preserve">  -d '{"portfolioId":"PF-1001","valuationDate":"2026-06-14","beginMarketValue":1000000,"endMarketValue":1035000,"netCashFlow":10000,"benchmarkReturnPct":1.8,"currency":"USD","requestedBy":"advisor01"}'</w:t>
+      </w:r>
+    </w:p>
+    <w:p>
+      <w:pPr>
+        <w:rPr>
+          <w:b/>
+          <w:bCs/>
+        </w:rPr>
+      </w:pPr>
+    </w:p>
+    <w:p>
+      <w:pPr>
+        <w:rPr>
+          <w:b/>
+          <w:bCs/>
+        </w:rPr>
+      </w:pPr>
+      <w:r>
+        <w:rPr>
+          <w:b/>
+          <w:bCs/>
+        </w:rPr>
+        <w:t># Test 2 - Expected: 422 INVALID_INPUT (negative begin)</w:t>
+      </w:r>
+    </w:p>
+    <w:p>
+      <w:pPr>
+        <w:rPr>
+          <w:b/>
+          <w:bCs/>
+        </w:rPr>
+      </w:pPr>
+      <w:r>
+        <w:rPr>
+          <w:b/>
+          <w:bCs/>
+        </w:rPr>
+        <w:t xml:space="preserve">curl -X POST </w:t>
+      </w:r>
+      <w:r>
+        <w:rPr>
+          <w:b/>
+          <w:bCs/>
+        </w:rPr>
+        <w:t>http://localhost:8080/portfolio-performance-service/api/</w:t>
+      </w:r>
+      <w:r>
+        <w:rPr>
+          <w:b/>
+          <w:bCs/>
+        </w:rPr>
+        <w:t>performance/daily-return \</w:t>
+      </w:r>
+    </w:p>
+    <w:p>
+      <w:pPr>
+        <w:rPr>
+          <w:b/>
+          <w:bCs/>
+        </w:rPr>
+      </w:pPr>
+      <w:r>
+        <w:rPr>
+          <w:b/>
+          <w:bCs/>
+        </w:rPr>
+        <w:t xml:space="preserve">  -H "Content-Type: application/json" \</w:t>
+      </w:r>
+    </w:p>
+    <w:p>
+      <w:pPr>
+        <w:rPr>
+          <w:b/>
+          <w:bCs/>
+        </w:rPr>
+      </w:pPr>
+      <w:r>
+        <w:rPr>
+          <w:b/>
+          <w:bCs/>
+        </w:rPr>
+        <w:t xml:space="preserve">  -d '{"portfolioId":"PF-1002","valuationDate":"2026-06-14","beginMarketValue":-100,"endMarketValue":1000,"netCashFlow":0,"benchmarkReturnPct":1.0,"currency":"USD","requestedBy":"advisor01"}'</w:t>
+      </w:r>
+    </w:p>
+    <w:p>
+      <w:pPr>
+        <w:rPr>
+          <w:b/>
+          <w:bCs/>
+        </w:rPr>
+      </w:pPr>
+    </w:p>
+    <w:p>
+      <w:pPr>
+        <w:rPr>
+          <w:b/>
+          <w:bCs/>
+        </w:rPr>
+      </w:pPr>
+      <w:r>
+        <w:rPr>
+          <w:b/>
+          <w:bCs/>
+        </w:rPr>
+        <w:t># Test 3 - Expected: 400 Validation Failed (blank portfolioId)</w:t>
+      </w:r>
+    </w:p>
+    <w:p>
+      <w:pPr>
+        <w:rPr>
+          <w:b/>
+          <w:bCs/>
+        </w:rPr>
+      </w:pPr>
+      <w:r>
+        <w:rPr>
+          <w:b/>
+          <w:bCs/>
+        </w:rPr>
+        <w:t xml:space="preserve">curl -X POST </w:t>
+      </w:r>
+      <w:r>
+        <w:rPr>
+          <w:b/>
+          <w:bCs/>
+        </w:rPr>
+        <w:t>http://localhost:8080/portfolio-performance-service/api/</w:t>
+      </w:r>
+      <w:r>
+        <w:rPr>
+          <w:b/>
+          <w:bCs/>
+        </w:rPr>
+        <w:t>performance/daily-return \</w:t>
+      </w:r>
+    </w:p>
+    <w:p>
+      <w:pPr>
+        <w:rPr>
+          <w:b/>
+          <w:bCs/>
+        </w:rPr>
+      </w:pPr>
+      <w:r>
+        <w:rPr>
+          <w:b/>
+          <w:bCs/>
+        </w:rPr>
+        <w:t xml:space="preserve">  -H "Content-Type: application/json" \</w:t>
+      </w:r>
+    </w:p>
+    <w:p>
+      <w:pPr>
+        <w:rPr>
+          <w:b/>
+          <w:bCs/>
+        </w:rPr>
+      </w:pPr>
+      <w:r>
+        <w:rPr>
+          <w:b/>
+          <w:bCs/>
+        </w:rPr>
+        <w:t xml:space="preserve">  -d '{"portfolioId":"","valuationDate":"2026-06-14","beginMarketValue":1000000,"endMarketValue":1035000,"netCashFlow":0,"benchmarkReturnPct":1.0,"currency":"USD","requestedBy":"advisor01"}'</w:t>
+      </w:r>
+    </w:p>
+    <w:p>
+      <w:pPr>
+        <w:tabs>
+          <w:tab w:val="left" w:pos="1850"/>
+        </w:tabs>
+        <w:rPr>
+          <w:b/>
+          <w:bCs/>
+        </w:rPr>
+      </w:pPr>
+      <w:r>
+        <w:rPr>
+          <w:b/>
+          <w:bCs/>
+        </w:rPr>
+        <w:t>All three must return the expected HTTP status codes and JSON bodies. Also open H2 console and verify rows were inserted into DAILY_RETURN_AUDIT for Tests 1 and 2. Run mvn test before proceeding.</w:t>
+      </w:r>
     </w:p>
     <w:p/>
     <w:sectPr>
@@ -3813,6 +3706,389 @@
 <file path=word/numbering.xml><?xml version="1.0" encoding="utf-8"?>
 <w:numbering xmlns:wpc="http://schemas.microsoft.com/office/word/2010/wordprocessingCanvas" xmlns:cx="http://schemas.microsoft.com/office/drawing/2014/chartex" xmlns:cx1="http://schemas.microsoft.com/office/drawing/2015/9/8/chartex" xmlns:cx2="http://schemas.microsoft.com/office/drawing/2015/10/21/chartex" xmlns:cx3="http://schemas.microsoft.com/office/drawing/2016/5/9/chartex" xmlns:cx4="http://schemas.microsoft.com/office/drawing/2016/5/10/chartex" xmlns:cx5="http://schemas.microsoft.com/office/drawing/2016/5/11/chartex" xmlns:cx6="http://schemas.microsoft.com/office/drawing/2016/5/12/chartex" xmlns:cx7="http://schemas.microsoft.com/office/drawing/2016/5/13/chartex" xmlns:cx8="http://schemas.microsoft.com/office/drawing/2016/5/14/chartex" xmlns:mc="http://schemas.openxmlformats.org/markup-compatibility/2006" xmlns:aink="http://schemas.microsoft.com/office/drawing/2016/ink" xmlns:am3d="http://schemas.microsoft.com/office/drawing/2017/model3d" xmlns:o="urn:schemas-microsoft-com:office:office" xmlns:oel="http://schemas.microsoft.com/office/2019/extlst" xmlns:r="http://schemas.openxmlformats.org/officeDocument/2006/relationships" xmlns:m="http://schemas.openxmlformats.org/officeDocument/2006/math" xmlns:v="urn:schemas-microsoft-com:vml" xmlns:wp14="http://schemas.microsoft.com/office/word/2010/wordprocessingDrawing" xmlns:wp="http://schemas.openxmlformats.org/drawingml/2006/wordprocessingDrawing" xmlns:w10="urn:schemas-microsoft-com:office:word" xmlns:w="http://schemas.openxmlformats.org/wordprocessingml/2006/main" xmlns:w14="http://schemas.microsoft.com/office/word/2010/wordml" xmlns:w15="http://schemas.microsoft.com/office/word/2012/wordml" xmlns:w16cex="http://schemas.microsoft.com/office/word/2018/wordml/cex" xmlns:w16cid="http://schemas.microsoft.com/office/word/2016/wordml/cid" xmlns:w16="http://schemas.microsoft.com/office/word/2018/wordml" xmlns:w16du="http://schemas.microsoft.com/office/word/2023/wordml/word16du" xmlns:w16sdtdh="http://schemas.microsoft.com/office/word/2020/wordml/sdtdatahash" xmlns:w16sdtfl="http://schemas.microsoft.com/office/word/2024/wordml/sdtformatlock" xmlns:w16se="http://schemas.microsoft.com/office/word/2015/wordml/symex" xmlns:wpg="http://schemas.microsoft.com/office/word/2010/wordprocessingGroup" xmlns:wpi="http://schemas.microsoft.com/office/word/2010/wordprocessingInk" xmlns:wne="http://schemas.microsoft.com/office/word/2006/wordml" xmlns:wps="http://schemas.microsoft.com/office/word/2010/wordprocessingShape" mc:Ignorable="w14 w15 w16se w16cid w16 w16cex w16sdtdh w16sdtfl w16du wp14">
   <w:abstractNum w:abstractNumId="0" w15:restartNumberingAfterBreak="0">
+    <w:nsid w:val="0542553D"/>
+    <w:multiLevelType w:val="multilevel"/>
+    <w:tmpl w:val="B7F836EE"/>
+    <w:lvl w:ilvl="0">
+      <w:start w:val="1"/>
+      <w:numFmt w:val="decimal"/>
+      <w:lvlText w:val="%1."/>
+      <w:lvlJc w:val="left"/>
+      <w:pPr>
+        <w:tabs>
+          <w:tab w:val="num" w:pos="720"/>
+        </w:tabs>
+        <w:ind w:left="720" w:hanging="360"/>
+      </w:pPr>
+    </w:lvl>
+    <w:lvl w:ilvl="1">
+      <w:start w:val="1"/>
+      <w:numFmt w:val="bullet"/>
+      <w:lvlText w:val="o"/>
+      <w:lvlJc w:val="left"/>
+      <w:pPr>
+        <w:tabs>
+          <w:tab w:val="num" w:pos="1440"/>
+        </w:tabs>
+        <w:ind w:left="1440" w:hanging="360"/>
+      </w:pPr>
+      <w:rPr>
+        <w:rFonts w:ascii="Courier New" w:hAnsi="Courier New" w:hint="default"/>
+        <w:sz w:val="20"/>
+      </w:rPr>
+    </w:lvl>
+    <w:lvl w:ilvl="2" w:tentative="1">
+      <w:start w:val="1"/>
+      <w:numFmt w:val="decimal"/>
+      <w:lvlText w:val="%3."/>
+      <w:lvlJc w:val="left"/>
+      <w:pPr>
+        <w:tabs>
+          <w:tab w:val="num" w:pos="2160"/>
+        </w:tabs>
+        <w:ind w:left="2160" w:hanging="360"/>
+      </w:pPr>
+    </w:lvl>
+    <w:lvl w:ilvl="3" w:tentative="1">
+      <w:start w:val="1"/>
+      <w:numFmt w:val="decimal"/>
+      <w:lvlText w:val="%4."/>
+      <w:lvlJc w:val="left"/>
+      <w:pPr>
+        <w:tabs>
+          <w:tab w:val="num" w:pos="2880"/>
+        </w:tabs>
+        <w:ind w:left="2880" w:hanging="360"/>
+      </w:pPr>
+    </w:lvl>
+    <w:lvl w:ilvl="4" w:tentative="1">
+      <w:start w:val="1"/>
+      <w:numFmt w:val="decimal"/>
+      <w:lvlText w:val="%5."/>
+      <w:lvlJc w:val="left"/>
+      <w:pPr>
+        <w:tabs>
+          <w:tab w:val="num" w:pos="3600"/>
+        </w:tabs>
+        <w:ind w:left="3600" w:hanging="360"/>
+      </w:pPr>
+    </w:lvl>
+    <w:lvl w:ilvl="5" w:tentative="1">
+      <w:start w:val="1"/>
+      <w:numFmt w:val="decimal"/>
+      <w:lvlText w:val="%6."/>
+      <w:lvlJc w:val="left"/>
+      <w:pPr>
+        <w:tabs>
+          <w:tab w:val="num" w:pos="4320"/>
+        </w:tabs>
+        <w:ind w:left="4320" w:hanging="360"/>
+      </w:pPr>
+    </w:lvl>
+    <w:lvl w:ilvl="6" w:tentative="1">
+      <w:start w:val="1"/>
+      <w:numFmt w:val="decimal"/>
+      <w:lvlText w:val="%7."/>
+      <w:lvlJc w:val="left"/>
+      <w:pPr>
+        <w:tabs>
+          <w:tab w:val="num" w:pos="5040"/>
+        </w:tabs>
+        <w:ind w:left="5040" w:hanging="360"/>
+      </w:pPr>
+    </w:lvl>
+    <w:lvl w:ilvl="7" w:tentative="1">
+      <w:start w:val="1"/>
+      <w:numFmt w:val="decimal"/>
+      <w:lvlText w:val="%8."/>
+      <w:lvlJc w:val="left"/>
+      <w:pPr>
+        <w:tabs>
+          <w:tab w:val="num" w:pos="5760"/>
+        </w:tabs>
+        <w:ind w:left="5760" w:hanging="360"/>
+      </w:pPr>
+    </w:lvl>
+    <w:lvl w:ilvl="8" w:tentative="1">
+      <w:start w:val="1"/>
+      <w:numFmt w:val="decimal"/>
+      <w:lvlText w:val="%9."/>
+      <w:lvlJc w:val="left"/>
+      <w:pPr>
+        <w:tabs>
+          <w:tab w:val="num" w:pos="6480"/>
+        </w:tabs>
+        <w:ind w:left="6480" w:hanging="360"/>
+      </w:pPr>
+    </w:lvl>
+  </w:abstractNum>
+  <w:abstractNum w:abstractNumId="1" w15:restartNumberingAfterBreak="0">
+    <w:nsid w:val="258E63D6"/>
+    <w:multiLevelType w:val="multilevel"/>
+    <w:tmpl w:val="874AA2F2"/>
+    <w:lvl w:ilvl="0">
+      <w:start w:val="1"/>
+      <w:numFmt w:val="bullet"/>
+      <w:lvlText w:val=""/>
+      <w:lvlJc w:val="left"/>
+      <w:pPr>
+        <w:tabs>
+          <w:tab w:val="num" w:pos="720"/>
+        </w:tabs>
+        <w:ind w:left="720" w:hanging="360"/>
+      </w:pPr>
+      <w:rPr>
+        <w:rFonts w:ascii="Symbol" w:hAnsi="Symbol" w:hint="default"/>
+        <w:sz w:val="20"/>
+      </w:rPr>
+    </w:lvl>
+    <w:lvl w:ilvl="1" w:tentative="1">
+      <w:start w:val="1"/>
+      <w:numFmt w:val="bullet"/>
+      <w:lvlText w:val="o"/>
+      <w:lvlJc w:val="left"/>
+      <w:pPr>
+        <w:tabs>
+          <w:tab w:val="num" w:pos="1440"/>
+        </w:tabs>
+        <w:ind w:left="1440" w:hanging="360"/>
+      </w:pPr>
+      <w:rPr>
+        <w:rFonts w:ascii="Courier New" w:hAnsi="Courier New" w:hint="default"/>
+        <w:sz w:val="20"/>
+      </w:rPr>
+    </w:lvl>
+    <w:lvl w:ilvl="2" w:tentative="1">
+      <w:start w:val="1"/>
+      <w:numFmt w:val="bullet"/>
+      <w:lvlText w:val=""/>
+      <w:lvlJc w:val="left"/>
+      <w:pPr>
+        <w:tabs>
+          <w:tab w:val="num" w:pos="2160"/>
+        </w:tabs>
+        <w:ind w:left="2160" w:hanging="360"/>
+      </w:pPr>
+      <w:rPr>
+        <w:rFonts w:ascii="Wingdings" w:hAnsi="Wingdings" w:hint="default"/>
+        <w:sz w:val="20"/>
+      </w:rPr>
+    </w:lvl>
+    <w:lvl w:ilvl="3" w:tentative="1">
+      <w:start w:val="1"/>
+      <w:numFmt w:val="bullet"/>
+      <w:lvlText w:val=""/>
+      <w:lvlJc w:val="left"/>
+      <w:pPr>
+        <w:tabs>
+          <w:tab w:val="num" w:pos="2880"/>
+        </w:tabs>
+        <w:ind w:left="2880" w:hanging="360"/>
+      </w:pPr>
+      <w:rPr>
+        <w:rFonts w:ascii="Wingdings" w:hAnsi="Wingdings" w:hint="default"/>
+        <w:sz w:val="20"/>
+      </w:rPr>
+    </w:lvl>
+    <w:lvl w:ilvl="4" w:tentative="1">
+      <w:start w:val="1"/>
+      <w:numFmt w:val="bullet"/>
+      <w:lvlText w:val=""/>
+      <w:lvlJc w:val="left"/>
+      <w:pPr>
+        <w:tabs>
+          <w:tab w:val="num" w:pos="3600"/>
+        </w:tabs>
+        <w:ind w:left="3600" w:hanging="360"/>
+      </w:pPr>
+      <w:rPr>
+        <w:rFonts w:ascii="Wingdings" w:hAnsi="Wingdings" w:hint="default"/>
+        <w:sz w:val="20"/>
+      </w:rPr>
+    </w:lvl>
+    <w:lvl w:ilvl="5" w:tentative="1">
+      <w:start w:val="1"/>
+      <w:numFmt w:val="bullet"/>
+      <w:lvlText w:val=""/>
+      <w:lvlJc w:val="left"/>
+      <w:pPr>
+        <w:tabs>
+          <w:tab w:val="num" w:pos="4320"/>
+        </w:tabs>
+        <w:ind w:left="4320" w:hanging="360"/>
+      </w:pPr>
+      <w:rPr>
+        <w:rFonts w:ascii="Wingdings" w:hAnsi="Wingdings" w:hint="default"/>
+        <w:sz w:val="20"/>
+      </w:rPr>
+    </w:lvl>
+    <w:lvl w:ilvl="6" w:tentative="1">
+      <w:start w:val="1"/>
+      <w:numFmt w:val="bullet"/>
+      <w:lvlText w:val=""/>
+      <w:lvlJc w:val="left"/>
+      <w:pPr>
+        <w:tabs>
+          <w:tab w:val="num" w:pos="5040"/>
+        </w:tabs>
+        <w:ind w:left="5040" w:hanging="360"/>
+      </w:pPr>
+      <w:rPr>
+        <w:rFonts w:ascii="Wingdings" w:hAnsi="Wingdings" w:hint="default"/>
+        <w:sz w:val="20"/>
+      </w:rPr>
+    </w:lvl>
+    <w:lvl w:ilvl="7" w:tentative="1">
+      <w:start w:val="1"/>
+      <w:numFmt w:val="bullet"/>
+      <w:lvlText w:val=""/>
+      <w:lvlJc w:val="left"/>
+      <w:pPr>
+        <w:tabs>
+          <w:tab w:val="num" w:pos="5760"/>
+        </w:tabs>
+        <w:ind w:left="5760" w:hanging="360"/>
+      </w:pPr>
+      <w:rPr>
+        <w:rFonts w:ascii="Wingdings" w:hAnsi="Wingdings" w:hint="default"/>
+        <w:sz w:val="20"/>
+      </w:rPr>
+    </w:lvl>
+    <w:lvl w:ilvl="8" w:tentative="1">
+      <w:start w:val="1"/>
+      <w:numFmt w:val="bullet"/>
+      <w:lvlText w:val=""/>
+      <w:lvlJc w:val="left"/>
+      <w:pPr>
+        <w:tabs>
+          <w:tab w:val="num" w:pos="6480"/>
+        </w:tabs>
+        <w:ind w:left="6480" w:hanging="360"/>
+      </w:pPr>
+      <w:rPr>
+        <w:rFonts w:ascii="Wingdings" w:hAnsi="Wingdings" w:hint="default"/>
+        <w:sz w:val="20"/>
+      </w:rPr>
+    </w:lvl>
+  </w:abstractNum>
+  <w:abstractNum w:abstractNumId="2" w15:restartNumberingAfterBreak="0">
+    <w:nsid w:val="3C136346"/>
+    <w:multiLevelType w:val="multilevel"/>
+    <w:tmpl w:val="62DE7F0A"/>
+    <w:lvl w:ilvl="0">
+      <w:start w:val="1"/>
+      <w:numFmt w:val="decimal"/>
+      <w:lvlText w:val="%1."/>
+      <w:lvlJc w:val="left"/>
+      <w:pPr>
+        <w:tabs>
+          <w:tab w:val="num" w:pos="720"/>
+        </w:tabs>
+        <w:ind w:left="720" w:hanging="360"/>
+      </w:pPr>
+    </w:lvl>
+    <w:lvl w:ilvl="1">
+      <w:start w:val="1"/>
+      <w:numFmt w:val="bullet"/>
+      <w:lvlText w:val="o"/>
+      <w:lvlJc w:val="left"/>
+      <w:pPr>
+        <w:tabs>
+          <w:tab w:val="num" w:pos="1440"/>
+        </w:tabs>
+        <w:ind w:left="1440" w:hanging="360"/>
+      </w:pPr>
+      <w:rPr>
+        <w:rFonts w:ascii="Courier New" w:hAnsi="Courier New" w:hint="default"/>
+        <w:sz w:val="20"/>
+      </w:rPr>
+    </w:lvl>
+    <w:lvl w:ilvl="2" w:tentative="1">
+      <w:start w:val="1"/>
+      <w:numFmt w:val="decimal"/>
+      <w:lvlText w:val="%3."/>
+      <w:lvlJc w:val="left"/>
+      <w:pPr>
+        <w:tabs>
+          <w:tab w:val="num" w:pos="2160"/>
+        </w:tabs>
+        <w:ind w:left="2160" w:hanging="360"/>
+      </w:pPr>
+    </w:lvl>
+    <w:lvl w:ilvl="3" w:tentative="1">
+      <w:start w:val="1"/>
+      <w:numFmt w:val="decimal"/>
+      <w:lvlText w:val="%4."/>
+      <w:lvlJc w:val="left"/>
+      <w:pPr>
+        <w:tabs>
+          <w:tab w:val="num" w:pos="2880"/>
+        </w:tabs>
+        <w:ind w:left="2880" w:hanging="360"/>
+      </w:pPr>
+    </w:lvl>
+    <w:lvl w:ilvl="4" w:tentative="1">
+      <w:start w:val="1"/>
+      <w:numFmt w:val="decimal"/>
+      <w:lvlText w:val="%5."/>
+      <w:lvlJc w:val="left"/>
+      <w:pPr>
+        <w:tabs>
+          <w:tab w:val="num" w:pos="3600"/>
+        </w:tabs>
+        <w:ind w:left="3600" w:hanging="360"/>
+      </w:pPr>
+    </w:lvl>
+    <w:lvl w:ilvl="5" w:tentative="1">
+      <w:start w:val="1"/>
+      <w:numFmt w:val="decimal"/>
+      <w:lvlText w:val="%6."/>
+      <w:lvlJc w:val="left"/>
+      <w:pPr>
+        <w:tabs>
+          <w:tab w:val="num" w:pos="4320"/>
+        </w:tabs>
+        <w:ind w:left="4320" w:hanging="360"/>
+      </w:pPr>
+    </w:lvl>
+    <w:lvl w:ilvl="6" w:tentative="1">
+      <w:start w:val="1"/>
+      <w:numFmt w:val="decimal"/>
+      <w:lvlText w:val="%7."/>
+      <w:lvlJc w:val="left"/>
+      <w:pPr>
+        <w:tabs>
+          <w:tab w:val="num" w:pos="5040"/>
+        </w:tabs>
+        <w:ind w:left="5040" w:hanging="360"/>
+      </w:pPr>
+    </w:lvl>
+    <w:lvl w:ilvl="7" w:tentative="1">
+      <w:start w:val="1"/>
+      <w:numFmt w:val="decimal"/>
+      <w:lvlText w:val="%8."/>
+      <w:lvlJc w:val="left"/>
+      <w:pPr>
+        <w:tabs>
+          <w:tab w:val="num" w:pos="5760"/>
+        </w:tabs>
+        <w:ind w:left="5760" w:hanging="360"/>
+      </w:pPr>
+    </w:lvl>
+    <w:lvl w:ilvl="8" w:tentative="1">
+      <w:start w:val="1"/>
+      <w:numFmt w:val="decimal"/>
+      <w:lvlText w:val="%9."/>
+      <w:lvlJc w:val="left"/>
+      <w:pPr>
+        <w:tabs>
+          <w:tab w:val="num" w:pos="6480"/>
+        </w:tabs>
+        <w:ind w:left="6480" w:hanging="360"/>
+      </w:pPr>
+    </w:lvl>
+  </w:abstractNum>
+  <w:abstractNum w:abstractNumId="3" w15:restartNumberingAfterBreak="0">
     <w:nsid w:val="45E06B6B"/>
     <w:multiLevelType w:val="multilevel"/>
     <w:tmpl w:val="5DCE223C"/>
@@ -3925,7 +4201,7 @@
       </w:pPr>
     </w:lvl>
   </w:abstractNum>
-  <w:abstractNum w:abstractNumId="1" w15:restartNumberingAfterBreak="0">
+  <w:abstractNum w:abstractNumId="4" w15:restartNumberingAfterBreak="0">
     <w:nsid w:val="48D54F2D"/>
     <w:multiLevelType w:val="multilevel"/>
     <w:tmpl w:val="60ECAB30"/>
@@ -4074,7 +4350,7 @@
       </w:rPr>
     </w:lvl>
   </w:abstractNum>
-  <w:abstractNum w:abstractNumId="2" w15:restartNumberingAfterBreak="0">
+  <w:abstractNum w:abstractNumId="5" w15:restartNumberingAfterBreak="0">
     <w:nsid w:val="49BC05C8"/>
     <w:multiLevelType w:val="multilevel"/>
     <w:tmpl w:val="0FBE3320"/>
@@ -4223,7 +4499,7 @@
       </w:rPr>
     </w:lvl>
   </w:abstractNum>
-  <w:abstractNum w:abstractNumId="3" w15:restartNumberingAfterBreak="0">
+  <w:abstractNum w:abstractNumId="6" w15:restartNumberingAfterBreak="0">
     <w:nsid w:val="4A4B573B"/>
     <w:multiLevelType w:val="multilevel"/>
     <w:tmpl w:val="56682CAC"/>
@@ -4372,7 +4648,7 @@
       </w:rPr>
     </w:lvl>
   </w:abstractNum>
-  <w:abstractNum w:abstractNumId="4" w15:restartNumberingAfterBreak="0">
+  <w:abstractNum w:abstractNumId="7" w15:restartNumberingAfterBreak="0">
     <w:nsid w:val="531C11F0"/>
     <w:multiLevelType w:val="multilevel"/>
     <w:tmpl w:val="971A32F6"/>
@@ -4485,7 +4761,7 @@
       </w:pPr>
     </w:lvl>
   </w:abstractNum>
-  <w:abstractNum w:abstractNumId="5" w15:restartNumberingAfterBreak="0">
+  <w:abstractNum w:abstractNumId="8" w15:restartNumberingAfterBreak="0">
     <w:nsid w:val="57C039E6"/>
     <w:multiLevelType w:val="multilevel"/>
     <w:tmpl w:val="B83A3582"/>
@@ -4634,7 +4910,7 @@
       </w:rPr>
     </w:lvl>
   </w:abstractNum>
-  <w:abstractNum w:abstractNumId="6" w15:restartNumberingAfterBreak="0">
+  <w:abstractNum w:abstractNumId="9" w15:restartNumberingAfterBreak="0">
     <w:nsid w:val="6038058D"/>
     <w:multiLevelType w:val="multilevel"/>
     <w:tmpl w:val="4DCC0926"/>
@@ -4783,7 +5059,382 @@
       </w:rPr>
     </w:lvl>
   </w:abstractNum>
-  <w:abstractNum w:abstractNumId="7" w15:restartNumberingAfterBreak="0">
+  <w:abstractNum w:abstractNumId="10" w15:restartNumberingAfterBreak="0">
+    <w:nsid w:val="626C2254"/>
+    <w:multiLevelType w:val="multilevel"/>
+    <w:tmpl w:val="5DA04946"/>
+    <w:lvl w:ilvl="0">
+      <w:start w:val="1"/>
+      <w:numFmt w:val="decimal"/>
+      <w:lvlText w:val="%1."/>
+      <w:lvlJc w:val="left"/>
+      <w:pPr>
+        <w:tabs>
+          <w:tab w:val="num" w:pos="720"/>
+        </w:tabs>
+        <w:ind w:left="720" w:hanging="360"/>
+      </w:pPr>
+    </w:lvl>
+    <w:lvl w:ilvl="1" w:tentative="1">
+      <w:start w:val="1"/>
+      <w:numFmt w:val="decimal"/>
+      <w:lvlText w:val="%2."/>
+      <w:lvlJc w:val="left"/>
+      <w:pPr>
+        <w:tabs>
+          <w:tab w:val="num" w:pos="1440"/>
+        </w:tabs>
+        <w:ind w:left="1440" w:hanging="360"/>
+      </w:pPr>
+    </w:lvl>
+    <w:lvl w:ilvl="2" w:tentative="1">
+      <w:start w:val="1"/>
+      <w:numFmt w:val="decimal"/>
+      <w:lvlText w:val="%3."/>
+      <w:lvlJc w:val="left"/>
+      <w:pPr>
+        <w:tabs>
+          <w:tab w:val="num" w:pos="2160"/>
+        </w:tabs>
+        <w:ind w:left="2160" w:hanging="360"/>
+      </w:pPr>
+    </w:lvl>
+    <w:lvl w:ilvl="3" w:tentative="1">
+      <w:start w:val="1"/>
+      <w:numFmt w:val="decimal"/>
+      <w:lvlText w:val="%4."/>
+      <w:lvlJc w:val="left"/>
+      <w:pPr>
+        <w:tabs>
+          <w:tab w:val="num" w:pos="2880"/>
+        </w:tabs>
+        <w:ind w:left="2880" w:hanging="360"/>
+      </w:pPr>
+    </w:lvl>
+    <w:lvl w:ilvl="4" w:tentative="1">
+      <w:start w:val="1"/>
+      <w:numFmt w:val="decimal"/>
+      <w:lvlText w:val="%5."/>
+      <w:lvlJc w:val="left"/>
+      <w:pPr>
+        <w:tabs>
+          <w:tab w:val="num" w:pos="3600"/>
+        </w:tabs>
+        <w:ind w:left="3600" w:hanging="360"/>
+      </w:pPr>
+    </w:lvl>
+    <w:lvl w:ilvl="5" w:tentative="1">
+      <w:start w:val="1"/>
+      <w:numFmt w:val="decimal"/>
+      <w:lvlText w:val="%6."/>
+      <w:lvlJc w:val="left"/>
+      <w:pPr>
+        <w:tabs>
+          <w:tab w:val="num" w:pos="4320"/>
+        </w:tabs>
+        <w:ind w:left="4320" w:hanging="360"/>
+      </w:pPr>
+    </w:lvl>
+    <w:lvl w:ilvl="6" w:tentative="1">
+      <w:start w:val="1"/>
+      <w:numFmt w:val="decimal"/>
+      <w:lvlText w:val="%7."/>
+      <w:lvlJc w:val="left"/>
+      <w:pPr>
+        <w:tabs>
+          <w:tab w:val="num" w:pos="5040"/>
+        </w:tabs>
+        <w:ind w:left="5040" w:hanging="360"/>
+      </w:pPr>
+    </w:lvl>
+    <w:lvl w:ilvl="7" w:tentative="1">
+      <w:start w:val="1"/>
+      <w:numFmt w:val="decimal"/>
+      <w:lvlText w:val="%8."/>
+      <w:lvlJc w:val="left"/>
+      <w:pPr>
+        <w:tabs>
+          <w:tab w:val="num" w:pos="5760"/>
+        </w:tabs>
+        <w:ind w:left="5760" w:hanging="360"/>
+      </w:pPr>
+    </w:lvl>
+    <w:lvl w:ilvl="8" w:tentative="1">
+      <w:start w:val="1"/>
+      <w:numFmt w:val="decimal"/>
+      <w:lvlText w:val="%9."/>
+      <w:lvlJc w:val="left"/>
+      <w:pPr>
+        <w:tabs>
+          <w:tab w:val="num" w:pos="6480"/>
+        </w:tabs>
+        <w:ind w:left="6480" w:hanging="360"/>
+      </w:pPr>
+    </w:lvl>
+  </w:abstractNum>
+  <w:abstractNum w:abstractNumId="11" w15:restartNumberingAfterBreak="0">
+    <w:nsid w:val="68F30EDF"/>
+    <w:multiLevelType w:val="multilevel"/>
+    <w:tmpl w:val="5678A5C2"/>
+    <w:lvl w:ilvl="0">
+      <w:start w:val="1"/>
+      <w:numFmt w:val="decimal"/>
+      <w:lvlText w:val="%1."/>
+      <w:lvlJc w:val="left"/>
+      <w:pPr>
+        <w:tabs>
+          <w:tab w:val="num" w:pos="720"/>
+        </w:tabs>
+        <w:ind w:left="720" w:hanging="360"/>
+      </w:pPr>
+    </w:lvl>
+    <w:lvl w:ilvl="1" w:tentative="1">
+      <w:start w:val="1"/>
+      <w:numFmt w:val="decimal"/>
+      <w:lvlText w:val="%2."/>
+      <w:lvlJc w:val="left"/>
+      <w:pPr>
+        <w:tabs>
+          <w:tab w:val="num" w:pos="1440"/>
+        </w:tabs>
+        <w:ind w:left="1440" w:hanging="360"/>
+      </w:pPr>
+    </w:lvl>
+    <w:lvl w:ilvl="2" w:tentative="1">
+      <w:start w:val="1"/>
+      <w:numFmt w:val="decimal"/>
+      <w:lvlText w:val="%3."/>
+      <w:lvlJc w:val="left"/>
+      <w:pPr>
+        <w:tabs>
+          <w:tab w:val="num" w:pos="2160"/>
+        </w:tabs>
+        <w:ind w:left="2160" w:hanging="360"/>
+      </w:pPr>
+    </w:lvl>
+    <w:lvl w:ilvl="3" w:tentative="1">
+      <w:start w:val="1"/>
+      <w:numFmt w:val="decimal"/>
+      <w:lvlText w:val="%4."/>
+      <w:lvlJc w:val="left"/>
+      <w:pPr>
+        <w:tabs>
+          <w:tab w:val="num" w:pos="2880"/>
+        </w:tabs>
+        <w:ind w:left="2880" w:hanging="360"/>
+      </w:pPr>
+    </w:lvl>
+    <w:lvl w:ilvl="4" w:tentative="1">
+      <w:start w:val="1"/>
+      <w:numFmt w:val="decimal"/>
+      <w:lvlText w:val="%5."/>
+      <w:lvlJc w:val="left"/>
+      <w:pPr>
+        <w:tabs>
+          <w:tab w:val="num" w:pos="3600"/>
+        </w:tabs>
+        <w:ind w:left="3600" w:hanging="360"/>
+      </w:pPr>
+    </w:lvl>
+    <w:lvl w:ilvl="5" w:tentative="1">
+      <w:start w:val="1"/>
+      <w:numFmt w:val="decimal"/>
+      <w:lvlText w:val="%6."/>
+      <w:lvlJc w:val="left"/>
+      <w:pPr>
+        <w:tabs>
+          <w:tab w:val="num" w:pos="4320"/>
+        </w:tabs>
+        <w:ind w:left="4320" w:hanging="360"/>
+      </w:pPr>
+    </w:lvl>
+    <w:lvl w:ilvl="6" w:tentative="1">
+      <w:start w:val="1"/>
+      <w:numFmt w:val="decimal"/>
+      <w:lvlText w:val="%7."/>
+      <w:lvlJc w:val="left"/>
+      <w:pPr>
+        <w:tabs>
+          <w:tab w:val="num" w:pos="5040"/>
+        </w:tabs>
+        <w:ind w:left="5040" w:hanging="360"/>
+      </w:pPr>
+    </w:lvl>
+    <w:lvl w:ilvl="7" w:tentative="1">
+      <w:start w:val="1"/>
+      <w:numFmt w:val="decimal"/>
+      <w:lvlText w:val="%8."/>
+      <w:lvlJc w:val="left"/>
+      <w:pPr>
+        <w:tabs>
+          <w:tab w:val="num" w:pos="5760"/>
+        </w:tabs>
+        <w:ind w:left="5760" w:hanging="360"/>
+      </w:pPr>
+    </w:lvl>
+    <w:lvl w:ilvl="8" w:tentative="1">
+      <w:start w:val="1"/>
+      <w:numFmt w:val="decimal"/>
+      <w:lvlText w:val="%9."/>
+      <w:lvlJc w:val="left"/>
+      <w:pPr>
+        <w:tabs>
+          <w:tab w:val="num" w:pos="6480"/>
+        </w:tabs>
+        <w:ind w:left="6480" w:hanging="360"/>
+      </w:pPr>
+    </w:lvl>
+  </w:abstractNum>
+  <w:abstractNum w:abstractNumId="12" w15:restartNumberingAfterBreak="0">
+    <w:nsid w:val="6A0A47E1"/>
+    <w:multiLevelType w:val="multilevel"/>
+    <w:tmpl w:val="6C36E6BC"/>
+    <w:lvl w:ilvl="0">
+      <w:start w:val="1"/>
+      <w:numFmt w:val="bullet"/>
+      <w:lvlText w:val=""/>
+      <w:lvlJc w:val="left"/>
+      <w:pPr>
+        <w:tabs>
+          <w:tab w:val="num" w:pos="720"/>
+        </w:tabs>
+        <w:ind w:left="720" w:hanging="360"/>
+      </w:pPr>
+      <w:rPr>
+        <w:rFonts w:ascii="Symbol" w:hAnsi="Symbol" w:hint="default"/>
+        <w:sz w:val="20"/>
+      </w:rPr>
+    </w:lvl>
+    <w:lvl w:ilvl="1" w:tentative="1">
+      <w:start w:val="1"/>
+      <w:numFmt w:val="bullet"/>
+      <w:lvlText w:val="o"/>
+      <w:lvlJc w:val="left"/>
+      <w:pPr>
+        <w:tabs>
+          <w:tab w:val="num" w:pos="1440"/>
+        </w:tabs>
+        <w:ind w:left="1440" w:hanging="360"/>
+      </w:pPr>
+      <w:rPr>
+        <w:rFonts w:ascii="Courier New" w:hAnsi="Courier New" w:hint="default"/>
+        <w:sz w:val="20"/>
+      </w:rPr>
+    </w:lvl>
+    <w:lvl w:ilvl="2" w:tentative="1">
+      <w:start w:val="1"/>
+      <w:numFmt w:val="bullet"/>
+      <w:lvlText w:val=""/>
+      <w:lvlJc w:val="left"/>
+      <w:pPr>
+        <w:tabs>
+          <w:tab w:val="num" w:pos="2160"/>
+        </w:tabs>
+        <w:ind w:left="2160" w:hanging="360"/>
+      </w:pPr>
+      <w:rPr>
+        <w:rFonts w:ascii="Wingdings" w:hAnsi="Wingdings" w:hint="default"/>
+        <w:sz w:val="20"/>
+      </w:rPr>
+    </w:lvl>
+    <w:lvl w:ilvl="3" w:tentative="1">
+      <w:start w:val="1"/>
+      <w:numFmt w:val="bullet"/>
+      <w:lvlText w:val=""/>
+      <w:lvlJc w:val="left"/>
+      <w:pPr>
+        <w:tabs>
+          <w:tab w:val="num" w:pos="2880"/>
+        </w:tabs>
+        <w:ind w:left="2880" w:hanging="360"/>
+      </w:pPr>
+      <w:rPr>
+        <w:rFonts w:ascii="Wingdings" w:hAnsi="Wingdings" w:hint="default"/>
+        <w:sz w:val="20"/>
+      </w:rPr>
+    </w:lvl>
+    <w:lvl w:ilvl="4" w:tentative="1">
+      <w:start w:val="1"/>
+      <w:numFmt w:val="bullet"/>
+      <w:lvlText w:val=""/>
+      <w:lvlJc w:val="left"/>
+      <w:pPr>
+        <w:tabs>
+          <w:tab w:val="num" w:pos="3600"/>
+        </w:tabs>
+        <w:ind w:left="3600" w:hanging="360"/>
+      </w:pPr>
+      <w:rPr>
+        <w:rFonts w:ascii="Wingdings" w:hAnsi="Wingdings" w:hint="default"/>
+        <w:sz w:val="20"/>
+      </w:rPr>
+    </w:lvl>
+    <w:lvl w:ilvl="5" w:tentative="1">
+      <w:start w:val="1"/>
+      <w:numFmt w:val="bullet"/>
+      <w:lvlText w:val=""/>
+      <w:lvlJc w:val="left"/>
+      <w:pPr>
+        <w:tabs>
+          <w:tab w:val="num" w:pos="4320"/>
+        </w:tabs>
+        <w:ind w:left="4320" w:hanging="360"/>
+      </w:pPr>
+      <w:rPr>
+        <w:rFonts w:ascii="Wingdings" w:hAnsi="Wingdings" w:hint="default"/>
+        <w:sz w:val="20"/>
+      </w:rPr>
+    </w:lvl>
+    <w:lvl w:ilvl="6" w:tentative="1">
+      <w:start w:val="1"/>
+      <w:numFmt w:val="bullet"/>
+      <w:lvlText w:val=""/>
+      <w:lvlJc w:val="left"/>
+      <w:pPr>
+        <w:tabs>
+          <w:tab w:val="num" w:pos="5040"/>
+        </w:tabs>
+        <w:ind w:left="5040" w:hanging="360"/>
+      </w:pPr>
+      <w:rPr>
+        <w:rFonts w:ascii="Wingdings" w:hAnsi="Wingdings" w:hint="default"/>
+        <w:sz w:val="20"/>
+      </w:rPr>
+    </w:lvl>
+    <w:lvl w:ilvl="7" w:tentative="1">
+      <w:start w:val="1"/>
+      <w:numFmt w:val="bullet"/>
+      <w:lvlText w:val=""/>
+      <w:lvlJc w:val="left"/>
+      <w:pPr>
+        <w:tabs>
+          <w:tab w:val="num" w:pos="5760"/>
+        </w:tabs>
+        <w:ind w:left="5760" w:hanging="360"/>
+      </w:pPr>
+      <w:rPr>
+        <w:rFonts w:ascii="Wingdings" w:hAnsi="Wingdings" w:hint="default"/>
+        <w:sz w:val="20"/>
+      </w:rPr>
+    </w:lvl>
+    <w:lvl w:ilvl="8" w:tentative="1">
+      <w:start w:val="1"/>
+      <w:numFmt w:val="bullet"/>
+      <w:lvlText w:val=""/>
+      <w:lvlJc w:val="left"/>
+      <w:pPr>
+        <w:tabs>
+          <w:tab w:val="num" w:pos="6480"/>
+        </w:tabs>
+        <w:ind w:left="6480" w:hanging="360"/>
+      </w:pPr>
+      <w:rPr>
+        <w:rFonts w:ascii="Wingdings" w:hAnsi="Wingdings" w:hint="default"/>
+        <w:sz w:val="20"/>
+      </w:rPr>
+    </w:lvl>
+  </w:abstractNum>
+  <w:abstractNum w:abstractNumId="13" w15:restartNumberingAfterBreak="0">
     <w:nsid w:val="74F53D88"/>
     <w:multiLevelType w:val="multilevel"/>
     <w:tmpl w:val="BB2E5C4E"/>
@@ -4932,7 +5583,7 @@
       </w:rPr>
     </w:lvl>
   </w:abstractNum>
-  <w:abstractNum w:abstractNumId="8" w15:restartNumberingAfterBreak="0">
+  <w:abstractNum w:abstractNumId="14" w15:restartNumberingAfterBreak="0">
     <w:nsid w:val="7B1E12D3"/>
     <w:multiLevelType w:val="multilevel"/>
     <w:tmpl w:val="CEC4AD36"/>
@@ -5082,31 +5733,49 @@
     </w:lvl>
   </w:abstractNum>
   <w:num w:numId="1" w16cid:durableId="1755397055">
-    <w:abstractNumId w:val="2"/>
+    <w:abstractNumId w:val="5"/>
   </w:num>
   <w:num w:numId="2" w16cid:durableId="1999840450">
+    <w:abstractNumId w:val="4"/>
+  </w:num>
+  <w:num w:numId="3" w16cid:durableId="783694229">
+    <w:abstractNumId w:val="7"/>
+  </w:num>
+  <w:num w:numId="4" w16cid:durableId="71589213">
+    <w:abstractNumId w:val="6"/>
+  </w:num>
+  <w:num w:numId="5" w16cid:durableId="896864988">
+    <w:abstractNumId w:val="14"/>
+  </w:num>
+  <w:num w:numId="6" w16cid:durableId="1412656734">
+    <w:abstractNumId w:val="3"/>
+  </w:num>
+  <w:num w:numId="7" w16cid:durableId="434860212">
+    <w:abstractNumId w:val="9"/>
+  </w:num>
+  <w:num w:numId="8" w16cid:durableId="593440189">
+    <w:abstractNumId w:val="8"/>
+  </w:num>
+  <w:num w:numId="9" w16cid:durableId="1305701990">
+    <w:abstractNumId w:val="13"/>
+  </w:num>
+  <w:num w:numId="10" w16cid:durableId="1540358999">
+    <w:abstractNumId w:val="0"/>
+  </w:num>
+  <w:num w:numId="11" w16cid:durableId="977101592">
+    <w:abstractNumId w:val="10"/>
+  </w:num>
+  <w:num w:numId="12" w16cid:durableId="1452048159">
+    <w:abstractNumId w:val="11"/>
+  </w:num>
+  <w:num w:numId="13" w16cid:durableId="1532179912">
     <w:abstractNumId w:val="1"/>
   </w:num>
-  <w:num w:numId="3" w16cid:durableId="783694229">
-    <w:abstractNumId w:val="4"/>
+  <w:num w:numId="14" w16cid:durableId="882401521">
+    <w:abstractNumId w:val="12"/>
   </w:num>
-  <w:num w:numId="4" w16cid:durableId="71589213">
-    <w:abstractNumId w:val="3"/>
-  </w:num>
-  <w:num w:numId="5" w16cid:durableId="896864988">
-    <w:abstractNumId w:val="8"/>
-  </w:num>
-  <w:num w:numId="6" w16cid:durableId="1412656734">
-    <w:abstractNumId w:val="0"/>
-  </w:num>
-  <w:num w:numId="7" w16cid:durableId="434860212">
-    <w:abstractNumId w:val="6"/>
-  </w:num>
-  <w:num w:numId="8" w16cid:durableId="593440189">
-    <w:abstractNumId w:val="5"/>
-  </w:num>
-  <w:num w:numId="9" w16cid:durableId="1305701990">
-    <w:abstractNumId w:val="7"/>
+  <w:num w:numId="15" w16cid:durableId="472140468">
+    <w:abstractNumId w:val="2"/>
   </w:num>
 </w:numbering>
 </file>

</xml_diff>

<commit_message>
Add READEME.md and surefire report plugin in pom
</commit_message>
<xml_diff>
--- a/Prompts.docx
+++ b/Prompts.docx
@@ -6993,6 +6993,12 @@
       </w:r>
     </w:p>
     <w:p>
+      <w:pPr>
+        <w:rPr>
+          <w:b/>
+          <w:bCs/>
+        </w:rPr>
+      </w:pPr>
       <w:r>
         <w:rPr>
           <w:b/>
@@ -7015,6 +7021,673 @@
           <w:bCs/>
         </w:rPr>
         <w:t xml:space="preserve"> test. All 6 integration tests plus all previous unit tests must pass. The test output must show BUILD SUCCESS with 0 failures, 0 errors. Check that the Surefire report in target/surefire-reports/ shows the test class names and results. Do not proceed until this is green.</w:t>
+      </w:r>
+    </w:p>
+    <w:p>
+      <w:pPr>
+        <w:rPr>
+          <w:b/>
+          <w:bCs/>
+        </w:rPr>
+      </w:pPr>
+      <w:r>
+        <w:rPr>
+          <w:b/>
+          <w:bCs/>
+        </w:rPr>
+        <w:pict w14:anchorId="7EA1290B">
+          <v:rect id="_x0000_i1038" style="width:0;height:1.5pt" o:hralign="center" o:hrstd="t" o:hr="t" fillcolor="#a0a0a0" stroked="f"/>
+        </w:pict>
+      </w:r>
+    </w:p>
+    <w:p>
+      <w:pPr>
+        <w:rPr>
+          <w:b/>
+          <w:bCs/>
+        </w:rPr>
+      </w:pPr>
+      <w:r>
+        <w:rPr>
+          <w:b/>
+          <w:bCs/>
+        </w:rPr>
+        <w:t>Step 10: Write the README</w:t>
+      </w:r>
+    </w:p>
+    <w:p>
+      <w:pPr>
+        <w:rPr>
+          <w:b/>
+          <w:bCs/>
+        </w:rPr>
+      </w:pPr>
+      <w:r>
+        <w:rPr>
+          <w:b/>
+          <w:bCs/>
+        </w:rPr>
+        <w:t>Prompt: Create a README.md file at the project root (performance-service/README.md). The README must cover the following sections in order:</w:t>
+      </w:r>
+    </w:p>
+    <w:p>
+      <w:pPr>
+        <w:numPr>
+          <w:ilvl w:val="0"/>
+          <w:numId w:val="17"/>
+        </w:numPr>
+        <w:rPr>
+          <w:b/>
+          <w:bCs/>
+        </w:rPr>
+      </w:pPr>
+      <w:r>
+        <w:rPr>
+          <w:b/>
+          <w:bCs/>
+        </w:rPr>
+        <w:t>Project Overview — one paragraph describing what this service does and who it serves (advisors, operations teams)</w:t>
+      </w:r>
+    </w:p>
+    <w:p>
+      <w:pPr>
+        <w:numPr>
+          <w:ilvl w:val="0"/>
+          <w:numId w:val="17"/>
+        </w:numPr>
+        <w:rPr>
+          <w:b/>
+          <w:bCs/>
+        </w:rPr>
+      </w:pPr>
+      <w:r>
+        <w:rPr>
+          <w:b/>
+          <w:bCs/>
+        </w:rPr>
+        <w:t xml:space="preserve">Architecture &amp; Approach — describe the layered structure: Controller → Service → Repository → H2. Mention that the calculation is performed in </w:t>
+      </w:r>
+      <w:proofErr w:type="spellStart"/>
+      <w:r>
+        <w:rPr>
+          <w:b/>
+          <w:bCs/>
+        </w:rPr>
+        <w:t>PerformanceCalculationServiceImpl</w:t>
+      </w:r>
+      <w:proofErr w:type="spellEnd"/>
+      <w:r>
+        <w:rPr>
+          <w:b/>
+          <w:bCs/>
+        </w:rPr>
+        <w:t xml:space="preserve"> using </w:t>
+      </w:r>
+      <w:proofErr w:type="spellStart"/>
+      <w:r>
+        <w:rPr>
+          <w:b/>
+          <w:bCs/>
+        </w:rPr>
+        <w:t>BigDecimal</w:t>
+      </w:r>
+      <w:proofErr w:type="spellEnd"/>
+      <w:r>
+        <w:rPr>
+          <w:b/>
+          <w:bCs/>
+        </w:rPr>
+        <w:t xml:space="preserve"> for precision, and that every request is persisted to </w:t>
+      </w:r>
+      <w:proofErr w:type="spellStart"/>
+      <w:r>
+        <w:rPr>
+          <w:b/>
+          <w:bCs/>
+        </w:rPr>
+        <w:t>DailyReturnAudit</w:t>
+      </w:r>
+      <w:proofErr w:type="spellEnd"/>
+      <w:r>
+        <w:rPr>
+          <w:b/>
+          <w:bCs/>
+        </w:rPr>
+        <w:t xml:space="preserve"> for audit trail regardless of outcome.</w:t>
+      </w:r>
+    </w:p>
+    <w:p>
+      <w:pPr>
+        <w:numPr>
+          <w:ilvl w:val="0"/>
+          <w:numId w:val="17"/>
+        </w:numPr>
+        <w:rPr>
+          <w:b/>
+          <w:bCs/>
+        </w:rPr>
+      </w:pPr>
+      <w:r>
+        <w:rPr>
+          <w:b/>
+          <w:bCs/>
+        </w:rPr>
+        <w:lastRenderedPageBreak/>
+        <w:t>Business Rules Summary — a numbered list matching the 6 rules from the requirements: the two INVALID_INPUT rules for negative values, the currency check, the zero-begin-value rule, the benchmark deviation REVIEW_REQUIRED threshold, and the cash flow threshold rule. State the rule evaluation order explicitly.</w:t>
+      </w:r>
+    </w:p>
+    <w:p>
+      <w:pPr>
+        <w:numPr>
+          <w:ilvl w:val="0"/>
+          <w:numId w:val="17"/>
+        </w:numPr>
+        <w:rPr>
+          <w:b/>
+          <w:bCs/>
+        </w:rPr>
+      </w:pPr>
+      <w:r>
+        <w:rPr>
+          <w:b/>
+          <w:bCs/>
+        </w:rPr>
+        <w:t>Assumptions Made — document the following explicitly:</w:t>
+      </w:r>
+    </w:p>
+    <w:p>
+      <w:pPr>
+        <w:numPr>
+          <w:ilvl w:val="1"/>
+          <w:numId w:val="17"/>
+        </w:numPr>
+        <w:rPr>
+          <w:b/>
+          <w:bCs/>
+        </w:rPr>
+      </w:pPr>
+      <w:r>
+        <w:rPr>
+          <w:b/>
+          <w:bCs/>
+        </w:rPr>
+        <w:t xml:space="preserve">Supported currencies are a fixed </w:t>
+      </w:r>
+      <w:proofErr w:type="spellStart"/>
+      <w:r>
+        <w:rPr>
+          <w:b/>
+          <w:bCs/>
+        </w:rPr>
+        <w:t>enum</w:t>
+      </w:r>
+      <w:proofErr w:type="spellEnd"/>
+      <w:r>
+        <w:rPr>
+          <w:b/>
+          <w:bCs/>
+        </w:rPr>
+        <w:t xml:space="preserve"> (USD, GBP, EUR, CAD, AUD); unsupported currencies trigger INVALID_INPUT</w:t>
+      </w:r>
+    </w:p>
+    <w:p>
+      <w:pPr>
+        <w:numPr>
+          <w:ilvl w:val="1"/>
+          <w:numId w:val="17"/>
+        </w:numPr>
+        <w:rPr>
+          <w:b/>
+          <w:bCs/>
+        </w:rPr>
+      </w:pPr>
+      <w:r>
+        <w:rPr>
+          <w:b/>
+          <w:bCs/>
+        </w:rPr>
+        <w:t>Both REVIEW_REQUIRED conditions are evaluated and ALL applicable reasons are collected (not short-circuit)</w:t>
+      </w:r>
+    </w:p>
+    <w:p>
+      <w:pPr>
+        <w:numPr>
+          <w:ilvl w:val="1"/>
+          <w:numId w:val="17"/>
+        </w:numPr>
+        <w:rPr>
+          <w:b/>
+          <w:bCs/>
+        </w:rPr>
+      </w:pPr>
+      <w:proofErr w:type="spellStart"/>
+      <w:r>
+        <w:rPr>
+          <w:b/>
+          <w:bCs/>
+        </w:rPr>
+        <w:t>netCashFlow</w:t>
+      </w:r>
+      <w:proofErr w:type="spellEnd"/>
+      <w:r>
+        <w:rPr>
+          <w:b/>
+          <w:bCs/>
+        </w:rPr>
+        <w:t xml:space="preserve"> may be negative (e.g., withdrawals); absolute value is used for the 20% threshold check</w:t>
+      </w:r>
+    </w:p>
+    <w:p>
+      <w:pPr>
+        <w:numPr>
+          <w:ilvl w:val="1"/>
+          <w:numId w:val="17"/>
+        </w:numPr>
+        <w:rPr>
+          <w:b/>
+          <w:bCs/>
+        </w:rPr>
+      </w:pPr>
+      <w:proofErr w:type="spellStart"/>
+      <w:r>
+        <w:rPr>
+          <w:b/>
+          <w:bCs/>
+        </w:rPr>
+        <w:t>processedAt</w:t>
+      </w:r>
+      <w:proofErr w:type="spellEnd"/>
+      <w:r>
+        <w:rPr>
+          <w:b/>
+          <w:bCs/>
+        </w:rPr>
+        <w:t xml:space="preserve"> is set at service layer using </w:t>
+      </w:r>
+      <w:proofErr w:type="spellStart"/>
+      <w:r>
+        <w:rPr>
+          <w:b/>
+          <w:bCs/>
+        </w:rPr>
+        <w:t>Instant.now</w:t>
+      </w:r>
+      <w:proofErr w:type="spellEnd"/>
+      <w:r>
+        <w:rPr>
+          <w:b/>
+          <w:bCs/>
+        </w:rPr>
+        <w:t>() (UTC)</w:t>
+      </w:r>
+    </w:p>
+    <w:p>
+      <w:pPr>
+        <w:numPr>
+          <w:ilvl w:val="1"/>
+          <w:numId w:val="17"/>
+        </w:numPr>
+        <w:rPr>
+          <w:b/>
+          <w:bCs/>
+        </w:rPr>
+      </w:pPr>
+      <w:r>
+        <w:rPr>
+          <w:b/>
+          <w:bCs/>
+        </w:rPr>
+        <w:t>H2 is in-memory; data does not persist across restarts (by design for this implementation)</w:t>
+      </w:r>
+    </w:p>
+    <w:p>
+      <w:pPr>
+        <w:numPr>
+          <w:ilvl w:val="0"/>
+          <w:numId w:val="17"/>
+        </w:numPr>
+        <w:rPr>
+          <w:b/>
+          <w:bCs/>
+        </w:rPr>
+      </w:pPr>
+      <w:r>
+        <w:rPr>
+          <w:b/>
+          <w:bCs/>
+        </w:rPr>
+        <w:t>API Contract — show the exact request and response JSON examples from the requirements with field descriptions in a table</w:t>
+      </w:r>
+    </w:p>
+    <w:p>
+      <w:pPr>
+        <w:numPr>
+          <w:ilvl w:val="0"/>
+          <w:numId w:val="17"/>
+        </w:numPr>
+        <w:rPr>
+          <w:b/>
+          <w:bCs/>
+        </w:rPr>
+      </w:pPr>
+      <w:r>
+        <w:rPr>
+          <w:b/>
+          <w:bCs/>
+        </w:rPr>
+        <w:t>How to Run — step-by-step:</w:t>
+      </w:r>
+    </w:p>
+    <w:p>
+      <w:pPr>
+        <w:numPr>
+          <w:ilvl w:val="1"/>
+          <w:numId w:val="17"/>
+        </w:numPr>
+        <w:rPr>
+          <w:b/>
+          <w:bCs/>
+        </w:rPr>
+      </w:pPr>
+      <w:r>
+        <w:rPr>
+          <w:b/>
+          <w:bCs/>
+        </w:rPr>
+        <w:t>Prerequisites: Java 21, Maven 3.9+</w:t>
+      </w:r>
+    </w:p>
+    <w:p>
+      <w:pPr>
+        <w:numPr>
+          <w:ilvl w:val="1"/>
+          <w:numId w:val="17"/>
+        </w:numPr>
+        <w:rPr>
+          <w:b/>
+          <w:bCs/>
+        </w:rPr>
+      </w:pPr>
+      <w:proofErr w:type="spellStart"/>
+      <w:r>
+        <w:rPr>
+          <w:b/>
+          <w:bCs/>
+        </w:rPr>
+        <w:t>mvn</w:t>
+      </w:r>
+      <w:proofErr w:type="spellEnd"/>
+      <w:r>
+        <w:rPr>
+          <w:b/>
+          <w:bCs/>
+        </w:rPr>
+        <w:t xml:space="preserve"> clean install to build</w:t>
+      </w:r>
+    </w:p>
+    <w:p>
+      <w:pPr>
+        <w:numPr>
+          <w:ilvl w:val="1"/>
+          <w:numId w:val="17"/>
+        </w:numPr>
+        <w:rPr>
+          <w:b/>
+          <w:bCs/>
+        </w:rPr>
+      </w:pPr>
+      <w:proofErr w:type="spellStart"/>
+      <w:r>
+        <w:rPr>
+          <w:b/>
+          <w:bCs/>
+        </w:rPr>
+        <w:t>mvn</w:t>
+      </w:r>
+      <w:proofErr w:type="spellEnd"/>
+      <w:r>
+        <w:rPr>
+          <w:b/>
+          <w:bCs/>
+        </w:rPr>
+        <w:t xml:space="preserve"> </w:t>
+      </w:r>
+      <w:proofErr w:type="spellStart"/>
+      <w:r>
+        <w:rPr>
+          <w:b/>
+          <w:bCs/>
+        </w:rPr>
+        <w:t>spring-boot:run</w:t>
+      </w:r>
+      <w:proofErr w:type="spellEnd"/>
+      <w:r>
+        <w:rPr>
+          <w:b/>
+          <w:bCs/>
+        </w:rPr>
+        <w:t xml:space="preserve"> to start on port 8080</w:t>
+      </w:r>
+    </w:p>
+    <w:p>
+      <w:pPr>
+        <w:numPr>
+          <w:ilvl w:val="1"/>
+          <w:numId w:val="17"/>
+        </w:numPr>
+        <w:rPr>
+          <w:b/>
+          <w:bCs/>
+        </w:rPr>
+      </w:pPr>
+      <w:r>
+        <w:rPr>
+          <w:b/>
+          <w:bCs/>
+        </w:rPr>
+        <w:t>H2 console URL and credentials</w:t>
+      </w:r>
+    </w:p>
+    <w:p>
+      <w:pPr>
+        <w:numPr>
+          <w:ilvl w:val="1"/>
+          <w:numId w:val="17"/>
+        </w:numPr>
+        <w:rPr>
+          <w:b/>
+          <w:bCs/>
+        </w:rPr>
+      </w:pPr>
+      <w:r>
+        <w:rPr>
+          <w:b/>
+          <w:bCs/>
+        </w:rPr>
+        <w:t>Example curl command for the happy-path request</w:t>
+      </w:r>
+    </w:p>
+    <w:p>
+      <w:pPr>
+        <w:numPr>
+          <w:ilvl w:val="0"/>
+          <w:numId w:val="17"/>
+        </w:numPr>
+        <w:rPr>
+          <w:b/>
+          <w:bCs/>
+        </w:rPr>
+      </w:pPr>
+      <w:r>
+        <w:rPr>
+          <w:b/>
+          <w:bCs/>
+        </w:rPr>
+        <w:t xml:space="preserve">How to Run Tests — </w:t>
+      </w:r>
+      <w:proofErr w:type="spellStart"/>
+      <w:r>
+        <w:rPr>
+          <w:b/>
+          <w:bCs/>
+        </w:rPr>
+        <w:t>mvn</w:t>
+      </w:r>
+      <w:proofErr w:type="spellEnd"/>
+      <w:r>
+        <w:rPr>
+          <w:b/>
+          <w:bCs/>
+        </w:rPr>
+        <w:t xml:space="preserve"> test command, brief note that it runs unit tests + integration tests, and where to find the Surefire HTML report</w:t>
+      </w:r>
+    </w:p>
+    <w:p>
+      <w:pPr>
+        <w:rPr>
+          <w:b/>
+          <w:bCs/>
+        </w:rPr>
+      </w:pPr>
+      <w:r>
+        <w:rPr>
+          <w:b/>
+          <w:bCs/>
+        </w:rPr>
+        <w:t>Validation Gate: Perform a final end-to-end verification pass:</w:t>
+      </w:r>
+    </w:p>
+    <w:p>
+      <w:pPr>
+        <w:numPr>
+          <w:ilvl w:val="0"/>
+          <w:numId w:val="18"/>
+        </w:numPr>
+        <w:rPr>
+          <w:b/>
+          <w:bCs/>
+        </w:rPr>
+      </w:pPr>
+      <w:r>
+        <w:rPr>
+          <w:b/>
+          <w:bCs/>
+        </w:rPr>
+        <w:t xml:space="preserve">Run </w:t>
+      </w:r>
+      <w:proofErr w:type="spellStart"/>
+      <w:r>
+        <w:rPr>
+          <w:b/>
+          <w:bCs/>
+        </w:rPr>
+        <w:t>mvn</w:t>
+      </w:r>
+      <w:proofErr w:type="spellEnd"/>
+      <w:r>
+        <w:rPr>
+          <w:b/>
+          <w:bCs/>
+        </w:rPr>
+        <w:t xml:space="preserve"> clean test from scratch — must produce BUILD SUCCESS with all tests passing</w:t>
+      </w:r>
+    </w:p>
+    <w:p>
+      <w:pPr>
+        <w:numPr>
+          <w:ilvl w:val="0"/>
+          <w:numId w:val="18"/>
+        </w:numPr>
+        <w:rPr>
+          <w:b/>
+          <w:bCs/>
+        </w:rPr>
+      </w:pPr>
+      <w:r>
+        <w:rPr>
+          <w:b/>
+          <w:bCs/>
+        </w:rPr>
+        <w:t xml:space="preserve">Run </w:t>
+      </w:r>
+      <w:proofErr w:type="spellStart"/>
+      <w:r>
+        <w:rPr>
+          <w:b/>
+          <w:bCs/>
+        </w:rPr>
+        <w:t>mvn</w:t>
+      </w:r>
+      <w:proofErr w:type="spellEnd"/>
+      <w:r>
+        <w:rPr>
+          <w:b/>
+          <w:bCs/>
+        </w:rPr>
+        <w:t xml:space="preserve"> </w:t>
+      </w:r>
+      <w:proofErr w:type="spellStart"/>
+      <w:r>
+        <w:rPr>
+          <w:b/>
+          <w:bCs/>
+        </w:rPr>
+        <w:t>spring-boot:run</w:t>
+      </w:r>
+      <w:proofErr w:type="spellEnd"/>
+      <w:r>
+        <w:rPr>
+          <w:b/>
+          <w:bCs/>
+        </w:rPr>
+        <w:t xml:space="preserve"> and execute the curl example from the README — response must match the documented example output</w:t>
+      </w:r>
+    </w:p>
+    <w:p>
+      <w:pPr>
+        <w:numPr>
+          <w:ilvl w:val="0"/>
+          <w:numId w:val="18"/>
+        </w:numPr>
+        <w:rPr>
+          <w:b/>
+          <w:bCs/>
+        </w:rPr>
+      </w:pPr>
+      <w:r>
+        <w:rPr>
+          <w:b/>
+          <w:bCs/>
+        </w:rPr>
+        <w:t>Confirm the README renders correctly in a Markdown previewer (VS Code preview or GitHub)</w:t>
+      </w:r>
+    </w:p>
+    <w:p>
+      <w:pPr>
+        <w:numPr>
+          <w:ilvl w:val="0"/>
+          <w:numId w:val="18"/>
+        </w:numPr>
+        <w:rPr>
+          <w:b/>
+          <w:bCs/>
+        </w:rPr>
+      </w:pPr>
+      <w:r>
+        <w:rPr>
+          <w:b/>
+          <w:bCs/>
+        </w:rPr>
+        <w:t>Confirm http://localhost:8080/h2-console is accessible and SELECT COUNT(*) FROM DAILY_RETURN_AUDIT returns 1 after the curl test</w:t>
+      </w:r>
+    </w:p>
+    <w:p>
+      <w:r>
+        <w:rPr>
+          <w:b/>
+          <w:bCs/>
+        </w:rPr>
+        <w:t>The project is complete when all 10 steps have passed their respective validation gates.</w:t>
       </w:r>
     </w:p>
     <w:sectPr>
@@ -8876,6 +9549,155 @@
     </w:lvl>
   </w:abstractNum>
   <w:abstractNum w:abstractNumId="14" w15:restartNumberingAfterBreak="0">
+    <w:nsid w:val="70954D0E"/>
+    <w:multiLevelType w:val="multilevel"/>
+    <w:tmpl w:val="C9EC0CDE"/>
+    <w:lvl w:ilvl="0">
+      <w:start w:val="1"/>
+      <w:numFmt w:val="bullet"/>
+      <w:lvlText w:val=""/>
+      <w:lvlJc w:val="left"/>
+      <w:pPr>
+        <w:tabs>
+          <w:tab w:val="num" w:pos="720"/>
+        </w:tabs>
+        <w:ind w:left="720" w:hanging="360"/>
+      </w:pPr>
+      <w:rPr>
+        <w:rFonts w:ascii="Symbol" w:hAnsi="Symbol" w:hint="default"/>
+        <w:sz w:val="20"/>
+      </w:rPr>
+    </w:lvl>
+    <w:lvl w:ilvl="1" w:tentative="1">
+      <w:start w:val="1"/>
+      <w:numFmt w:val="bullet"/>
+      <w:lvlText w:val="o"/>
+      <w:lvlJc w:val="left"/>
+      <w:pPr>
+        <w:tabs>
+          <w:tab w:val="num" w:pos="1440"/>
+        </w:tabs>
+        <w:ind w:left="1440" w:hanging="360"/>
+      </w:pPr>
+      <w:rPr>
+        <w:rFonts w:ascii="Courier New" w:hAnsi="Courier New" w:hint="default"/>
+        <w:sz w:val="20"/>
+      </w:rPr>
+    </w:lvl>
+    <w:lvl w:ilvl="2" w:tentative="1">
+      <w:start w:val="1"/>
+      <w:numFmt w:val="bullet"/>
+      <w:lvlText w:val=""/>
+      <w:lvlJc w:val="left"/>
+      <w:pPr>
+        <w:tabs>
+          <w:tab w:val="num" w:pos="2160"/>
+        </w:tabs>
+        <w:ind w:left="2160" w:hanging="360"/>
+      </w:pPr>
+      <w:rPr>
+        <w:rFonts w:ascii="Wingdings" w:hAnsi="Wingdings" w:hint="default"/>
+        <w:sz w:val="20"/>
+      </w:rPr>
+    </w:lvl>
+    <w:lvl w:ilvl="3" w:tentative="1">
+      <w:start w:val="1"/>
+      <w:numFmt w:val="bullet"/>
+      <w:lvlText w:val=""/>
+      <w:lvlJc w:val="left"/>
+      <w:pPr>
+        <w:tabs>
+          <w:tab w:val="num" w:pos="2880"/>
+        </w:tabs>
+        <w:ind w:left="2880" w:hanging="360"/>
+      </w:pPr>
+      <w:rPr>
+        <w:rFonts w:ascii="Wingdings" w:hAnsi="Wingdings" w:hint="default"/>
+        <w:sz w:val="20"/>
+      </w:rPr>
+    </w:lvl>
+    <w:lvl w:ilvl="4" w:tentative="1">
+      <w:start w:val="1"/>
+      <w:numFmt w:val="bullet"/>
+      <w:lvlText w:val=""/>
+      <w:lvlJc w:val="left"/>
+      <w:pPr>
+        <w:tabs>
+          <w:tab w:val="num" w:pos="3600"/>
+        </w:tabs>
+        <w:ind w:left="3600" w:hanging="360"/>
+      </w:pPr>
+      <w:rPr>
+        <w:rFonts w:ascii="Wingdings" w:hAnsi="Wingdings" w:hint="default"/>
+        <w:sz w:val="20"/>
+      </w:rPr>
+    </w:lvl>
+    <w:lvl w:ilvl="5" w:tentative="1">
+      <w:start w:val="1"/>
+      <w:numFmt w:val="bullet"/>
+      <w:lvlText w:val=""/>
+      <w:lvlJc w:val="left"/>
+      <w:pPr>
+        <w:tabs>
+          <w:tab w:val="num" w:pos="4320"/>
+        </w:tabs>
+        <w:ind w:left="4320" w:hanging="360"/>
+      </w:pPr>
+      <w:rPr>
+        <w:rFonts w:ascii="Wingdings" w:hAnsi="Wingdings" w:hint="default"/>
+        <w:sz w:val="20"/>
+      </w:rPr>
+    </w:lvl>
+    <w:lvl w:ilvl="6" w:tentative="1">
+      <w:start w:val="1"/>
+      <w:numFmt w:val="bullet"/>
+      <w:lvlText w:val=""/>
+      <w:lvlJc w:val="left"/>
+      <w:pPr>
+        <w:tabs>
+          <w:tab w:val="num" w:pos="5040"/>
+        </w:tabs>
+        <w:ind w:left="5040" w:hanging="360"/>
+      </w:pPr>
+      <w:rPr>
+        <w:rFonts w:ascii="Wingdings" w:hAnsi="Wingdings" w:hint="default"/>
+        <w:sz w:val="20"/>
+      </w:rPr>
+    </w:lvl>
+    <w:lvl w:ilvl="7" w:tentative="1">
+      <w:start w:val="1"/>
+      <w:numFmt w:val="bullet"/>
+      <w:lvlText w:val=""/>
+      <w:lvlJc w:val="left"/>
+      <w:pPr>
+        <w:tabs>
+          <w:tab w:val="num" w:pos="5760"/>
+        </w:tabs>
+        <w:ind w:left="5760" w:hanging="360"/>
+      </w:pPr>
+      <w:rPr>
+        <w:rFonts w:ascii="Wingdings" w:hAnsi="Wingdings" w:hint="default"/>
+        <w:sz w:val="20"/>
+      </w:rPr>
+    </w:lvl>
+    <w:lvl w:ilvl="8" w:tentative="1">
+      <w:start w:val="1"/>
+      <w:numFmt w:val="bullet"/>
+      <w:lvlText w:val=""/>
+      <w:lvlJc w:val="left"/>
+      <w:pPr>
+        <w:tabs>
+          <w:tab w:val="num" w:pos="6480"/>
+        </w:tabs>
+        <w:ind w:left="6480" w:hanging="360"/>
+      </w:pPr>
+      <w:rPr>
+        <w:rFonts w:ascii="Wingdings" w:hAnsi="Wingdings" w:hint="default"/>
+        <w:sz w:val="20"/>
+      </w:rPr>
+    </w:lvl>
+  </w:abstractNum>
+  <w:abstractNum w:abstractNumId="15" w15:restartNumberingAfterBreak="0">
     <w:nsid w:val="74F53D88"/>
     <w:multiLevelType w:val="multilevel"/>
     <w:tmpl w:val="BB2E5C4E"/>
@@ -9024,7 +9846,124 @@
       </w:rPr>
     </w:lvl>
   </w:abstractNum>
-  <w:abstractNum w:abstractNumId="15" w15:restartNumberingAfterBreak="0">
+  <w:abstractNum w:abstractNumId="16" w15:restartNumberingAfterBreak="0">
+    <w:nsid w:val="75E47DAA"/>
+    <w:multiLevelType w:val="multilevel"/>
+    <w:tmpl w:val="55A89AB6"/>
+    <w:lvl w:ilvl="0">
+      <w:start w:val="1"/>
+      <w:numFmt w:val="decimal"/>
+      <w:lvlText w:val="%1."/>
+      <w:lvlJc w:val="left"/>
+      <w:pPr>
+        <w:tabs>
+          <w:tab w:val="num" w:pos="720"/>
+        </w:tabs>
+        <w:ind w:left="720" w:hanging="360"/>
+      </w:pPr>
+    </w:lvl>
+    <w:lvl w:ilvl="1">
+      <w:start w:val="1"/>
+      <w:numFmt w:val="bullet"/>
+      <w:lvlText w:val="o"/>
+      <w:lvlJc w:val="left"/>
+      <w:pPr>
+        <w:tabs>
+          <w:tab w:val="num" w:pos="1440"/>
+        </w:tabs>
+        <w:ind w:left="1440" w:hanging="360"/>
+      </w:pPr>
+      <w:rPr>
+        <w:rFonts w:ascii="Courier New" w:hAnsi="Courier New" w:hint="default"/>
+        <w:sz w:val="20"/>
+      </w:rPr>
+    </w:lvl>
+    <w:lvl w:ilvl="2" w:tentative="1">
+      <w:start w:val="1"/>
+      <w:numFmt w:val="decimal"/>
+      <w:lvlText w:val="%3."/>
+      <w:lvlJc w:val="left"/>
+      <w:pPr>
+        <w:tabs>
+          <w:tab w:val="num" w:pos="2160"/>
+        </w:tabs>
+        <w:ind w:left="2160" w:hanging="360"/>
+      </w:pPr>
+    </w:lvl>
+    <w:lvl w:ilvl="3" w:tentative="1">
+      <w:start w:val="1"/>
+      <w:numFmt w:val="decimal"/>
+      <w:lvlText w:val="%4."/>
+      <w:lvlJc w:val="left"/>
+      <w:pPr>
+        <w:tabs>
+          <w:tab w:val="num" w:pos="2880"/>
+        </w:tabs>
+        <w:ind w:left="2880" w:hanging="360"/>
+      </w:pPr>
+    </w:lvl>
+    <w:lvl w:ilvl="4" w:tentative="1">
+      <w:start w:val="1"/>
+      <w:numFmt w:val="decimal"/>
+      <w:lvlText w:val="%5."/>
+      <w:lvlJc w:val="left"/>
+      <w:pPr>
+        <w:tabs>
+          <w:tab w:val="num" w:pos="3600"/>
+        </w:tabs>
+        <w:ind w:left="3600" w:hanging="360"/>
+      </w:pPr>
+    </w:lvl>
+    <w:lvl w:ilvl="5" w:tentative="1">
+      <w:start w:val="1"/>
+      <w:numFmt w:val="decimal"/>
+      <w:lvlText w:val="%6."/>
+      <w:lvlJc w:val="left"/>
+      <w:pPr>
+        <w:tabs>
+          <w:tab w:val="num" w:pos="4320"/>
+        </w:tabs>
+        <w:ind w:left="4320" w:hanging="360"/>
+      </w:pPr>
+    </w:lvl>
+    <w:lvl w:ilvl="6" w:tentative="1">
+      <w:start w:val="1"/>
+      <w:numFmt w:val="decimal"/>
+      <w:lvlText w:val="%7."/>
+      <w:lvlJc w:val="left"/>
+      <w:pPr>
+        <w:tabs>
+          <w:tab w:val="num" w:pos="5040"/>
+        </w:tabs>
+        <w:ind w:left="5040" w:hanging="360"/>
+      </w:pPr>
+    </w:lvl>
+    <w:lvl w:ilvl="7" w:tentative="1">
+      <w:start w:val="1"/>
+      <w:numFmt w:val="decimal"/>
+      <w:lvlText w:val="%8."/>
+      <w:lvlJc w:val="left"/>
+      <w:pPr>
+        <w:tabs>
+          <w:tab w:val="num" w:pos="5760"/>
+        </w:tabs>
+        <w:ind w:left="5760" w:hanging="360"/>
+      </w:pPr>
+    </w:lvl>
+    <w:lvl w:ilvl="8" w:tentative="1">
+      <w:start w:val="1"/>
+      <w:numFmt w:val="decimal"/>
+      <w:lvlText w:val="%9."/>
+      <w:lvlJc w:val="left"/>
+      <w:pPr>
+        <w:tabs>
+          <w:tab w:val="num" w:pos="6480"/>
+        </w:tabs>
+        <w:ind w:left="6480" w:hanging="360"/>
+      </w:pPr>
+    </w:lvl>
+  </w:abstractNum>
+  <w:abstractNum w:abstractNumId="17" w15:restartNumberingAfterBreak="0">
     <w:nsid w:val="7B1E12D3"/>
     <w:multiLevelType w:val="multilevel"/>
     <w:tmpl w:val="CEC4AD36"/>
@@ -9186,7 +10125,7 @@
     <w:abstractNumId w:val="7"/>
   </w:num>
   <w:num w:numId="5" w16cid:durableId="896864988">
-    <w:abstractNumId w:val="15"/>
+    <w:abstractNumId w:val="17"/>
   </w:num>
   <w:num w:numId="6" w16cid:durableId="1412656734">
     <w:abstractNumId w:val="4"/>
@@ -9198,7 +10137,7 @@
     <w:abstractNumId w:val="9"/>
   </w:num>
   <w:num w:numId="9" w16cid:durableId="1305701990">
-    <w:abstractNumId w:val="14"/>
+    <w:abstractNumId w:val="15"/>
   </w:num>
   <w:num w:numId="10" w16cid:durableId="1540358999">
     <w:abstractNumId w:val="0"/>
@@ -9220,6 +10159,12 @@
   </w:num>
   <w:num w:numId="16" w16cid:durableId="136260686">
     <w:abstractNumId w:val="2"/>
+  </w:num>
+  <w:num w:numId="17" w16cid:durableId="1612783210">
+    <w:abstractNumId w:val="16"/>
+  </w:num>
+  <w:num w:numId="18" w16cid:durableId="171143095">
+    <w:abstractNumId w:val="14"/>
   </w:num>
 </w:numbering>
 </file>

</xml_diff>